<commit_message>
feat: Add new thesis chapters (3, 4, conclusions, model evaluation), full outline, and test case discussions, including a script to integrate discussions, and minor documentation updates.
</commit_message>
<xml_diff>
--- a/Implementation Chapter.docx
+++ b/Implementation Chapter.docx
@@ -7,187 +7,248 @@
         <w:pStyle w:val="Heading1"/>
         <w:jc w:val="center"/>
         <w:rPr>
-          <w:rFonts w:ascii="Times New Roman" w:hAnsi="Times New Roman" w:cs="Times New Roman"/>
+          <w:rFonts w:cs="Times New Roman"/>
+          <w:szCs w:val="24"/>
+          <w:lang w:val="en-US"/>
+        </w:rPr>
+      </w:pPr>
+      <w:r>
+        <w:rPr>
+          <w:rFonts w:cs="Times New Roman"/>
+          <w:szCs w:val="24"/>
+          <w:lang w:val="en-US"/>
+        </w:rPr>
+        <w:t>Implementation Chapter</w:t>
+      </w:r>
+    </w:p>
+    <w:p>
+      <w:pPr>
+        <w:rPr>
+          <w:lang w:val="en-US"/>
+        </w:rPr>
+      </w:pPr>
+    </w:p>
+    <w:p>
+      <w:pPr>
+        <w:pStyle w:val="Heading2"/>
+      </w:pPr>
+      <w:r>
+        <w:t>Introduction</w:t>
+      </w:r>
+    </w:p>
+    <w:p>
+      <w:pPr>
+        <w:tabs>
+          <w:tab w:val="num" w:pos="720"/>
+        </w:tabs>
+      </w:pPr>
+      <w:r>
+        <w:t>This chapter presents the detailed implementation of a Zero Trust testbed designed to support empirical evaluation of identity-centric, policy-driven access control in software-defined environments.</w:t>
+      </w:r>
+      <w:r>
+        <w:t xml:space="preserve"> The work builds a baseline testbed focusing on</w:t>
+      </w:r>
+      <w:r>
+        <w:t xml:space="preserve"> criter</w:t>
+      </w:r>
+      <w:r>
+        <w:t>i</w:t>
+      </w:r>
+      <w:r>
+        <w:t xml:space="preserve">a based access control </w:t>
+      </w:r>
+      <w:r>
+        <w:t xml:space="preserve">decisions </w:t>
+      </w:r>
+      <w:r>
+        <w:t>and score based trust evaluation testbed that build up on the former</w:t>
+      </w:r>
+      <w:r>
+        <w:t xml:space="preserve"> </w:t>
+      </w:r>
+      <w:r>
+        <w:t xml:space="preserve"> The primary objective of the testbed</w:t>
+      </w:r>
+      <w:r>
+        <w:t>s</w:t>
+      </w:r>
+      <w:r>
+        <w:t xml:space="preserve"> is to demonstrate the transition from implicit network trust to explicit, continuously evaluated trust enforced across network and application layers.</w:t>
+      </w:r>
+      <w:r>
+        <w:t xml:space="preserve"> </w:t>
+      </w:r>
+      <w:r>
+        <w:t>The design follows the NIST SP 800-207 Zero Trust Architecture (ZTA) reference model, explicitly separating</w:t>
+      </w:r>
+      <w:r>
+        <w:t xml:space="preserve"> </w:t>
+      </w:r>
+      <w:r>
+        <w:t>Policy Decision Points (PDPs)</w:t>
+      </w:r>
+      <w:r>
+        <w:t>,</w:t>
+      </w:r>
+      <w:r>
+        <w:t xml:space="preserve"> and </w:t>
+      </w:r>
+      <w:r>
+        <w:t xml:space="preserve"> </w:t>
+      </w:r>
+      <w:r>
+        <w:t>Policy Enforcement Points (PEPs)</w:t>
+      </w:r>
+      <w:r>
+        <w:t>. Further, the testbed clearly demarcates</w:t>
+      </w:r>
+      <w:r>
+        <w:t xml:space="preserve"> </w:t>
+      </w:r>
+      <w:r>
+        <w:t>Policy Administration Points (PAPs)</w:t>
+      </w:r>
+      <w:r>
+        <w:t xml:space="preserve"> and the policy engine’s trust algorithm</w:t>
+      </w:r>
+      <w:r>
+        <w:t xml:space="preserve"> based on a</w:t>
+      </w:r>
+      <w:r>
+        <w:t xml:space="preserve"> multidomain and </w:t>
+      </w:r>
+      <w:r>
+        <w:t xml:space="preserve">score based </w:t>
+      </w:r>
+      <w:r>
+        <w:t>multi-criteria (score)</w:t>
+      </w:r>
+      <w:r>
+        <w:t xml:space="preserve"> trust</w:t>
+      </w:r>
+      <w:r>
+        <w:t xml:space="preserve"> estimati</w:t>
+      </w:r>
+      <w:r>
+        <w:t>on and calculation</w:t>
+      </w:r>
+      <w:r>
+        <w:t xml:space="preserve">. </w:t>
+      </w:r>
+      <w:r>
+        <w:t>The design</w:t>
+      </w:r>
+      <w:r>
+        <w:t xml:space="preserve"> </w:t>
+      </w:r>
+      <w:r>
+        <w:t>prioritize</w:t>
+      </w:r>
+      <w:r>
+        <w:t>s</w:t>
+      </w:r>
+      <w:r>
+        <w:t xml:space="preserve"> reproducibility, modularity, and extensibility to support multi-domain trust experiments.</w:t>
+      </w:r>
+    </w:p>
+    <w:p>
+      <w:pPr>
+        <w:tabs>
+          <w:tab w:val="num" w:pos="720"/>
+        </w:tabs>
+        <w:rPr>
           <w:b/>
           <w:bCs/>
-          <w:color w:val="auto"/>
-          <w:sz w:val="24"/>
-          <w:szCs w:val="24"/>
-          <w:lang w:val="en-US"/>
-        </w:rPr>
-      </w:pPr>
-      <w:r>
-        <w:rPr>
-          <w:rFonts w:ascii="Times New Roman" w:hAnsi="Times New Roman" w:cs="Times New Roman"/>
+        </w:rPr>
+      </w:pPr>
+      <w:r>
+        <w:rPr>
           <w:b/>
           <w:bCs/>
-          <w:color w:val="auto"/>
-          <w:sz w:val="24"/>
-          <w:szCs w:val="24"/>
-          <w:lang w:val="en-US"/>
-        </w:rPr>
-        <w:t>Implementation Chapter</w:t>
+          <w:lang w:val="en-GB"/>
+        </w:rPr>
+        <w:t>concept → setup → deployment → logic → validation → evaluation.</w:t>
       </w:r>
     </w:p>
     <w:p>
       <w:pPr>
-        <w:rPr>
-          <w:lang w:val="en-US"/>
-        </w:rPr>
-      </w:pPr>
+        <w:pStyle w:val="Heading2"/>
+      </w:pPr>
+      <w:r>
+        <w:t>TestBed Setup Procedure</w:t>
+      </w:r>
     </w:p>
     <w:p>
       <w:pPr>
-        <w:pStyle w:val="Heading2"/>
-      </w:pPr>
-      <w:r>
-        <w:t>Introduction</w:t>
-      </w:r>
-    </w:p>
-    <w:p>
-      <w:pPr>
         <w:tabs>
           <w:tab w:val="num" w:pos="720"/>
         </w:tabs>
       </w:pPr>
       <w:r>
-        <w:t>This chapter presents the detailed implementation of a Zero Trust testbed designed to support empirical evaluation of identity-centric, policy-driven access control in software-defined environments.</w:t>
-      </w:r>
-      <w:r>
-        <w:t xml:space="preserve"> The work builds a baseline testbed focusing on</w:t>
-      </w:r>
-      <w:r>
-        <w:t xml:space="preserve"> criter</w:t>
-      </w:r>
-      <w:r>
-        <w:t>i</w:t>
-      </w:r>
-      <w:r>
-        <w:t xml:space="preserve">a based access control </w:t>
-      </w:r>
-      <w:r>
-        <w:t xml:space="preserve">decisions </w:t>
-      </w:r>
-      <w:r>
-        <w:t>and score based trust evaluation testbed that build up on the former</w:t>
+        <w:t xml:space="preserve">The testbed design and setup  was done </w:t>
+      </w:r>
+      <w:r>
+        <w:t>incrementally</w:t>
+      </w:r>
+      <w:r>
+        <w:t xml:space="preserve"> to clearly demarcate controller and gateway fun</w:t>
+      </w:r>
+      <w:r>
+        <w:t>c</w:t>
+      </w:r>
+      <w:r>
+        <w:t xml:space="preserve">tions as defined by NIST SP 800-207 and CSA SDP </w:t>
+      </w:r>
+      <w:r>
+        <w:t xml:space="preserve">in </w:t>
+      </w:r>
+      <w:r>
+        <w:rPr>
+          <w:color w:val="C00000"/>
+        </w:rPr>
+        <w:t>section X</w:t>
+      </w:r>
+      <w:r>
+        <w:t xml:space="preserve">.  The </w:t>
+      </w:r>
+      <w:r>
+        <w:t>testbed setup procedure</w:t>
+      </w:r>
+      <w:r>
+        <w:t xml:space="preserve"> was  split into 6 steps that sequentily built on each</w:t>
+      </w:r>
+      <w:r>
+        <w:t xml:space="preserve"> other</w:t>
+      </w:r>
+      <w:r>
+        <w:t xml:space="preserve"> to de</w:t>
+      </w:r>
+      <w:r>
+        <w:t>v</w:t>
+      </w:r>
+      <w:r>
+        <w:t>elop an incremental prototype to test the trust algorithm</w:t>
+      </w:r>
+      <w:r>
+        <w:t xml:space="preserve"> as </w:t>
+      </w:r>
+      <w:r>
+        <w:t xml:space="preserve">illustrated in </w:t>
+      </w:r>
+      <w:r>
+        <w:rPr>
+          <w:color w:val="C00000"/>
+        </w:rPr>
+        <w:t>figures 8.1 through to 8.4</w:t>
+      </w:r>
+      <w:r>
+        <w:t xml:space="preserve">. The steps </w:t>
+      </w:r>
+      <w:r>
+        <w:t>are:</w:t>
       </w:r>
       <w:r>
         <w:t xml:space="preserve"> </w:t>
-      </w:r>
-      <w:r>
-        <w:t xml:space="preserve"> The primary objective of the testbed</w:t>
-      </w:r>
-      <w:r>
-        <w:t>s</w:t>
-      </w:r>
-      <w:r>
-        <w:t xml:space="preserve"> is to demonstrate the transition from implicit network trust to explicit, continuously evaluated trust enforced across network and application layers.</w:t>
-      </w:r>
-      <w:r>
-        <w:t xml:space="preserve"> </w:t>
-      </w:r>
-      <w:r>
-        <w:t>The design follows the NIST SP 800-207 Zero Trust Architecture (ZTA) reference model, explicitly separating</w:t>
-      </w:r>
-      <w:r>
-        <w:t xml:space="preserve"> </w:t>
-      </w:r>
-      <w:r>
-        <w:t>Policy Decision Points (PDPs)</w:t>
-      </w:r>
-      <w:r>
-        <w:t>,</w:t>
-      </w:r>
-      <w:r>
-        <w:t xml:space="preserve"> and </w:t>
-      </w:r>
-      <w:r>
-        <w:t xml:space="preserve"> </w:t>
-      </w:r>
-      <w:r>
-        <w:t>Policy Enforcement Points (PEPs)</w:t>
-      </w:r>
-      <w:r>
-        <w:t>. Further, the testbed clearly demarcates</w:t>
-      </w:r>
-      <w:r>
-        <w:t xml:space="preserve"> </w:t>
-      </w:r>
-      <w:r>
-        <w:t>Policy Administration Points (PAPs)</w:t>
-      </w:r>
-      <w:r>
-        <w:t xml:space="preserve"> and the policy engine’s trust algorithm</w:t>
-      </w:r>
-      <w:r>
-        <w:t xml:space="preserve"> based on a</w:t>
-      </w:r>
-      <w:r>
-        <w:t xml:space="preserve"> multidomain and </w:t>
-      </w:r>
-      <w:r>
-        <w:t xml:space="preserve">score based </w:t>
-      </w:r>
-      <w:r>
-        <w:t>multi-criteria (score)</w:t>
-      </w:r>
-      <w:r>
-        <w:t xml:space="preserve"> trust</w:t>
-      </w:r>
-      <w:r>
-        <w:t xml:space="preserve"> estimati</w:t>
-      </w:r>
-      <w:r>
-        <w:t>on and calculation</w:t>
-      </w:r>
-      <w:r>
-        <w:t xml:space="preserve">. </w:t>
-      </w:r>
-      <w:r>
-        <w:t>The design</w:t>
-      </w:r>
-      <w:r>
-        <w:t xml:space="preserve"> </w:t>
-      </w:r>
-      <w:r>
-        <w:t>prioritize</w:t>
-      </w:r>
-      <w:r>
-        <w:t>s</w:t>
-      </w:r>
-      <w:r>
-        <w:t xml:space="preserve"> reproducibility, modularity, and extensibility to support multi-domain trust experiments.</w:t>
-      </w:r>
-    </w:p>
-    <w:p>
-      <w:pPr>
-        <w:tabs>
-          <w:tab w:val="num" w:pos="720"/>
-        </w:tabs>
-      </w:pPr>
-    </w:p>
-    <w:p>
-      <w:pPr>
-        <w:pStyle w:val="Heading2"/>
-      </w:pPr>
-      <w:r>
-        <w:t>TestBed Setup Procedure</w:t>
-      </w:r>
-    </w:p>
-    <w:p>
-      <w:pPr>
-        <w:tabs>
-          <w:tab w:val="num" w:pos="720"/>
-        </w:tabs>
-      </w:pPr>
-      <w:r>
-        <w:t xml:space="preserve">The testbed design and setup  was done systematically to clearly demarcate controller and gateway fucntions as defined by NIST SP 800-207 and CSA SDP dfintion.  The process was  split into 6 steps that sequentily built on each to deelop an incremental prototype to test the trust algorithm. The steps have been discussed and illustrated in </w:t>
-      </w:r>
-      <w:r>
-        <w:rPr>
-          <w:color w:val="C00000"/>
-        </w:rPr>
-        <w:t>figures 8.1 through to 8.4</w:t>
       </w:r>
     </w:p>
     <w:p>
@@ -202,13 +263,24 @@
         </w:tabs>
       </w:pPr>
       <w:r>
-        <w:t>Host preparation: The  goal of this step was selection and preparation of tehe host environment on which tesbed was setup.  This was based on. Stable release of linux with  support for sofare defined networks and sofatware defined perimeters implemntation. The virtualization capabilities were lso rviewed  from the firmware to support near-native virtualization for modern Virtu</w:t>
+        <w:rPr>
+          <w:b/>
+          <w:bCs/>
+        </w:rPr>
+        <w:t>Host preparation:</w:t>
+      </w:r>
+      <w:r>
+        <w:t xml:space="preserve"> The  goal of this step was selection and preparation of tehe host environment on which tesbed was setup.  This was based on. Stable release of linux with  support for sofare defined networks and sofatware defined perimeters implemntation. The virtualization capabilities were lso rviewed  from the firmware to support near-native virtualization for modern Virtu</w:t>
       </w:r>
       <w:r>
         <w:t>a</w:t>
       </w:r>
       <w:r>
-        <w:t>l appliances such as GNS3 and Mininet VM appliances. The support for containerization and docker setup, running, deployment and networking were also consoderd. The choice of Ubuntu 24.04 LTS guarantees longterm support for security and functionality patches while secure firmware settings gurantee reduced surface of attacks especially from lateral escalation and side channels attacks</w:t>
+        <w:t xml:space="preserve">l appliances such as GNS3 and Mininet VM appliances. The support for containerization and docker setup, running, deployment and networking were also consoderd. The choice of Ubuntu 24.04 LTS guarantees longterm support for security and functionality patches while secure </w:t>
+      </w:r>
+      <w:r>
+        <w:lastRenderedPageBreak/>
+        <w:t>firmware settings gurantee reduced surface of attacks especially from lateral escalation and side channels attacks</w:t>
       </w:r>
     </w:p>
     <w:p>
@@ -223,8 +295,14 @@
         </w:tabs>
       </w:pPr>
       <w:r>
-        <w:lastRenderedPageBreak/>
-        <w:t>Installation: This focused on the installation of the relevant packages and utiliies required for request-response cycles of communication, administration and deployment of containers, and resurvce utiliation monitoring tools. Services and utilities such as curl, network and briding utilities were installed to support host-VM-conteiner interaction. Other tools such as spectacle and Vmstat were used to collect screenshot ansd show resource utilization bnchamarks.</w:t>
+        <w:rPr>
+          <w:b/>
+          <w:bCs/>
+        </w:rPr>
+        <w:t>Installation:</w:t>
+      </w:r>
+      <w:r>
+        <w:t xml:space="preserve"> This focused on the installation of the relevant packages and utiliies required for request-response cycles of communication, administration and deployment of containers, and resurvce utiliation monitoring tools. Services and utilities such as curl, network and briding utilities were installed to support host-VM-conteiner interaction. Other tools such as spectacle and Vmstat were used to collect screenshot ansd show resource utilization bnchamarks.</w:t>
       </w:r>
     </w:p>
     <w:p>
@@ -239,7 +317,14 @@
         </w:tabs>
       </w:pPr>
       <w:r>
-        <w:t>Virtualization and Container setup: This looks at the container setup for the Ubuntu distribution. The Mininet and GNS installations were natively built on the ubuntu and complemented by a GNS VM virtualized on Vmware Workstation on the local device and Vmware Fusion on a remote host</w:t>
+        <w:rPr>
+          <w:b/>
+          <w:bCs/>
+        </w:rPr>
+        <w:t>Virtualization and Container setup:</w:t>
+      </w:r>
+      <w:r>
+        <w:t xml:space="preserve"> This looks at the container setup for the Ubuntu distribution. The Mininet and GNS installations were natively built on the ubuntu and complemented by a GNS VM virtualized on Vmware Workstation on the local device and Vmware Fusion on a remote host</w:t>
       </w:r>
     </w:p>
     <w:p>
@@ -254,7 +339,14 @@
         </w:tabs>
       </w:pPr>
       <w:r>
-        <w:t>Component deployment: the PEP, PDP, PAP were deployed as docker containers as OpenVswitch, Open Policy Agent(OPA), Envoy, and Opendaylight respeevtivey.  These help conserve resources while supporting inetractivity between the hosts within the host environemnt.</w:t>
+        <w:rPr>
+          <w:b/>
+          <w:bCs/>
+        </w:rPr>
+        <w:t>Component deployment:</w:t>
+      </w:r>
+      <w:r>
+        <w:t xml:space="preserve"> the PEP, PDP, PAP were deployed as docker containers as OpenVswitch, Open Policy Agent(OPA), Envoy, and Opendaylight respeevtivey.  These help conserve resources while supporting inetractivity between the hosts within the host environemnt.</w:t>
       </w:r>
     </w:p>
     <w:p>
@@ -269,7 +361,14 @@
         </w:tabs>
       </w:pPr>
       <w:r>
-        <w:t>Policy Configuration: This reviews the input, logic and outputs for the PDP and PEP. Rego files were generated for OPA decisions based on simulated data and identity information from keycloak and enforced based on openVswitch flows. Postman was used to buid and originate queries  based on json inputs to derive output based on the logic defined by the rego scripts</w:t>
+        <w:rPr>
+          <w:b/>
+          <w:bCs/>
+        </w:rPr>
+        <w:t>Policy Configuration:</w:t>
+      </w:r>
+      <w:r>
+        <w:t xml:space="preserve"> This reviews the input, logic and outputs for the PDP and PEP. Rego files were generated for OPA decisions based on simulated data and identity information from keycloak and enforced based on openVswitch flows. Postman was used to buid and originate queries  based on json inputs to derive output based on the logic defined by the rego scripts</w:t>
       </w:r>
     </w:p>
     <w:p>
@@ -284,7 +383,14 @@
         </w:tabs>
       </w:pPr>
       <w:r>
-        <w:t>Testcases Description: Due to the infinite variations of number of scenarios that could be tested, test cased were described as an evaluation framework to guide assessment of different contexts. Case variations per testcase were also considered to show changing context and dynamicity of trust evalaution</w:t>
+        <w:rPr>
+          <w:b/>
+          <w:bCs/>
+        </w:rPr>
+        <w:t>Testcases Description:</w:t>
+      </w:r>
+      <w:r>
+        <w:t xml:space="preserve"> Due to the infinite variations of number of scenarios that could be tested, test cased were described as an evaluation framework to guide assessment of different contexts. Case variations per testcase were also considered to show changing context and dynamicity of trust evalaution</w:t>
       </w:r>
     </w:p>
     <w:p>
@@ -299,7 +405,17 @@
         </w:tabs>
       </w:pPr>
       <w:r>
-        <w:t>Topology and Validation:This stage operates in unison with the previous step because  each test case needed evalaution. Variations of testvases were emulated and estimated based on simulated data for varying cases withineach testcase  for dynamicity of contexts</w:t>
+        <w:rPr>
+          <w:b/>
+          <w:bCs/>
+        </w:rPr>
+        <w:t>Topology and Validation:</w:t>
+      </w:r>
+      <w:r>
+        <w:t xml:space="preserve"> </w:t>
+      </w:r>
+      <w:r>
+        <w:t>This stage operates in unison with the previous step because  each test case needed evalaution. Variations of testvases were emulated and estimated based on simulated data for varying cases withineach testcase  for dynamicity of contexts</w:t>
       </w:r>
       <w:r>
         <w:t xml:space="preserve">. These have further been covered based on the markdown file defined on the git repository as shown in </w:t>
@@ -473,6 +589,9 @@
         <w:pStyle w:val="Heading2"/>
       </w:pPr>
       <w:r>
+        <w:t xml:space="preserve">Topology and Validation </w:t>
+      </w:r>
+      <w:r>
         <w:t>Logic Flow</w:t>
       </w:r>
       <w:r>
@@ -481,7 +600,19 @@
     </w:p>
     <w:p>
       <w:r>
-        <w:t xml:space="preserve">The logic flows were based on basic principles of zero trusts such as least privilege, continuos authentication and authorization as separate processes and assessment of all communciations and resources within heterogenous networks. </w:t>
+        <w:t xml:space="preserve">The logic flows </w:t>
+      </w:r>
+      <w:r>
+        <w:t>for the topologies are</w:t>
+      </w:r>
+      <w:r>
+        <w:t xml:space="preserve"> based on basic principles of zero trusts such as least privilege, continuo</w:t>
+      </w:r>
+      <w:r>
+        <w:t>u</w:t>
+      </w:r>
+      <w:r>
+        <w:t xml:space="preserve">s authentication and authorization as separate processes and assessment of all communciations and resources within heterogenous networks. </w:t>
       </w:r>
       <w:r>
         <w:t>The</w:t>
@@ -490,7 +621,34 @@
         <w:t xml:space="preserve"> logical flows </w:t>
       </w:r>
       <w:r>
-        <w:t xml:space="preserve"> have been mapped to funadamental principles of zero trust architecture. They </w:t>
+        <w:t xml:space="preserve"> have been mapped to fundamental principles of zero trust architecture</w:t>
+      </w:r>
+      <w:r>
+        <w:t xml:space="preserve"> as discussed in </w:t>
+      </w:r>
+      <w:r>
+        <w:rPr>
+          <w:color w:val="C00000"/>
+        </w:rPr>
+        <w:t>section</w:t>
+      </w:r>
+      <w:r>
+        <w:rPr>
+          <w:color w:val="C00000"/>
+        </w:rPr>
+        <w:t xml:space="preserve"> 3.4</w:t>
+      </w:r>
+      <w:r>
+        <w:t xml:space="preserve">. </w:t>
+      </w:r>
+      <w:r>
+        <w:t>Additionally, NIST</w:t>
+      </w:r>
+      <w:r>
+        <w:t xml:space="preserve"> priciples for zero trust enforcement have been revewed and considered for the validation topologies. </w:t>
+      </w:r>
+      <w:r>
+        <w:t xml:space="preserve">They </w:t>
       </w:r>
       <w:r>
         <w:t>include</w:t>
@@ -606,6 +764,7 @@
     </w:tbl>
     <w:p/>
     <w:p/>
+    <w:p/>
     <w:tbl>
       <w:tblPr>
         <w:tblStyle w:val="GridTable3"/>
@@ -629,6 +788,7 @@
           </w:tcPr>
           <w:p>
             <w:r>
+              <w:lastRenderedPageBreak/>
               <w:t>NIST Core Zero trust Principles</w:t>
             </w:r>
           </w:p>
@@ -680,7 +840,6 @@
               </w:numPr>
             </w:pPr>
             <w:r>
-              <w:lastRenderedPageBreak/>
               <w:t>Dynamic Access policy</w:t>
             </w:r>
           </w:p>
@@ -920,7 +1079,11 @@
         <w:t>d</w:t>
       </w:r>
       <w:r>
-        <w:t>ynamic trust calculations. It can also be tested and measured against frameworks such as MITRE ATT&amp;CK conditions for enetrrprise envriroments. Access decisions include clear grant/reject status with detailed reasons for decisions, especially the decision calculation. The flexibilty of policies is also considered as trusted devices can connect from anywhere; Untrusted devices restricted to local network; Admins can access blocked applications. The tescase policy therefore follows the principle of least privilege and provides clear audit trails for access decisions making the deterministic and auditable.</w:t>
+        <w:t xml:space="preserve">ynamic trust calculations. It can also be tested and measured against frameworks such as MITRE ATT&amp;CK conditions for enetrrprise envriroments. Access decisions include clear grant/reject status with detailed reasons for decisions, especially the decision calculation. The flexibilty of policies is also considered as trusted devices can connect from anywhere; Untrusted devices restricted to local network; Admins can access blocked applications. The </w:t>
+      </w:r>
+      <w:r>
+        <w:lastRenderedPageBreak/>
+        <w:t>tescase policy therefore follows the principle of least privilege and provides clear audit trails for access decisions making the deterministic and auditable.</w:t>
       </w:r>
     </w:p>
     <w:p>
@@ -935,7 +1098,6 @@
         <w:pStyle w:val="Heading3"/>
       </w:pPr>
       <w:r>
-        <w:lastRenderedPageBreak/>
         <w:t>Testcase 3: Multi-domain with Static trust scores and contextual weights for domains</w:t>
       </w:r>
     </w:p>
@@ -1054,7 +1216,11 @@
         <w:t xml:space="preserve">with </w:t>
       </w:r>
       <w:r>
-        <w:t xml:space="preserve">some level of access are evaluated based on the originating network, the device posture, the application requesting access. Multidomain-Domain Integration permutations include: </w:t>
+        <w:t xml:space="preserve">some level of access are evaluated based on the originating network, the </w:t>
+      </w:r>
+      <w:r>
+        <w:lastRenderedPageBreak/>
+        <w:t xml:space="preserve">device posture, the application requesting access. Multidomain-Domain Integration permutations include: </w:t>
       </w:r>
       <w:r>
         <w:t>data</w:t>
@@ -1069,11 +1235,7 @@
         <w:t xml:space="preserve">); Application domain (Allowed/Blocked); Network domain (Remote/Local) ; Device domain (Trusted/Untrusted). </w:t>
       </w:r>
       <w:r>
-        <w:t xml:space="preserve">The trust score is based in dynamic weighting of the four facets  and the score is further fuswd based on weighted belief </w:t>
-      </w:r>
-      <w:r>
-        <w:lastRenderedPageBreak/>
-        <w:t xml:space="preserve">fusion. Metadata availability is used to determine belief and disbelief as probabilistic values while uncertaity is modeled based on absence of metadata. The base value is set at 0.4 to esnure that the default decision in the absence of metadata defaults to denial of access based on the threhold matrix </w:t>
+        <w:t xml:space="preserve">The trust score is based in dynamic weighting of the four facets  and the score is further fuswd based on weighted belief fusion. Metadata availability is used to determine belief and disbelief as probabilistic values while uncertaity is modeled based on absence of metadata. The base value is set at 0.4 to esnure that the default decision in the absence of metadata defaults to denial of access based on the threhold matrix </w:t>
       </w:r>
       <w:r>
         <w:rPr>
@@ -1345,6 +1507,7 @@
               </w:tabs>
             </w:pPr>
             <w:r>
+              <w:lastRenderedPageBreak/>
               <w:t>Testcase 3</w:t>
             </w:r>
           </w:p>
@@ -1407,11 +1570,7 @@
               </w:tabs>
             </w:pPr>
             <w:r>
-              <w:t xml:space="preserve">Multidomain Contextually weighted  trust </w:t>
-            </w:r>
-            <w:r>
-              <w:lastRenderedPageBreak/>
-              <w:t>determination(dynamic weighting and weighted belief fusion)</w:t>
+              <w:t>Multidomain Contextually weighted  trust determination</w:t>
             </w:r>
           </w:p>
         </w:tc>
@@ -1426,8 +1585,16 @@
               </w:tabs>
             </w:pPr>
             <w:r>
-              <w:lastRenderedPageBreak/>
               <w:t>Multidomain Contextually weighted  trust determination</w:t>
+            </w:r>
+            <w:r>
+              <w:t xml:space="preserve"> based on a weig</w:t>
+            </w:r>
+            <w:r>
+              <w:t xml:space="preserve">hted sum and subjective logic </w:t>
+            </w:r>
+            <w:r>
+              <w:t>(dynamic weighting and weighted belief fusion)</w:t>
             </w:r>
           </w:p>
         </w:tc>
@@ -1485,6 +1652,15 @@
             <w:r>
               <w:t>cies with temporal decay in trust</w:t>
             </w:r>
+            <w:r>
+              <w:t>. The decay considers short term memory</w:t>
+            </w:r>
+            <w:r>
+              <w:t xml:space="preserve"> on signal telemetry data freshness and long term mmory for inertia trust</w:t>
+            </w:r>
+            <w:r>
+              <w:t xml:space="preserve"> based on previous transactions</w:t>
+            </w:r>
           </w:p>
         </w:tc>
       </w:tr>
@@ -1514,16 +1690,52 @@
         </w:tabs>
       </w:pPr>
       <w:r>
-        <w:t>Zero Trust research demands deterministic environments free from uncontrolled variables. Ubuntu 2</w:t>
+        <w:t xml:space="preserve">The testbed is meant to support </w:t>
+      </w:r>
+      <w:r>
+        <w:t>Zero Trust research</w:t>
+      </w:r>
+      <w:r>
+        <w:t xml:space="preserve"> and as such</w:t>
+      </w:r>
+      <w:r>
+        <w:t xml:space="preserve"> demands</w:t>
+      </w:r>
+      <w:r>
+        <w:t xml:space="preserve"> a</w:t>
+      </w:r>
+      <w:r>
+        <w:t xml:space="preserve"> deterministic environment free from uncontrolled variables. Ubuntu 2</w:t>
       </w:r>
       <w:r>
         <w:t>4</w:t>
       </w:r>
       <w:r>
-        <w:t xml:space="preserve">.04 LTS provides Long-Term Support (LTS) stability with a 10-year security maintenance commitment, essential for longitudinal studies. The </w:t>
-      </w:r>
-      <w:r>
-        <w:t>host systems was</w:t>
+        <w:t xml:space="preserve">.04 LTS </w:t>
+      </w:r>
+      <w:r>
+        <w:t xml:space="preserve"> thus provides </w:t>
+      </w:r>
+      <w:r>
+        <w:t xml:space="preserve">Long-Term Support (LTS) stability </w:t>
+      </w:r>
+      <w:r>
+        <w:t xml:space="preserve">for the testbed </w:t>
+      </w:r>
+      <w:r>
+        <w:t xml:space="preserve"> due to guaranteed</w:t>
+      </w:r>
+      <w:r>
+        <w:t xml:space="preserve"> security</w:t>
+      </w:r>
+      <w:r>
+        <w:t xml:space="preserve"> patches and</w:t>
+      </w:r>
+      <w:r>
+        <w:t xml:space="preserve"> maintenance. The </w:t>
+      </w:r>
+      <w:r>
+        <w:t>host system was</w:t>
       </w:r>
       <w:r>
         <w:t xml:space="preserve"> </w:t>
@@ -1539,6 +1751,73 @@
       </w:r>
       <w:r>
         <w:t xml:space="preserve"> unnecessary services that could introduce attack vectors or measurement noise.</w:t>
+      </w:r>
+      <w:r>
+        <w:t xml:space="preserve"> </w:t>
+      </w:r>
+      <w:r>
+        <w:t>The minimal installation</w:t>
+      </w:r>
+      <w:r>
+        <w:rPr>
+          <w:b/>
+          <w:bCs/>
+        </w:rPr>
+        <w:t xml:space="preserve"> also </w:t>
+      </w:r>
+      <w:r>
+        <w:t>reduces side-channel possibilities</w:t>
+      </w:r>
+      <w:r>
+        <w:t xml:space="preserve"> and ensures </w:t>
+      </w:r>
+      <w:r>
+        <w:rPr>
+          <w:b/>
+          <w:bCs/>
+        </w:rPr>
+        <w:t>Reproducibility</w:t>
+      </w:r>
+      <w:r>
+        <w:rPr>
+          <w:b/>
+          <w:bCs/>
+        </w:rPr>
+        <w:t xml:space="preserve"> </w:t>
+      </w:r>
+      <w:r>
+        <w:t>and</w:t>
+      </w:r>
+      <w:r>
+        <w:t xml:space="preserve"> peer validation of results</w:t>
+      </w:r>
+      <w:r>
+        <w:t xml:space="preserve">. </w:t>
+      </w:r>
+      <w:r>
+        <w:t xml:space="preserve">The host operating system constitutes the </w:t>
+      </w:r>
+      <w:r>
+        <w:rPr>
+          <w:b/>
+          <w:bCs/>
+        </w:rPr>
+        <w:t>trusted computing base (TCB)</w:t>
+      </w:r>
+      <w:r>
+        <w:t xml:space="preserve"> of the entire experimental platform. Any instability or misconfiguration at this layer undermines higher-level security guarantees. Ubuntu LTS minimizes kernel churn and driver regressions, ensuring consistent Open vSwitch and Docker behavior across experiments.</w:t>
+      </w:r>
+      <w:r>
+        <w:t xml:space="preserve">This </w:t>
+      </w:r>
+      <w:r>
+        <w:t xml:space="preserve">allows </w:t>
+      </w:r>
+      <w:r>
+        <w:t xml:space="preserve">for </w:t>
+      </w:r>
+      <w:r>
+        <w:t>meaningful comparison with related Zero Trust testbeds reported in the literature.</w:t>
       </w:r>
     </w:p>
     <w:p>
@@ -1607,83 +1886,65 @@
         <w:t xml:space="preserve"> kernel and library stability across multi-year research cycles</w:t>
       </w:r>
       <w:r>
-        <w:t>. The minimal installation</w:t>
-      </w:r>
-      <w:r>
-        <w:rPr>
-          <w:b/>
-          <w:bCs/>
-        </w:rPr>
-        <w:t xml:space="preserve"> also </w:t>
-      </w:r>
-      <w:r>
-        <w:t>reduces side-channel possibilities</w:t>
-      </w:r>
-      <w:r>
-        <w:t xml:space="preserve"> and ensures </w:t>
-      </w:r>
-      <w:r>
-        <w:rPr>
-          <w:b/>
-          <w:bCs/>
-        </w:rPr>
-        <w:t>Reproducibility</w:t>
-      </w:r>
-      <w:r>
-        <w:rPr>
-          <w:b/>
-          <w:bCs/>
-        </w:rPr>
+        <w:t>.</w:t>
+      </w:r>
+      <w:r>
+        <w:t>The installation</w:t>
+      </w:r>
+      <w:r>
+        <w:t xml:space="preserve"> setup using a standard user account and not the default root user. This allowed for separation of privilege principle on the hst environemnt. The installation and user details are illustrated in </w:t>
+      </w:r>
+      <w:r>
+        <w:rPr>
+          <w:color w:val="C00000"/>
+        </w:rPr>
+        <w:t>Figure X</w:t>
+      </w:r>
+      <w:r>
+        <w:rPr>
+          <w:color w:val="C00000"/>
+        </w:rPr>
+        <w:t xml:space="preserve"> based on</w:t>
+      </w:r>
+      <w:r>
+        <w:rPr>
+          <w:color w:val="C00000"/>
+        </w:rPr>
+        <w:t xml:space="preserve"> Table X </w:t>
+      </w:r>
+      <w:r>
+        <w:rPr>
+          <w:color w:val="C00000"/>
+        </w:rPr>
+        <w:lastRenderedPageBreak/>
+        <w:t>system specifications</w:t>
+      </w:r>
+      <w:r>
+        <w:t>.</w:t>
+      </w:r>
+      <w:r>
         <w:t xml:space="preserve"> </w:t>
       </w:r>
       <w:r>
-        <w:t>and</w:t>
-      </w:r>
-      <w:r>
-        <w:t xml:space="preserve"> peer validation of results</w:t>
-      </w:r>
-      <w:r>
-        <w:t xml:space="preserve">. </w:t>
-      </w:r>
-      <w:r>
-        <w:t xml:space="preserve">The host operating system constitutes the </w:t>
-      </w:r>
-      <w:r>
-        <w:rPr>
-          <w:b/>
-          <w:bCs/>
-        </w:rPr>
-        <w:t>trusted computing base (TCB)</w:t>
-      </w:r>
-      <w:r>
-        <w:t xml:space="preserve"> of the entire experimental platform. Any instability or misconfiguration at this layer undermines higher-level security guarantees. Ubuntu LTS minimizes kernel churn and driver regressions, ensuring consistent Open vSwitch and Docker behavior across experiments.</w:t>
-      </w:r>
-      <w:r>
-        <w:t>Thi</w:t>
-      </w:r>
-      <w:r>
-        <w:t xml:space="preserve">s </w:t>
-      </w:r>
-      <w:r>
-        <w:t xml:space="preserve">allows </w:t>
-      </w:r>
-      <w:r>
-        <w:t xml:space="preserve">for </w:t>
-      </w:r>
-      <w:r>
-        <w:t>meaningful comparison with related Zero Trust testbeds reported in the literature.</w:t>
+        <w:t>The</w:t>
+      </w:r>
+      <w:r>
+        <w:t xml:space="preserve"> idle resource consumption before adding components</w:t>
+      </w:r>
+      <w:r>
+        <w:t xml:space="preserve"> was also measured </w:t>
       </w:r>
       <w:r>
         <w:t xml:space="preserve"> </w:t>
       </w:r>
       <w:r>
-        <w:t>The</w:t>
-      </w:r>
-      <w:r>
-        <w:t xml:space="preserve"> idle resource consumption before adding components</w:t>
-      </w:r>
-      <w:r>
-        <w:t xml:space="preserve"> was also measured aand evaluated as shown </w:t>
+        <w:t xml:space="preserve">and </w:t>
+      </w:r>
+      <w:r>
+        <w:t>observed to have a baeline memory and processor utilization</w:t>
+      </w:r>
+      <w:r>
+        <w:t xml:space="preserve"> as shown </w:t>
       </w:r>
       <w:r>
         <w:rPr>
@@ -1701,22 +1962,15 @@
           <w:tab w:val="num" w:pos="720"/>
         </w:tabs>
       </w:pPr>
-    </w:p>
-    <w:p>
-      <w:pPr>
-        <w:tabs>
-          <w:tab w:val="num" w:pos="720"/>
-        </w:tabs>
-      </w:pPr>
       <w:r>
         <w:rPr>
           <w:noProof/>
         </w:rPr>
         <w:drawing>
-          <wp:inline distT="0" distB="0" distL="0" distR="0" wp14:anchorId="24970480" wp14:editId="253587B0">
-            <wp:extent cx="3349128" cy="765672"/>
-            <wp:effectExtent l="0" t="0" r="3810" b="0"/>
-            <wp:docPr id="1705867860" name="Picture 1"/>
+          <wp:inline distT="0" distB="0" distL="0" distR="0" wp14:anchorId="42C22D0F" wp14:editId="2E477330">
+            <wp:extent cx="3505200" cy="2787476"/>
+            <wp:effectExtent l="0" t="0" r="0" b="0"/>
+            <wp:docPr id="632221310" name="Picture 37" descr="A screenshot of a computer program&#10;&#10;Description automatically generated"/>
             <wp:cNvGraphicFramePr>
               <a:graphicFrameLocks xmlns:a="http://schemas.openxmlformats.org/drawingml/2006/main" noChangeAspect="1"/>
             </wp:cNvGraphicFramePr>
@@ -1724,7 +1978,7 @@
               <a:graphicData uri="http://schemas.openxmlformats.org/drawingml/2006/picture">
                 <pic:pic xmlns:pic="http://schemas.openxmlformats.org/drawingml/2006/picture">
                   <pic:nvPicPr>
-                    <pic:cNvPr id="1705867860" name="Picture 1705867860"/>
+                    <pic:cNvPr id="632221310" name="Picture 37" descr="A screenshot of a computer program&#10;&#10;Description automatically generated"/>
                     <pic:cNvPicPr/>
                   </pic:nvPicPr>
                   <pic:blipFill rotWithShape="1">
@@ -1735,13 +1989,13 @@
                         </a:ext>
                       </a:extLst>
                     </a:blip>
-                    <a:srcRect r="41527" b="69272"/>
+                    <a:srcRect r="45287"/>
                     <a:stretch/>
                   </pic:blipFill>
                   <pic:spPr bwMode="auto">
                     <a:xfrm>
                       <a:off x="0" y="0"/>
-                      <a:ext cx="3349128" cy="765672"/>
+                      <a:ext cx="3507875" cy="2789604"/>
                     </a:xfrm>
                     <a:prstGeom prst="rect">
                       <a:avLst/>
@@ -1764,10 +2018,83 @@
     </w:p>
     <w:p>
       <w:pPr>
+        <w:tabs>
+          <w:tab w:val="num" w:pos="720"/>
+        </w:tabs>
+      </w:pPr>
+    </w:p>
+    <w:p>
+      <w:pPr>
+        <w:tabs>
+          <w:tab w:val="num" w:pos="720"/>
+        </w:tabs>
+      </w:pPr>
+      <w:r>
+        <w:rPr>
+          <w:noProof/>
+        </w:rPr>
+        <w:drawing>
+          <wp:inline distT="0" distB="0" distL="0" distR="0" wp14:anchorId="24970480" wp14:editId="7BDA22CD">
+            <wp:extent cx="4703324" cy="1075266"/>
+            <wp:effectExtent l="0" t="0" r="0" b="4445"/>
+            <wp:docPr id="1705867860" name="Picture 1"/>
+            <wp:cNvGraphicFramePr>
+              <a:graphicFrameLocks xmlns:a="http://schemas.openxmlformats.org/drawingml/2006/main" noChangeAspect="1"/>
+            </wp:cNvGraphicFramePr>
+            <a:graphic xmlns:a="http://schemas.openxmlformats.org/drawingml/2006/main">
+              <a:graphicData uri="http://schemas.openxmlformats.org/drawingml/2006/picture">
+                <pic:pic xmlns:pic="http://schemas.openxmlformats.org/drawingml/2006/picture">
+                  <pic:nvPicPr>
+                    <pic:cNvPr id="1705867860" name="Picture 1705867860"/>
+                    <pic:cNvPicPr/>
+                  </pic:nvPicPr>
+                  <pic:blipFill rotWithShape="1">
+                    <a:blip r:embed="rId11">
+                      <a:extLst>
+                        <a:ext uri="{28A0092B-C50C-407E-A947-70E740481C1C}">
+                          <a14:useLocalDpi xmlns:a14="http://schemas.microsoft.com/office/drawing/2010/main" val="0"/>
+                        </a:ext>
+                      </a:extLst>
+                    </a:blip>
+                    <a:srcRect r="41527" b="69272"/>
+                    <a:stretch/>
+                  </pic:blipFill>
+                  <pic:spPr bwMode="auto">
+                    <a:xfrm>
+                      <a:off x="0" y="0"/>
+                      <a:ext cx="4750477" cy="1086046"/>
+                    </a:xfrm>
+                    <a:prstGeom prst="rect">
+                      <a:avLst/>
+                    </a:prstGeom>
+                    <a:ln>
+                      <a:noFill/>
+                    </a:ln>
+                    <a:extLst>
+                      <a:ext uri="{53640926-AAD7-44D8-BBD7-CCE9431645EC}">
+                        <a14:shadowObscured xmlns:a14="http://schemas.microsoft.com/office/drawing/2010/main"/>
+                      </a:ext>
+                    </a:extLst>
+                  </pic:spPr>
+                </pic:pic>
+              </a:graphicData>
+            </a:graphic>
+          </wp:inline>
+        </w:drawing>
+      </w:r>
+    </w:p>
+    <w:p>
+      <w:pPr>
         <w:pStyle w:val="Heading3"/>
       </w:pPr>
       <w:r>
-        <w:t>System requirements:</w:t>
+        <w:t xml:space="preserve">System </w:t>
+      </w:r>
+      <w:r>
+        <w:t>Specifications</w:t>
+      </w:r>
+      <w:r>
+        <w:t>:</w:t>
       </w:r>
     </w:p>
     <w:tbl>
@@ -1820,7 +2147,6 @@
           </w:tcPr>
           <w:p>
             <w:r>
-              <w:lastRenderedPageBreak/>
               <w:t>Memory</w:t>
             </w:r>
           </w:p>
@@ -1999,7 +2325,11 @@
         <w:t>does not</w:t>
       </w:r>
       <w:r>
-        <w:t xml:space="preserve"> have the tools to easily view routing tables in the format most emulation software expects.</w:t>
+        <w:t xml:space="preserve"> have the tools to easily view </w:t>
+      </w:r>
+      <w:r>
+        <w:lastRenderedPageBreak/>
+        <w:t>routing tables in the format most emulation software expects.</w:t>
       </w:r>
       <w:r>
         <w:t xml:space="preserve"> </w:t>
@@ -2024,57 +2354,27 @@
       </w:r>
       <w:r>
         <w:t xml:space="preserve"> like Docker, OVS, and Mininet.</w:t>
+      </w:r>
+      <w:r>
+        <w:t xml:space="preserve"> Curl, bridge-utils, git and net-tools were installed  for network and bridge functions</w:t>
+      </w:r>
+      <w:r>
+        <w:t xml:space="preserve">, versioning and quering and sending data to specific container URLs. This is ilustrated in </w:t>
+      </w:r>
+      <w:r>
+        <w:rPr>
+          <w:color w:val="C00000"/>
+        </w:rPr>
+        <w:t>figure X</w:t>
       </w:r>
     </w:p>
     <w:p/>
+    <w:p/>
     <w:p>
       <w:r>
         <w:rPr>
           <w:noProof/>
         </w:rPr>
-        <w:drawing>
-          <wp:inline distT="0" distB="0" distL="0" distR="0" wp14:anchorId="3E36C540" wp14:editId="5639F98C">
-            <wp:extent cx="3492500" cy="355600"/>
-            <wp:effectExtent l="0" t="0" r="0" b="0"/>
-            <wp:docPr id="1030541074" name="Picture 1"/>
-            <wp:cNvGraphicFramePr>
-              <a:graphicFrameLocks xmlns:a="http://schemas.openxmlformats.org/drawingml/2006/main" noChangeAspect="1"/>
-            </wp:cNvGraphicFramePr>
-            <a:graphic xmlns:a="http://schemas.openxmlformats.org/drawingml/2006/main">
-              <a:graphicData uri="http://schemas.openxmlformats.org/drawingml/2006/picture">
-                <pic:pic xmlns:pic="http://schemas.openxmlformats.org/drawingml/2006/picture">
-                  <pic:nvPicPr>
-                    <pic:cNvPr id="1030541074" name=""/>
-                    <pic:cNvPicPr/>
-                  </pic:nvPicPr>
-                  <pic:blipFill>
-                    <a:blip r:embed="rId11"/>
-                    <a:stretch>
-                      <a:fillRect/>
-                    </a:stretch>
-                  </pic:blipFill>
-                  <pic:spPr>
-                    <a:xfrm>
-                      <a:off x="0" y="0"/>
-                      <a:ext cx="3492500" cy="355600"/>
-                    </a:xfrm>
-                    <a:prstGeom prst="rect">
-                      <a:avLst/>
-                    </a:prstGeom>
-                  </pic:spPr>
-                </pic:pic>
-              </a:graphicData>
-            </a:graphic>
-          </wp:inline>
-        </w:drawing>
-      </w:r>
-    </w:p>
-    <w:p>
-      <w:r>
-        <w:rPr>
-          <w:noProof/>
-        </w:rPr>
-        <w:lastRenderedPageBreak/>
         <w:drawing>
           <wp:inline distT="0" distB="0" distL="0" distR="0" wp14:anchorId="74242437" wp14:editId="06E4321D">
             <wp:extent cx="3287398" cy="3299552"/>
@@ -2124,59 +2424,6 @@
           </wp:inline>
         </w:drawing>
       </w:r>
-      <w:r>
-        <w:rPr>
-          <w:noProof/>
-        </w:rPr>
-        <w:drawing>
-          <wp:inline distT="0" distB="0" distL="0" distR="0" wp14:anchorId="541A2936" wp14:editId="0AABE78B">
-            <wp:extent cx="3505200" cy="2787476"/>
-            <wp:effectExtent l="0" t="0" r="0" b="0"/>
-            <wp:docPr id="632221310" name="Picture 37" descr="A screenshot of a computer program&#10;&#10;Description automatically generated"/>
-            <wp:cNvGraphicFramePr>
-              <a:graphicFrameLocks xmlns:a="http://schemas.openxmlformats.org/drawingml/2006/main" noChangeAspect="1"/>
-            </wp:cNvGraphicFramePr>
-            <a:graphic xmlns:a="http://schemas.openxmlformats.org/drawingml/2006/main">
-              <a:graphicData uri="http://schemas.openxmlformats.org/drawingml/2006/picture">
-                <pic:pic xmlns:pic="http://schemas.openxmlformats.org/drawingml/2006/picture">
-                  <pic:nvPicPr>
-                    <pic:cNvPr id="632221310" name="Picture 37" descr="A screenshot of a computer program&#10;&#10;Description automatically generated"/>
-                    <pic:cNvPicPr/>
-                  </pic:nvPicPr>
-                  <pic:blipFill rotWithShape="1">
-                    <a:blip r:embed="rId13">
-                      <a:extLst>
-                        <a:ext uri="{28A0092B-C50C-407E-A947-70E740481C1C}">
-                          <a14:useLocalDpi xmlns:a14="http://schemas.microsoft.com/office/drawing/2010/main" val="0"/>
-                        </a:ext>
-                      </a:extLst>
-                    </a:blip>
-                    <a:srcRect r="45287"/>
-                    <a:stretch/>
-                  </pic:blipFill>
-                  <pic:spPr bwMode="auto">
-                    <a:xfrm>
-                      <a:off x="0" y="0"/>
-                      <a:ext cx="3507875" cy="2789604"/>
-                    </a:xfrm>
-                    <a:prstGeom prst="rect">
-                      <a:avLst/>
-                    </a:prstGeom>
-                    <a:ln>
-                      <a:noFill/>
-                    </a:ln>
-                    <a:extLst>
-                      <a:ext uri="{53640926-AAD7-44D8-BBD7-CCE9431645EC}">
-                        <a14:shadowObscured xmlns:a14="http://schemas.microsoft.com/office/drawing/2010/main"/>
-                      </a:ext>
-                    </a:extLst>
-                  </pic:spPr>
-                </pic:pic>
-              </a:graphicData>
-            </a:graphic>
-          </wp:inline>
-        </w:drawing>
-      </w:r>
     </w:p>
     <w:p/>
     <w:p>
@@ -2262,6 +2509,21 @@
         <w:t xml:space="preserve"> </w:t>
       </w:r>
       <w:r>
+        <w:t xml:space="preserve">Docker (version </w:t>
+      </w:r>
+      <w:r>
+        <w:t>28.2.2, build 28.2.2-0ubuntu1~24.04.1</w:t>
+      </w:r>
+      <w:r>
+        <w:t>) was installed to</w:t>
+      </w:r>
+      <w:r>
+        <w:t xml:space="preserve"> the zero trust testbed.</w:t>
+      </w:r>
+      <w:r>
+        <w:t xml:space="preserve"> </w:t>
+      </w:r>
+      <w:r>
         <w:t xml:space="preserve">Docker enables each Zero Trust component to operate as an </w:t>
       </w:r>
       <w:r>
@@ -2274,54 +2536,23 @@
       <w:r>
         <w:t xml:space="preserve">, aligning with modern cloud-native security architectures. </w:t>
       </w:r>
-      <w:r>
-        <w:t xml:space="preserve">The </w:t>
-      </w:r>
-      <w:r>
-        <w:lastRenderedPageBreak/>
-        <w:t>Docker's layered filesystem facilitates:</w:t>
-      </w:r>
-      <w:r>
-        <w:rPr>
-          <w:b/>
-          <w:bCs/>
-        </w:rPr>
-        <w:t>Version Control for Experiments</w:t>
-      </w:r>
-      <w:r>
-        <w:rPr>
-          <w:b/>
-          <w:bCs/>
-        </w:rPr>
-        <w:t xml:space="preserve">, precise CPU and memory </w:t>
-      </w:r>
-      <w:r>
-        <w:rPr>
-          <w:b/>
-          <w:bCs/>
-        </w:rPr>
-        <w:t>Resource Accounting</w:t>
-      </w:r>
-      <w:r>
-        <w:t xml:space="preserve"> and ne</w:t>
-      </w:r>
-      <w:r>
-        <w:rPr>
-          <w:b/>
-          <w:bCs/>
-        </w:rPr>
-        <w:t>twork Namespace Isolation</w:t>
-      </w:r>
-      <w:r>
-        <w:t>.</w:t>
-      </w:r>
     </w:p>
     <w:p>
       <w:r>
-        <w:t xml:space="preserve">This process was considered to provide a more secure and trusted computing base since containers default capabilites adopta a least privilege approach with little to no container escape possibilities despite the evolving threats targeting docker and other container hypervisors. While most containers can be ephemeral in nature, these containers were set-up and run as background daemons to esnure that the states are easily managed and the hosts can easily communicate with each other. This made the  testbed more suitable for the multinode research and representation required for testing of the custom dynamic and context aware trust algorithm </w:t>
-      </w:r>
-      <w:r>
-        <w:t xml:space="preserve">Docker setup and verification processes are illustrated in </w:t>
+        <w:t xml:space="preserve">This process was considered to provide a more secure and trusted computing base since containers default capabilites adopta a least privilege approach with little to no container escape possibilities despite the evolving threats targeting docker and other container hypervisors. </w:t>
+      </w:r>
+      <w:r>
+        <w:lastRenderedPageBreak/>
+        <w:t xml:space="preserve">While most containers can be ephemeral in nature, these containers were set-up and run as background daemons to esnure that the states are easily managed and the hosts can easily communicate with each other. This made the  testbed more suitable for the multinode research and representation required for testing of the custom dynamic and context aware trust algorithm </w:t>
+      </w:r>
+      <w:r>
+        <w:t>For each docker instance, the default user account was defined as the dedicated docker user</w:t>
+      </w:r>
+      <w:r>
+        <w:t xml:space="preserve">. These </w:t>
+      </w:r>
+      <w:r>
+        <w:t xml:space="preserve">setup and verification processes are illustrated in </w:t>
       </w:r>
       <w:r>
         <w:rPr>
@@ -2351,7 +2582,7 @@
                     <pic:cNvPicPr/>
                   </pic:nvPicPr>
                   <pic:blipFill>
-                    <a:blip r:embed="rId14">
+                    <a:blip r:embed="rId13">
                       <a:extLst>
                         <a:ext uri="{28A0092B-C50C-407E-A947-70E740481C1C}">
                           <a14:useLocalDpi xmlns:a14="http://schemas.microsoft.com/office/drawing/2010/main" val="0"/>
@@ -2399,7 +2630,7 @@
                     <pic:cNvPicPr/>
                   </pic:nvPicPr>
                   <pic:blipFill>
-                    <a:blip r:embed="rId15" cstate="print">
+                    <a:blip r:embed="rId14" cstate="print">
                       <a:extLst>
                         <a:ext uri="{28A0092B-C50C-407E-A947-70E740481C1C}">
                           <a14:useLocalDpi xmlns:a14="http://schemas.microsoft.com/office/drawing/2010/main" val="0"/>
@@ -2481,77 +2712,70 @@
           <w:b/>
           <w:bCs/>
         </w:rPr>
-        <w:t>policy-driven rather than topology-</w:t>
-      </w:r>
-      <w:r>
-        <w:rPr>
-          <w:b/>
-          <w:bCs/>
-        </w:rPr>
+        <w:t>policy-driven rather than topology-driven</w:t>
+      </w:r>
+      <w:r>
+        <w:t>.</w:t>
+      </w:r>
+      <w:r>
+        <w:t xml:space="preserve"> </w:t>
+      </w:r>
+      <w:r>
+        <w:t xml:space="preserve">It </w:t>
+      </w:r>
+      <w:r>
+        <w:t xml:space="preserve">evaluates decisions at the network layer through </w:t>
+      </w:r>
+      <w:r>
+        <w:t>Flow Tables</w:t>
+      </w:r>
+      <w:r>
+        <w:t xml:space="preserve"> to </w:t>
+      </w:r>
+      <w:r>
+        <w:t>Match-action rules derived from higher-level policies</w:t>
+      </w:r>
+      <w:r>
+        <w:t xml:space="preserve"> and Statistics Collectio</w:t>
+      </w:r>
+      <w:r>
+        <w:t>n through</w:t>
+      </w:r>
+      <w:r>
+        <w:t xml:space="preserve"> Per-flow counters for behavioral analysis</w:t>
+      </w:r>
+      <w:r>
+        <w:t>. It allows for protocol independence by decoupling</w:t>
+      </w:r>
+      <w:r>
+        <w:t xml:space="preserve"> from specific L2/L3/L4 </w:t>
+      </w:r>
+      <w:r>
+        <w:t xml:space="preserve">protocol </w:t>
+      </w:r>
+      <w:r>
+        <w:t>implementations</w:t>
+      </w:r>
+      <w:r>
+        <w:t xml:space="preserve">. </w:t>
+      </w:r>
+      <w:r>
+        <w:t>OVS</w:t>
+      </w:r>
+      <w:r>
+        <w:t xml:space="preserve"> allows precise measurement of</w:t>
+      </w:r>
+      <w:r>
+        <w:t xml:space="preserve"> </w:t>
+      </w:r>
+      <w:r>
+        <w:t>Flow installation latency</w:t>
+      </w:r>
+      <w:r>
+        <w:t xml:space="preserve">, </w:t>
+      </w:r>
+      <w:r>
         <w:lastRenderedPageBreak/>
-        <w:t>driven</w:t>
-      </w:r>
-      <w:r>
-        <w:t>.</w:t>
-      </w:r>
-      <w:r>
-        <w:t xml:space="preserve"> </w:t>
-      </w:r>
-      <w:r>
-        <w:t xml:space="preserve">It </w:t>
-      </w:r>
-      <w:r>
-        <w:t xml:space="preserve">evaluates decisions at the network layer through </w:t>
-      </w:r>
-      <w:r>
-        <w:t>Flow Tables</w:t>
-      </w:r>
-      <w:r>
-        <w:t xml:space="preserve"> to </w:t>
-      </w:r>
-      <w:r>
-        <w:t>Match-action rules derived from higher-level policies</w:t>
-      </w:r>
-      <w:r>
-        <w:t xml:space="preserve"> and Statistics Collectio</w:t>
-      </w:r>
-      <w:r>
-        <w:t>n through</w:t>
-      </w:r>
-      <w:r>
-        <w:t xml:space="preserve"> Per-flow counters for behavioral analysis</w:t>
-      </w:r>
-      <w:r>
-        <w:t>. It allows for protocol independence by decoupling</w:t>
-      </w:r>
-      <w:r>
-        <w:t xml:space="preserve"> from specific L2/L3/L4 </w:t>
-      </w:r>
-      <w:r>
-        <w:t xml:space="preserve">protocol </w:t>
-      </w:r>
-      <w:r>
-        <w:t>implementations</w:t>
-      </w:r>
-      <w:r>
-        <w:t xml:space="preserve">. </w:t>
-      </w:r>
-      <w:r>
-        <w:t>OVS</w:t>
-      </w:r>
-      <w:r>
-        <w:t xml:space="preserve"> allows precise measurement of</w:t>
-      </w:r>
-      <w:r>
-        <w:t xml:space="preserve"> </w:t>
-      </w:r>
-      <w:r>
-        <w:t>Flow installation latency</w:t>
-      </w:r>
-      <w:r>
-        <w:t xml:space="preserve">, </w:t>
-      </w:r>
-      <w:r>
         <w:t>Enforcement granularity</w:t>
       </w:r>
       <w:r>
@@ -2594,7 +2818,43 @@
         <w:rPr>
           <w:color w:val="FF0000"/>
         </w:rPr>
-        <w:t>. OVS installation and setup is whon in figure X</w:t>
+        <w:t xml:space="preserve">. OVS </w:t>
+      </w:r>
+      <w:r>
+        <w:rPr>
+          <w:color w:val="FF0000"/>
+        </w:rPr>
+        <w:t xml:space="preserve">version </w:t>
+      </w:r>
+      <w:r>
+        <w:rPr>
+          <w:color w:val="FF0000"/>
+        </w:rPr>
+        <w:t>3.34 (</w:t>
+      </w:r>
+      <w:r>
+        <w:rPr>
+          <w:color w:val="FF0000"/>
+        </w:rPr>
+        <w:t>ovs_version: "3.3.4"</w:t>
+      </w:r>
+      <w:r>
+        <w:rPr>
+          <w:color w:val="FF0000"/>
+        </w:rPr>
+        <w:t xml:space="preserve">) </w:t>
+      </w:r>
+      <w:r>
+        <w:rPr>
+          <w:color w:val="FF0000"/>
+        </w:rPr>
+        <w:t xml:space="preserve"> was installe to provide acces to openflow version 1.3 for more granular flow matches at layer 2/3 as shown in </w:t>
+      </w:r>
+      <w:r>
+        <w:rPr>
+          <w:color w:val="FF0000"/>
+        </w:rPr>
+        <w:t>figure X</w:t>
       </w:r>
     </w:p>
     <w:p>
@@ -2603,47 +2863,6 @@
           <w:color w:val="FF0000"/>
         </w:rPr>
       </w:pPr>
-      <w:r>
-        <w:rPr>
-          <w:noProof/>
-          <w:color w:val="FF0000"/>
-        </w:rPr>
-        <w:drawing>
-          <wp:inline distT="0" distB="0" distL="0" distR="0" wp14:anchorId="620CC001" wp14:editId="0672EFD2">
-            <wp:extent cx="2247900" cy="457200"/>
-            <wp:effectExtent l="0" t="0" r="0" b="0"/>
-            <wp:docPr id="1253666684" name="Picture 1" descr="A black background with white text&#10;&#10;Description automatically generated"/>
-            <wp:cNvGraphicFramePr>
-              <a:graphicFrameLocks xmlns:a="http://schemas.openxmlformats.org/drawingml/2006/main" noChangeAspect="1"/>
-            </wp:cNvGraphicFramePr>
-            <a:graphic xmlns:a="http://schemas.openxmlformats.org/drawingml/2006/main">
-              <a:graphicData uri="http://schemas.openxmlformats.org/drawingml/2006/picture">
-                <pic:pic xmlns:pic="http://schemas.openxmlformats.org/drawingml/2006/picture">
-                  <pic:nvPicPr>
-                    <pic:cNvPr id="1253666684" name="Picture 1" descr="A black background with white text&#10;&#10;Description automatically generated"/>
-                    <pic:cNvPicPr/>
-                  </pic:nvPicPr>
-                  <pic:blipFill>
-                    <a:blip r:embed="rId16"/>
-                    <a:stretch>
-                      <a:fillRect/>
-                    </a:stretch>
-                  </pic:blipFill>
-                  <pic:spPr>
-                    <a:xfrm>
-                      <a:off x="0" y="0"/>
-                      <a:ext cx="2247900" cy="457200"/>
-                    </a:xfrm>
-                    <a:prstGeom prst="rect">
-                      <a:avLst/>
-                    </a:prstGeom>
-                  </pic:spPr>
-                </pic:pic>
-              </a:graphicData>
-            </a:graphic>
-          </wp:inline>
-        </w:drawing>
-      </w:r>
     </w:p>
     <w:p>
       <w:pPr>
@@ -2672,7 +2891,7 @@
                     <pic:cNvPicPr/>
                   </pic:nvPicPr>
                   <pic:blipFill>
-                    <a:blip r:embed="rId17">
+                    <a:blip r:embed="rId15">
                       <a:extLst>
                         <a:ext uri="{28A0092B-C50C-407E-A947-70E740481C1C}">
                           <a14:useLocalDpi xmlns:a14="http://schemas.microsoft.com/office/drawing/2010/main" val="0"/>
@@ -2734,7 +2953,7 @@
                     <pic:cNvPicPr/>
                   </pic:nvPicPr>
                   <pic:blipFill>
-                    <a:blip r:embed="rId18"/>
+                    <a:blip r:embed="rId16"/>
                     <a:stretch>
                       <a:fillRect/>
                     </a:stretch>
@@ -2781,11 +3000,11 @@
         <w:t xml:space="preserve"> without introducing unnecessary environmental noise.</w:t>
       </w:r>
       <w:r>
-        <w:t xml:space="preserve"> Mininet also allows us to map individual services, clients and/or users into indivdual hosts such that their bahvior follows that of hosts communicating within the environment. With Karaf (opendaylight) acting as the policy administrtor, opebflow </w:t>
+        <w:t xml:space="preserve"> Mininet also allows us to map individual services, clients and/or users into indivdual hosts such that their bahvior follows that of hosts communicating within the environment. With Karaf (opendaylight) acting as the policy administrtor, opebflow rules can be applied such that openvswitch grants or dnies access toservice and/or client. Mininet allows for automation of the toplogy basedon python scripts which align and syncronize with he docker community engine, its composer and the defiition of custompolicies </w:t>
       </w:r>
       <w:r>
         <w:lastRenderedPageBreak/>
-        <w:t xml:space="preserve">rules can be applied such that openvswitch grants or dnies access toservice and/or client. Mininet allows for automation of the toplogy basedon python scripts which align and syncronize with he docker community engine, its composer and the defiition of custompolicies on Envoy and OpenPolicyAgent. The installation and version is shown in </w:t>
+        <w:t xml:space="preserve">on Envoy and OpenPolicyAgent. The installation and version is shown in </w:t>
       </w:r>
       <w:r>
         <w:rPr>
@@ -2824,7 +3043,7 @@
                     <pic:cNvPicPr/>
                   </pic:nvPicPr>
                   <pic:blipFill>
-                    <a:blip r:embed="rId19">
+                    <a:blip r:embed="rId17">
                       <a:extLst>
                         <a:ext uri="{28A0092B-C50C-407E-A947-70E740481C1C}">
                           <a14:useLocalDpi xmlns:a14="http://schemas.microsoft.com/office/drawing/2010/main" val="0"/>
@@ -2872,7 +3091,7 @@
                     <pic:cNvPicPr/>
                   </pic:nvPicPr>
                   <pic:blipFill>
-                    <a:blip r:embed="rId20"/>
+                    <a:blip r:embed="rId18"/>
                     <a:stretch>
                       <a:fillRect/>
                     </a:stretch>
@@ -2899,7 +3118,6 @@
         <w:pStyle w:val="Heading2"/>
       </w:pPr>
       <w:r>
-        <w:lastRenderedPageBreak/>
         <w:t>OpenDaylight: Policy Administration Point</w:t>
       </w:r>
     </w:p>
@@ -2908,7 +3126,11 @@
         <w:t>OpenDaylight (ODL) was deployed as the SDN controller responsible for translating trust decisions into OpenFlow rules</w:t>
       </w:r>
       <w:r>
-        <w:t>. The version setup is 21.2 and is provided as package named karaf that allows for a web API through port 8181, ssh access through port 8101 and openflow access through ports 6653 and 6633 for versions 1 and 1.3 respectively. The testbed works on verion 1.3 which is stable and supports multiflow tables, metering and possible controller failovers</w:t>
+        <w:t xml:space="preserve">. The version setup is 21.2 and is provided as package named </w:t>
+      </w:r>
+      <w:r>
+        <w:lastRenderedPageBreak/>
+        <w:t>karaf that allows for a web API through port 8181, ssh access through port 8101 and openflow access through ports 6653 and 6633 for versions 1 and 1.3 respectively. The testbed works on verion 1.3 which is stable and supports multiflow tables, metering and possible controller failovers</w:t>
       </w:r>
       <w:r>
         <w:t>.</w:t>
@@ -3002,7 +3224,7 @@
                     <pic:cNvPicPr/>
                   </pic:nvPicPr>
                   <pic:blipFill>
-                    <a:blip r:embed="rId21"/>
+                    <a:blip r:embed="rId19"/>
                     <a:stretch>
                       <a:fillRect/>
                     </a:stretch>
@@ -3044,7 +3266,7 @@
                     <pic:cNvPicPr/>
                   </pic:nvPicPr>
                   <pic:blipFill>
-                    <a:blip r:embed="rId22">
+                    <a:blip r:embed="rId20">
                       <a:extLst>
                         <a:ext uri="{28A0092B-C50C-407E-A947-70E740481C1C}">
                           <a14:useLocalDpi xmlns:a14="http://schemas.microsoft.com/office/drawing/2010/main" val="0"/>
@@ -3092,7 +3314,7 @@
                     <pic:cNvPicPr/>
                   </pic:nvPicPr>
                   <pic:blipFill>
-                    <a:blip r:embed="rId23">
+                    <a:blip r:embed="rId21">
                       <a:extLst>
                         <a:ext uri="{28A0092B-C50C-407E-A947-70E740481C1C}">
                           <a14:useLocalDpi xmlns:a14="http://schemas.microsoft.com/office/drawing/2010/main" val="0"/>
@@ -3141,7 +3363,7 @@
                     <pic:cNvPicPr/>
                   </pic:nvPicPr>
                   <pic:blipFill>
-                    <a:blip r:embed="rId24" cstate="print">
+                    <a:blip r:embed="rId22" cstate="print">
                       <a:extLst>
                         <a:ext uri="{28A0092B-C50C-407E-A947-70E740481C1C}">
                           <a14:useLocalDpi xmlns:a14="http://schemas.microsoft.com/office/drawing/2010/main" val="0"/>
@@ -3409,7 +3631,7 @@
                     <pic:cNvPicPr/>
                   </pic:nvPicPr>
                   <pic:blipFill>
-                    <a:blip r:embed="rId25"/>
+                    <a:blip r:embed="rId23"/>
                     <a:stretch>
                       <a:fillRect/>
                     </a:stretch>
@@ -3517,7 +3739,7 @@
                     <pic:cNvPicPr/>
                   </pic:nvPicPr>
                   <pic:blipFill>
-                    <a:blip r:embed="rId26">
+                    <a:blip r:embed="rId24">
                       <a:extLst>
                         <a:ext uri="{28A0092B-C50C-407E-A947-70E740481C1C}">
                           <a14:useLocalDpi xmlns:a14="http://schemas.microsoft.com/office/drawing/2010/main" val="0"/>
@@ -3573,7 +3795,7 @@
                     <pic:cNvPicPr/>
                   </pic:nvPicPr>
                   <pic:blipFill>
-                    <a:blip r:embed="rId27" cstate="print">
+                    <a:blip r:embed="rId25" cstate="print">
                       <a:extLst>
                         <a:ext uri="{28A0092B-C50C-407E-A947-70E740481C1C}">
                           <a14:useLocalDpi xmlns:a14="http://schemas.microsoft.com/office/drawing/2010/main" val="0"/>
@@ -3620,7 +3842,7 @@
                     <pic:cNvPicPr/>
                   </pic:nvPicPr>
                   <pic:blipFill>
-                    <a:blip r:embed="rId28" cstate="print">
+                    <a:blip r:embed="rId26" cstate="print">
                       <a:extLst>
                         <a:ext uri="{28A0092B-C50C-407E-A947-70E740481C1C}">
                           <a14:useLocalDpi xmlns:a14="http://schemas.microsoft.com/office/drawing/2010/main" val="0"/>
@@ -3836,7 +4058,7 @@
                     <pic:cNvPicPr/>
                   </pic:nvPicPr>
                   <pic:blipFill>
-                    <a:blip r:embed="rId29"/>
+                    <a:blip r:embed="rId27"/>
                     <a:stretch>
                       <a:fillRect/>
                     </a:stretch>
@@ -3879,7 +4101,7 @@
                     <pic:cNvPicPr/>
                   </pic:nvPicPr>
                   <pic:blipFill>
-                    <a:blip r:embed="rId30">
+                    <a:blip r:embed="rId28">
                       <a:extLst>
                         <a:ext uri="{28A0092B-C50C-407E-A947-70E740481C1C}">
                           <a14:useLocalDpi xmlns:a14="http://schemas.microsoft.com/office/drawing/2010/main" val="0"/>
@@ -3927,7 +4149,7 @@
                     <pic:cNvPicPr/>
                   </pic:nvPicPr>
                   <pic:blipFill>
-                    <a:blip r:embed="rId31" cstate="print">
+                    <a:blip r:embed="rId29" cstate="print">
                       <a:extLst>
                         <a:ext uri="{28A0092B-C50C-407E-A947-70E740481C1C}">
                           <a14:useLocalDpi xmlns:a14="http://schemas.microsoft.com/office/drawing/2010/main" val="0"/>
@@ -3976,7 +4198,7 @@
                     <pic:cNvPicPr/>
                   </pic:nvPicPr>
                   <pic:blipFill>
-                    <a:blip r:embed="rId32" cstate="print">
+                    <a:blip r:embed="rId30" cstate="print">
                       <a:extLst>
                         <a:ext uri="{28A0092B-C50C-407E-A947-70E740481C1C}">
                           <a14:useLocalDpi xmlns:a14="http://schemas.microsoft.com/office/drawing/2010/main" val="0"/>
@@ -4024,7 +4246,7 @@
                     <pic:cNvPicPr/>
                   </pic:nvPicPr>
                   <pic:blipFill>
-                    <a:blip r:embed="rId33"/>
+                    <a:blip r:embed="rId31"/>
                     <a:stretch>
                       <a:fillRect/>
                     </a:stretch>
@@ -4064,7 +4286,7 @@
                     <pic:cNvPicPr/>
                   </pic:nvPicPr>
                   <pic:blipFill>
-                    <a:blip r:embed="rId34"/>
+                    <a:blip r:embed="rId32"/>
                     <a:stretch>
                       <a:fillRect/>
                     </a:stretch>
@@ -4424,7 +4646,7 @@
                     <pic:cNvPicPr/>
                   </pic:nvPicPr>
                   <pic:blipFill>
-                    <a:blip r:embed="rId35"/>
+                    <a:blip r:embed="rId33"/>
                     <a:stretch>
                       <a:fillRect/>
                     </a:stretch>
@@ -4468,7 +4690,7 @@
                     <pic:cNvPicPr/>
                   </pic:nvPicPr>
                   <pic:blipFill>
-                    <a:blip r:embed="rId36" cstate="print">
+                    <a:blip r:embed="rId34" cstate="print">
                       <a:extLst>
                         <a:ext uri="{28A0092B-C50C-407E-A947-70E740481C1C}">
                           <a14:useLocalDpi xmlns:a14="http://schemas.microsoft.com/office/drawing/2010/main" val="0"/>
@@ -4585,7 +4807,7 @@
                     <pic:cNvPicPr/>
                   </pic:nvPicPr>
                   <pic:blipFill>
-                    <a:blip r:embed="rId37"/>
+                    <a:blip r:embed="rId35"/>
                     <a:stretch>
                       <a:fillRect/>
                     </a:stretch>
@@ -4627,7 +4849,7 @@
                     <pic:cNvPicPr/>
                   </pic:nvPicPr>
                   <pic:blipFill>
-                    <a:blip r:embed="rId38"/>
+                    <a:blip r:embed="rId36"/>
                     <a:stretch>
                       <a:fillRect/>
                     </a:stretch>
@@ -4670,7 +4892,7 @@
                     <pic:cNvPicPr/>
                   </pic:nvPicPr>
                   <pic:blipFill>
-                    <a:blip r:embed="rId39"/>
+                    <a:blip r:embed="rId37"/>
                     <a:stretch>
                       <a:fillRect/>
                     </a:stretch>
@@ -4713,7 +4935,7 @@
                     <pic:cNvPicPr/>
                   </pic:nvPicPr>
                   <pic:blipFill>
-                    <a:blip r:embed="rId40"/>
+                    <a:blip r:embed="rId38"/>
                     <a:stretch>
                       <a:fillRect/>
                     </a:stretch>
@@ -4755,7 +4977,7 @@
                     <pic:cNvPicPr/>
                   </pic:nvPicPr>
                   <pic:blipFill>
-                    <a:blip r:embed="rId41"/>
+                    <a:blip r:embed="rId39"/>
                     <a:stretch>
                       <a:fillRect/>
                     </a:stretch>
@@ -4845,7 +5067,7 @@
                     <pic:cNvPicPr/>
                   </pic:nvPicPr>
                   <pic:blipFill>
-                    <a:blip r:embed="rId42"/>
+                    <a:blip r:embed="rId40"/>
                     <a:stretch>
                       <a:fillRect/>
                     </a:stretch>
@@ -4892,7 +5114,7 @@
                     <pic:cNvPicPr/>
                   </pic:nvPicPr>
                   <pic:blipFill>
-                    <a:blip r:embed="rId43"/>
+                    <a:blip r:embed="rId41"/>
                     <a:stretch>
                       <a:fillRect/>
                     </a:stretch>
@@ -4947,7 +5169,7 @@
                     <pic:cNvPicPr/>
                   </pic:nvPicPr>
                   <pic:blipFill>
-                    <a:blip r:embed="rId44"/>
+                    <a:blip r:embed="rId42"/>
                     <a:stretch>
                       <a:fillRect/>
                     </a:stretch>
@@ -4994,7 +5216,7 @@
                     <pic:cNvPicPr/>
                   </pic:nvPicPr>
                   <pic:blipFill>
-                    <a:blip r:embed="rId45"/>
+                    <a:blip r:embed="rId43"/>
                     <a:stretch>
                       <a:fillRect/>
                     </a:stretch>
@@ -5041,7 +5263,7 @@
                     <pic:cNvPicPr/>
                   </pic:nvPicPr>
                   <pic:blipFill>
-                    <a:blip r:embed="rId46"/>
+                    <a:blip r:embed="rId44"/>
                     <a:stretch>
                       <a:fillRect/>
                     </a:stretch>
@@ -5149,7 +5371,7 @@
                     <pic:cNvPicPr/>
                   </pic:nvPicPr>
                   <pic:blipFill>
-                    <a:blip r:embed="rId47"/>
+                    <a:blip r:embed="rId45"/>
                     <a:stretch>
                       <a:fillRect/>
                     </a:stretch>
@@ -5350,10 +5572,107 @@
     </w:p>
     <w:p>
       <w:pPr>
+        <w:rPr>
+          <w:lang w:eastAsia="en-GB"/>
+        </w:rPr>
+      </w:pPr>
+    </w:p>
+    <w:p>
+      <w:pPr>
+        <w:pStyle w:val="Heading1"/>
+        <w:jc w:val="center"/>
+      </w:pPr>
+      <w:r>
+        <w:lastRenderedPageBreak/>
+        <w:t>Evalution Results and Discussions</w:t>
+      </w:r>
+    </w:p>
+    <w:p/>
+    <w:p>
+      <w:r>
+        <w:t>The fundamental premise of Zero Trust Architecture (ZTA) is the elimination of implicit trust. Traditional access control models have historically relied on static, perimeter-based defenses where authentication is a discrete event granting durable access. However, in modern heterogeneous environment</w:t>
+      </w:r>
+      <w:r>
+        <w:t xml:space="preserve">, </w:t>
+      </w:r>
+      <w:r>
+        <w:t>characterized by remote work, Bring Your Own Device (BYOD) policies, and ephemeral cloud infrastructures</w:t>
+      </w:r>
+      <w:r>
+        <w:t xml:space="preserve">, </w:t>
+      </w:r>
+      <w:r>
+        <w:t>the context of a user and their device is highly volatile. A device authenticated as secure at one moment may be compromised minutes later.</w:t>
+      </w:r>
+      <w:r>
+        <w:t xml:space="preserve"> </w:t>
+      </w:r>
+    </w:p>
+    <w:p/>
+    <w:p>
+      <w:r>
+        <w:t xml:space="preserve">This chapter presents a comprehensive evaluation of computational trust models, </w:t>
+      </w:r>
+      <w:r>
+        <w:t xml:space="preserve">beginning from baseline </w:t>
+      </w:r>
+      <w:r>
+        <w:t>No-Policy settings to</w:t>
+      </w:r>
+      <w:r>
+        <w:t xml:space="preserve"> legacy static paradigms </w:t>
+      </w:r>
+      <w:r>
+        <w:t>and finally to</w:t>
+      </w:r>
+      <w:r>
+        <w:t xml:space="preserve"> advanced dynamic </w:t>
+      </w:r>
+      <w:r>
+        <w:t xml:space="preserve">trust estimation and </w:t>
+      </w:r>
+      <w:r>
+        <w:t xml:space="preserve">fusion architectures. </w:t>
+      </w:r>
+      <w:r>
+        <w:t>The work</w:t>
+      </w:r>
+      <w:r>
+        <w:t xml:space="preserve"> analyze</w:t>
+      </w:r>
+      <w:r>
+        <w:t>s</w:t>
+      </w:r>
+      <w:r>
+        <w:t xml:space="preserve"> the theoretical and operational implications of six distinct access models: Implicit Trust (No Policy), Single-Domain Criteria Trust, Multidomain Score-Based Trust (Base DS Model), and three advanced Multidomain variations incorporating temporal dynamics (Linear Time, Exponential Time, and Ensemble Inertia).</w:t>
+      </w:r>
+      <w:r>
+        <w:t xml:space="preserve"> The advanced</w:t>
+      </w:r>
+      <w:r>
+        <w:t xml:space="preserve"> multidomain </w:t>
+      </w:r>
+      <w:r>
+        <w:t xml:space="preserve">models are simulated and tested across </w:t>
+      </w:r>
+      <w:r>
+        <w:t>six</w:t>
+      </w:r>
+      <w:r>
+        <w:t xml:space="preserve"> scenarios defined</w:t>
+      </w:r>
+      <w:r>
+        <w:t xml:space="preserve"> in Table X toemulatecommon access scenarios in heterogenous enterprise networks.</w:t>
+      </w:r>
+      <w:r>
+        <w:t xml:space="preserve"> The evaluation explores the structural tension between absolute security verification and operational usability, culminating in a stateful behavioral engine that continuously evaluates risk.</w:t>
+      </w:r>
+    </w:p>
+    <w:p>
+      <w:pPr>
         <w:pStyle w:val="Heading2"/>
       </w:pPr>
       <w:r>
-        <w:lastRenderedPageBreak/>
         <w:t>Evaluation Framework</w:t>
       </w:r>
     </w:p>
@@ -5452,6 +5771,7 @@
           </w:tcPr>
           <w:p>
             <w:r>
+              <w:lastRenderedPageBreak/>
               <w:t>Range</w:t>
             </w:r>
           </w:p>
@@ -5884,11 +6204,7 @@
         <w:t>Password + MFA + Healthy Device</w:t>
       </w:r>
       <w:r>
-        <w:t xml:space="preserve"> and a verified regular user). The silver levels haveslightly lower trust levels </w:t>
-      </w:r>
-      <w:r>
-        <w:lastRenderedPageBreak/>
-        <w:t>becaise most resources access requests are</w:t>
+        <w:t xml:space="preserve"> and a verified regular user). The silver levels haveslightly lower trust levels becaise most resources access requests are</w:t>
       </w:r>
       <w:r>
         <w:t xml:space="preserve"> less "hardware-bound" than device-tunnel sessions, slightly increasing risk surface </w:t>
@@ -6070,6 +6386,7 @@
                 <w:b/>
                 <w:bCs/>
               </w:rPr>
+              <w:lastRenderedPageBreak/>
               <w:t>Value</w:t>
             </w:r>
           </w:p>
@@ -6809,7 +7126,6 @@
                 <w:b/>
                 <w:bCs/>
               </w:rPr>
-              <w:lastRenderedPageBreak/>
               <w:t>0.45≤</w:t>
             </w:r>
             <w:r>
@@ -7057,7 +7373,11 @@
         <w:t>Majority Rule" (0.75) is met  such that in</w:t>
       </w:r>
       <w:r>
-        <w:t xml:space="preserve"> a 4-domain system (User, Device, Network, App), if </w:t>
+        <w:t xml:space="preserve"> a 4-domain system (User, Device, </w:t>
+      </w:r>
+      <w:r>
+        <w:lastRenderedPageBreak/>
+        <w:t>Network, App), if </w:t>
       </w:r>
       <w:r>
         <w:rPr>
@@ -8533,7 +8853,7 @@
                     <pic:cNvPicPr/>
                   </pic:nvPicPr>
                   <pic:blipFill>
-                    <a:blip r:embed="rId48"/>
+                    <a:blip r:embed="rId46"/>
                     <a:stretch>
                       <a:fillRect/>
                     </a:stretch>
@@ -9296,7 +9616,7 @@
                     <pic:cNvPicPr/>
                   </pic:nvPicPr>
                   <pic:blipFill>
-                    <a:blip r:embed="rId49"/>
+                    <a:blip r:embed="rId47"/>
                     <a:stretch>
                       <a:fillRect/>
                     </a:stretch>
@@ -9342,7 +9662,7 @@
                     <pic:cNvPicPr/>
                   </pic:nvPicPr>
                   <pic:blipFill>
-                    <a:blip r:embed="rId50"/>
+                    <a:blip r:embed="rId48"/>
                     <a:stretch>
                       <a:fillRect/>
                     </a:stretch>
@@ -9388,7 +9708,7 @@
                     <pic:cNvPicPr/>
                   </pic:nvPicPr>
                   <pic:blipFill>
-                    <a:blip r:embed="rId51"/>
+                    <a:blip r:embed="rId49"/>
                     <a:stretch>
                       <a:fillRect/>
                     </a:stretch>
@@ -9516,7 +9836,7 @@
                     <pic:cNvPicPr/>
                   </pic:nvPicPr>
                   <pic:blipFill>
-                    <a:blip r:embed="rId52"/>
+                    <a:blip r:embed="rId50"/>
                     <a:stretch>
                       <a:fillRect/>
                     </a:stretch>
@@ -9563,7 +9883,7 @@
                     <pic:cNvPicPr/>
                   </pic:nvPicPr>
                   <pic:blipFill>
-                    <a:blip r:embed="rId53"/>
+                    <a:blip r:embed="rId51"/>
                     <a:stretch>
                       <a:fillRect/>
                     </a:stretch>
@@ -9630,7 +9950,7 @@
                     <pic:cNvPicPr/>
                   </pic:nvPicPr>
                   <pic:blipFill>
-                    <a:blip r:embed="rId54"/>
+                    <a:blip r:embed="rId52"/>
                     <a:stretch>
                       <a:fillRect/>
                     </a:stretch>
@@ -9676,7 +9996,7 @@
                     <pic:cNvPicPr/>
                   </pic:nvPicPr>
                   <pic:blipFill>
-                    <a:blip r:embed="rId55"/>
+                    <a:blip r:embed="rId53"/>
                     <a:stretch>
                       <a:fillRect/>
                     </a:stretch>
@@ -9743,7 +10063,7 @@
                     <pic:cNvPicPr/>
                   </pic:nvPicPr>
                   <pic:blipFill>
-                    <a:blip r:embed="rId56"/>
+                    <a:blip r:embed="rId54"/>
                     <a:stretch>
                       <a:fillRect/>
                     </a:stretch>
@@ -9789,7 +10109,7 @@
                     <pic:cNvPicPr/>
                   </pic:nvPicPr>
                   <pic:blipFill>
-                    <a:blip r:embed="rId57"/>
+                    <a:blip r:embed="rId55"/>
                     <a:stretch>
                       <a:fillRect/>
                     </a:stretch>
@@ -9846,7 +10166,7 @@
                     <pic:cNvPicPr/>
                   </pic:nvPicPr>
                   <pic:blipFill>
-                    <a:blip r:embed="rId58"/>
+                    <a:blip r:embed="rId56"/>
                     <a:stretch>
                       <a:fillRect/>
                     </a:stretch>
@@ -9889,7 +10209,7 @@
                     <pic:cNvPicPr/>
                   </pic:nvPicPr>
                   <pic:blipFill>
-                    <a:blip r:embed="rId59"/>
+                    <a:blip r:embed="rId57"/>
                     <a:stretch>
                       <a:fillRect/>
                     </a:stretch>
@@ -10138,7 +10458,7 @@
                     <pic:cNvPicPr/>
                   </pic:nvPicPr>
                   <pic:blipFill>
-                    <a:blip r:embed="rId60"/>
+                    <a:blip r:embed="rId58"/>
                     <a:stretch>
                       <a:fillRect/>
                     </a:stretch>
@@ -10181,7 +10501,7 @@
                     <pic:cNvPicPr/>
                   </pic:nvPicPr>
                   <pic:blipFill>
-                    <a:blip r:embed="rId61"/>
+                    <a:blip r:embed="rId59"/>
                     <a:stretch>
                       <a:fillRect/>
                     </a:stretch>
@@ -12980,7 +13300,7 @@
                     <pic:cNvPicPr/>
                   </pic:nvPicPr>
                   <pic:blipFill>
-                    <a:blip r:embed="rId62"/>
+                    <a:blip r:embed="rId60"/>
                     <a:stretch>
                       <a:fillRect/>
                     </a:stretch>
@@ -15125,7 +15445,7 @@
                     <pic:cNvPicPr/>
                   </pic:nvPicPr>
                   <pic:blipFill>
-                    <a:blip r:embed="rId63"/>
+                    <a:blip r:embed="rId61"/>
                     <a:stretch>
                       <a:fillRect/>
                     </a:stretch>
@@ -18598,10 +18918,439 @@
       </w:r>
     </w:p>
     <w:p/>
+    <w:p>
+      <w:pPr>
+        <w:tabs>
+          <w:tab w:val="num" w:pos="360"/>
+        </w:tabs>
+      </w:pPr>
+      <w:r>
+        <w:t>T</w:t>
+      </w:r>
+      <w:r>
+        <w:t xml:space="preserve">he </w:t>
+      </w:r>
+      <w:r>
+        <w:t>model maintains a f</w:t>
+      </w:r>
+      <w:r>
+        <w:t>reshness-</w:t>
+      </w:r>
+      <w:r>
+        <w:t>i</w:t>
+      </w:r>
+      <w:r>
+        <w:t>nertia Continuum</w:t>
+      </w:r>
+      <w:r>
+        <w:t xml:space="preserve"> by</w:t>
+      </w:r>
+      <w:r>
+        <w:t xml:space="preserve"> implementing </w:t>
+      </w:r>
+      <w:r>
+        <w:t>a dynamic slider between </w:t>
+      </w:r>
+      <w:r>
+        <w:rPr>
+          <w:b/>
+          <w:bCs/>
+        </w:rPr>
+        <w:t>Signal</w:t>
+      </w:r>
+      <w:r>
+        <w:rPr>
+          <w:b/>
+          <w:bCs/>
+        </w:rPr>
+        <w:t xml:space="preserve"> (metadata telemetry)</w:t>
+      </w:r>
+      <w:r>
+        <w:t> and </w:t>
+      </w:r>
+      <w:r>
+        <w:rPr>
+          <w:b/>
+          <w:bCs/>
+        </w:rPr>
+        <w:t>Memory</w:t>
+      </w:r>
+      <w:r>
+        <w:t>, governed by "Session Freshness"</w:t>
+      </w:r>
+      <w:r>
+        <w:t>. At intialzation  at ti</w:t>
+      </w:r>
+      <w:r>
+        <w:t xml:space="preserve">me </w:t>
+      </w:r>
+      <w:r>
+        <w:rPr>
+          <w:b/>
+          <w:bCs/>
+        </w:rPr>
+        <w:t>(</w:t>
+      </w:r>
+      <w:r>
+        <w:rPr>
+          <w:b/>
+          <w:bCs/>
+          <w:i/>
+          <w:iCs/>
+        </w:rPr>
+        <w:t>t</w:t>
+      </w:r>
+      <w:r>
+        <w:rPr>
+          <w:b/>
+          <w:bCs/>
+        </w:rPr>
+        <w:t>→</w:t>
+      </w:r>
+      <w:r>
+        <w:rPr>
+          <w:b/>
+          <w:bCs/>
+        </w:rPr>
+        <w:t>0)</w:t>
+      </w:r>
+      <w:r>
+        <w:rPr>
+          <w:b/>
+          <w:bCs/>
+        </w:rPr>
+        <w:t xml:space="preserve">, the telemetry data is fresh and themodel </w:t>
+      </w:r>
+      <w:r>
+        <w:t>is </w:t>
+      </w:r>
+      <w:r>
+        <w:rPr>
+          <w:b/>
+          <w:bCs/>
+        </w:rPr>
+        <w:t>Signal-Dominant</w:t>
+      </w:r>
+      <w:r>
+        <w:t>.</w:t>
+      </w:r>
+      <w:r>
+        <w:t xml:space="preserve"> It operate</w:t>
+      </w:r>
+      <w:r>
+        <w:t>s</w:t>
+      </w:r>
+      <w:r>
+        <w:t xml:space="preserve"> </w:t>
+      </w:r>
+      <w:r>
+        <w:t>o</w:t>
+      </w:r>
+      <w:r>
+        <w:t xml:space="preserve">n the premise that the </w:t>
+      </w:r>
+      <w:r>
+        <w:t xml:space="preserve">session data is not enough to create a profile on the request and thus evvaluates the </w:t>
+      </w:r>
+      <w:r>
+        <w:t xml:space="preserve">current </w:t>
+      </w:r>
+      <w:r>
+        <w:t xml:space="preserve"> user identifiers,</w:t>
+      </w:r>
+      <w:r>
+        <w:t xml:space="preserve"> Device Health</w:t>
+      </w:r>
+      <w:r>
+        <w:t>, application profile</w:t>
+      </w:r>
+      <w:r>
+        <w:t xml:space="preserve">, and </w:t>
+      </w:r>
+      <w:r>
+        <w:t>n</w:t>
+      </w:r>
+      <w:r>
+        <w:t>etwork</w:t>
+      </w:r>
+      <w:r>
+        <w:t xml:space="preserve"> posture. This is because at the start of a session, verification</w:t>
+      </w:r>
+      <w:r>
+        <w:rPr>
+          <w:b/>
+          <w:bCs/>
+        </w:rPr>
+        <w:t xml:space="preserve"> must be Absolute</w:t>
+      </w:r>
+      <w:r>
+        <w:rPr>
+          <w:b/>
+          <w:bCs/>
+        </w:rPr>
+        <w:t xml:space="preserve"> </w:t>
+      </w:r>
+      <w:r>
+        <w:t>and</w:t>
+      </w:r>
+      <w:r>
+        <w:t xml:space="preserve"> Inertia </w:t>
+      </w:r>
+      <w:r>
+        <w:t xml:space="preserve">trust </w:t>
+      </w:r>
+      <w:r>
+        <w:t>should not override a bad login</w:t>
+      </w:r>
+      <w:r>
+        <w:t xml:space="preserve"> attempt</w:t>
+      </w:r>
+      <w:r>
+        <w:t>.</w:t>
+      </w:r>
+      <w:r>
+        <w:t xml:space="preserve"> At maturation of a session </w:t>
+      </w:r>
+      <w:r>
+        <w:rPr>
+          <w:b/>
+          <w:bCs/>
+        </w:rPr>
+        <w:t xml:space="preserve"> (</w:t>
+      </w:r>
+      <w:r>
+        <w:rPr>
+          <w:b/>
+          <w:bCs/>
+          <w:i/>
+          <w:iCs/>
+        </w:rPr>
+        <w:t>t</w:t>
+      </w:r>
+      <w:r>
+        <w:rPr>
+          <w:b/>
+          <w:bCs/>
+        </w:rPr>
+        <w:t>→30)</w:t>
+      </w:r>
+      <w:r>
+        <w:rPr>
+          <w:b/>
+          <w:bCs/>
+        </w:rPr>
+        <w:t>,</w:t>
+      </w:r>
+      <w:r>
+        <w:rPr>
+          <w:b/>
+          <w:bCs/>
+        </w:rPr>
+        <w:t xml:space="preserve"> the session freshness is not there and therefore th model is </w:t>
+      </w:r>
+      <w:r>
+        <w:rPr>
+          <w:b/>
+          <w:bCs/>
+        </w:rPr>
+        <w:t>Inertia-Dominant</w:t>
+      </w:r>
+      <w:r>
+        <w:t>.</w:t>
+      </w:r>
+      <w:r>
+        <w:t xml:space="preserve"> It therefore operates on the premise that based on </w:t>
+      </w:r>
+      <w:r>
+        <w:t>an approximatesly 30min signal telemetry observation, the entity’ behavior has been consistent (or inconsistent)</w:t>
+      </w:r>
+      <w:r>
+        <w:t xml:space="preserve"> and therefore trust will be placed more on </w:t>
+      </w:r>
+      <w:r>
+        <w:rPr>
+          <w:i/>
+          <w:iCs/>
+        </w:rPr>
+        <w:t>accumulated knowledge</w:t>
+      </w:r>
+      <w:r>
+        <w:t>  than this specific millisecond's reading.</w:t>
+      </w:r>
+      <w:r>
+        <w:t xml:space="preserve"> </w:t>
+      </w:r>
+      <w:r>
+        <w:t>As verification ages, </w:t>
+      </w:r>
+      <w:r>
+        <w:rPr>
+          <w:b/>
+          <w:bCs/>
+        </w:rPr>
+        <w:t xml:space="preserve">Consistency </w:t>
+      </w:r>
+      <w:r>
+        <w:rPr>
+          <w:b/>
+          <w:bCs/>
+        </w:rPr>
+        <w:t xml:space="preserve">defined and </w:t>
+      </w:r>
+      <w:r>
+        <w:rPr>
+          <w:b/>
+          <w:bCs/>
+        </w:rPr>
+        <w:t>becomes Policy</w:t>
+      </w:r>
+      <w:r>
+        <w:t xml:space="preserve">. The system effectively </w:t>
+      </w:r>
+      <w:r>
+        <w:t>locks</w:t>
+      </w:r>
+      <w:r>
+        <w:t xml:space="preserve"> the decision, </w:t>
+      </w:r>
+      <w:r>
+        <w:lastRenderedPageBreak/>
+        <w:t>reducing the attack surface for session hijacking (a hijacker would need to mimic the established history perfectly to avoid triggering a massive deviation, but even then, the inertia resists rapid change).</w:t>
+      </w:r>
+      <w:r>
+        <w:t xml:space="preserve"> Thi results in beter access control and more effective  resource misuse and intrusion prevention in heterogenous enterprise environments. It also ensures continuous verification and monitoring of recources access per session</w:t>
+      </w:r>
+      <w:r>
+        <w:t>.</w:t>
+      </w:r>
+    </w:p>
+    <w:p>
+      <w:pPr>
+        <w:tabs>
+          <w:tab w:val="num" w:pos="360"/>
+        </w:tabs>
+      </w:pPr>
+      <w:r>
+        <w:t xml:space="preserve">The results are illustrated in </w:t>
+      </w:r>
+      <w:r>
+        <w:rPr>
+          <w:color w:val="C00000"/>
+        </w:rPr>
+        <w:t>Table X</w:t>
+      </w:r>
+      <w:r>
+        <w:rPr>
+          <w:color w:val="C00000"/>
+        </w:rPr>
+        <w:t xml:space="preserve">. </w:t>
+      </w:r>
+      <w:r>
+        <w:rPr>
+          <w:color w:val="C00000"/>
+        </w:rPr>
+        <w:t>The implications indicate that in the case of a</w:t>
+      </w:r>
+      <w:r>
+        <w:rPr>
+          <w:color w:val="C00000"/>
+        </w:rPr>
+        <w:t xml:space="preserve">n authenticated </w:t>
+      </w:r>
+      <w:r>
+        <w:rPr>
+          <w:b/>
+          <w:bCs/>
+        </w:rPr>
+        <w:t>user</w:t>
+      </w:r>
+      <w:r>
+        <w:t>,</w:t>
+      </w:r>
+      <w:r>
+        <w:t xml:space="preserve"> </w:t>
+      </w:r>
+      <w:r>
+        <w:t xml:space="preserve">the sesion </w:t>
+      </w:r>
+      <w:r>
+        <w:t>Starts with Full Access</w:t>
+      </w:r>
+      <w:r>
+        <w:t xml:space="preserve"> due to succesful authentication</w:t>
+      </w:r>
+      <w:r>
+        <w:t>. As time passes (</w:t>
+      </w:r>
+      <w:r>
+        <w:rPr>
+          <w:i/>
+          <w:iCs/>
+        </w:rPr>
+        <w:t>t</w:t>
+      </w:r>
+      <w:r>
+        <w:t xml:space="preserve">→30), </w:t>
+      </w:r>
+      <w:r>
+        <w:t>the weight on</w:t>
+      </w:r>
+      <w:r>
+        <w:t xml:space="preserve"> Fresh Signals decreases because they have built up "Momentum"</w:t>
+      </w:r>
+      <w:r>
+        <w:t xml:space="preserve"> and </w:t>
+      </w:r>
+      <w:r>
+        <w:t xml:space="preserve"> Access persists smoothly.</w:t>
+      </w:r>
+      <w:r>
+        <w:t xml:space="preserve"> On the contrary, if an </w:t>
+      </w:r>
+      <w:r>
+        <w:rPr>
+          <w:b/>
+          <w:bCs/>
+        </w:rPr>
+        <w:t>Attacker</w:t>
+      </w:r>
+      <w:r>
+        <w:rPr>
+          <w:b/>
+          <w:bCs/>
+        </w:rPr>
+        <w:t xml:space="preserve"> attempts access based on spoofed credentials, they start</w:t>
+      </w:r>
+      <w:r>
+        <w:t xml:space="preserve"> with No Access. As time passes, the system "Remembers" they are bad. Even if they mimic a safe signal </w:t>
+      </w:r>
+      <w:r>
+        <w:t>for</w:t>
+      </w:r>
+      <w:r>
+        <w:t xml:space="preserve"> or after 30</w:t>
+      </w:r>
+      <w:r>
+        <w:t xml:space="preserve"> minut</w:t>
+      </w:r>
+      <w:r>
+        <w:t>es</w:t>
+      </w:r>
+      <w:r>
+        <w:t>, the Inertia weighs the history of "Bad" so heavily that access remains denied.</w:t>
+      </w:r>
+    </w:p>
+    <w:p>
+      <w:pPr>
+        <w:tabs>
+          <w:tab w:val="num" w:pos="360"/>
+        </w:tabs>
+      </w:pPr>
+    </w:p>
     <w:p/>
     <w:tbl>
       <w:tblPr>
-        <w:tblW w:w="0" w:type="auto"/>
+        <w:tblW w:w="9060" w:type="dxa"/>
         <w:tblBorders>
           <w:top w:val="single" w:sz="4" w:space="0" w:color="auto"/>
           <w:left w:val="single" w:sz="4" w:space="0" w:color="auto"/>
@@ -18610,6 +19359,7 @@
           <w:insideH w:val="single" w:sz="4" w:space="0" w:color="auto"/>
           <w:insideV w:val="single" w:sz="4" w:space="0" w:color="auto"/>
         </w:tblBorders>
+        <w:tblLayout w:type="fixed"/>
         <w:tblCellMar>
           <w:top w:w="15" w:type="dxa"/>
           <w:left w:w="15" w:type="dxa"/>
@@ -18619,10 +19369,10 @@
         <w:tblLook w:val="04A0" w:firstRow="1" w:lastRow="0" w:firstColumn="1" w:lastColumn="0" w:noHBand="0" w:noVBand="1"/>
       </w:tblPr>
       <w:tblGrid>
-        <w:gridCol w:w="1749"/>
-        <w:gridCol w:w="2255"/>
-        <w:gridCol w:w="2127"/>
-        <w:gridCol w:w="2879"/>
+        <w:gridCol w:w="1413"/>
+        <w:gridCol w:w="2196"/>
+        <w:gridCol w:w="1489"/>
+        <w:gridCol w:w="3962"/>
       </w:tblGrid>
       <w:tr>
         <w:trPr>
@@ -18630,7 +19380,7 @@
         </w:trPr>
         <w:tc>
           <w:tcPr>
-            <w:tcW w:w="1271" w:type="dxa"/>
+            <w:tcW w:w="1413" w:type="dxa"/>
             <w:tcMar>
               <w:top w:w="75" w:type="dxa"/>
               <w:left w:w="150" w:type="dxa"/>
@@ -18662,7 +19412,7 @@
         </w:tc>
         <w:tc>
           <w:tcPr>
-            <w:tcW w:w="2447" w:type="dxa"/>
+            <w:tcW w:w="2196" w:type="dxa"/>
             <w:tcMar>
               <w:top w:w="75" w:type="dxa"/>
               <w:left w:w="150" w:type="dxa"/>
@@ -18693,7 +19443,7 @@
         </w:tc>
         <w:tc>
           <w:tcPr>
-            <w:tcW w:w="2127" w:type="dxa"/>
+            <w:tcW w:w="1489" w:type="dxa"/>
             <w:tcMar>
               <w:top w:w="75" w:type="dxa"/>
               <w:left w:w="150" w:type="dxa"/>
@@ -18724,7 +19474,7 @@
         </w:tc>
         <w:tc>
           <w:tcPr>
-            <w:tcW w:w="3165" w:type="dxa"/>
+            <w:tcW w:w="3962" w:type="dxa"/>
             <w:tcMar>
               <w:top w:w="75" w:type="dxa"/>
               <w:left w:w="150" w:type="dxa"/>
@@ -18757,7 +19507,7 @@
       <w:tr>
         <w:tc>
           <w:tcPr>
-            <w:tcW w:w="1271" w:type="dxa"/>
+            <w:tcW w:w="1413" w:type="dxa"/>
             <w:tcMar>
               <w:top w:w="75" w:type="dxa"/>
               <w:left w:w="150" w:type="dxa"/>
@@ -18785,7 +19535,7 @@
         </w:tc>
         <w:tc>
           <w:tcPr>
-            <w:tcW w:w="2447" w:type="dxa"/>
+            <w:tcW w:w="2196" w:type="dxa"/>
             <w:tcMar>
               <w:top w:w="75" w:type="dxa"/>
               <w:left w:w="150" w:type="dxa"/>
@@ -18812,7 +19562,7 @@
         </w:tc>
         <w:tc>
           <w:tcPr>
-            <w:tcW w:w="2127" w:type="dxa"/>
+            <w:tcW w:w="1489" w:type="dxa"/>
             <w:tcMar>
               <w:top w:w="75" w:type="dxa"/>
               <w:left w:w="150" w:type="dxa"/>
@@ -18840,7 +19590,7 @@
         </w:tc>
         <w:tc>
           <w:tcPr>
-            <w:tcW w:w="3165" w:type="dxa"/>
+            <w:tcW w:w="3962" w:type="dxa"/>
             <w:tcMar>
               <w:top w:w="75" w:type="dxa"/>
               <w:left w:w="150" w:type="dxa"/>
@@ -18897,7 +19647,7 @@
       <w:tr>
         <w:tc>
           <w:tcPr>
-            <w:tcW w:w="1271" w:type="dxa"/>
+            <w:tcW w:w="1413" w:type="dxa"/>
             <w:tcMar>
               <w:top w:w="75" w:type="dxa"/>
               <w:left w:w="150" w:type="dxa"/>
@@ -18919,14 +19669,13 @@
                 <w:rStyle w:val="Strong"/>
                 <w:rFonts w:cs="Times New Roman"/>
               </w:rPr>
-              <w:lastRenderedPageBreak/>
               <w:t>Remote / VPN</w:t>
             </w:r>
           </w:p>
         </w:tc>
         <w:tc>
           <w:tcPr>
-            <w:tcW w:w="2447" w:type="dxa"/>
+            <w:tcW w:w="2196" w:type="dxa"/>
             <w:tcMar>
               <w:top w:w="75" w:type="dxa"/>
               <w:left w:w="150" w:type="dxa"/>
@@ -18953,7 +19702,7 @@
         </w:tc>
         <w:tc>
           <w:tcPr>
-            <w:tcW w:w="2127" w:type="dxa"/>
+            <w:tcW w:w="1489" w:type="dxa"/>
             <w:tcMar>
               <w:top w:w="75" w:type="dxa"/>
               <w:left w:w="150" w:type="dxa"/>
@@ -18981,7 +19730,7 @@
         </w:tc>
         <w:tc>
           <w:tcPr>
-            <w:tcW w:w="3165" w:type="dxa"/>
+            <w:tcW w:w="3962" w:type="dxa"/>
             <w:tcMar>
               <w:top w:w="75" w:type="dxa"/>
               <w:left w:w="150" w:type="dxa"/>
@@ -19010,7 +19759,7 @@
       <w:tr>
         <w:tc>
           <w:tcPr>
-            <w:tcW w:w="1271" w:type="dxa"/>
+            <w:tcW w:w="1413" w:type="dxa"/>
             <w:tcMar>
               <w:top w:w="75" w:type="dxa"/>
               <w:left w:w="150" w:type="dxa"/>
@@ -19038,7 +19787,7 @@
         </w:tc>
         <w:tc>
           <w:tcPr>
-            <w:tcW w:w="2447" w:type="dxa"/>
+            <w:tcW w:w="2196" w:type="dxa"/>
             <w:tcMar>
               <w:top w:w="75" w:type="dxa"/>
               <w:left w:w="150" w:type="dxa"/>
@@ -19065,7 +19814,7 @@
         </w:tc>
         <w:tc>
           <w:tcPr>
-            <w:tcW w:w="2127" w:type="dxa"/>
+            <w:tcW w:w="1489" w:type="dxa"/>
             <w:tcMar>
               <w:top w:w="75" w:type="dxa"/>
               <w:left w:w="150" w:type="dxa"/>
@@ -19119,7 +19868,7 @@
         </w:tc>
         <w:tc>
           <w:tcPr>
-            <w:tcW w:w="3165" w:type="dxa"/>
+            <w:tcW w:w="3962" w:type="dxa"/>
             <w:tcMar>
               <w:top w:w="75" w:type="dxa"/>
               <w:left w:w="150" w:type="dxa"/>
@@ -19148,7 +19897,7 @@
       <w:tr>
         <w:tc>
           <w:tcPr>
-            <w:tcW w:w="1271" w:type="dxa"/>
+            <w:tcW w:w="1413" w:type="dxa"/>
             <w:tcMar>
               <w:top w:w="75" w:type="dxa"/>
               <w:left w:w="150" w:type="dxa"/>
@@ -19170,13 +19919,14 @@
                 <w:rStyle w:val="Strong"/>
                 <w:rFonts w:cs="Times New Roman"/>
               </w:rPr>
+              <w:lastRenderedPageBreak/>
               <w:t>Untrusted Device / BYOD</w:t>
             </w:r>
           </w:p>
         </w:tc>
         <w:tc>
           <w:tcPr>
-            <w:tcW w:w="2447" w:type="dxa"/>
+            <w:tcW w:w="2196" w:type="dxa"/>
             <w:tcMar>
               <w:top w:w="75" w:type="dxa"/>
               <w:left w:w="150" w:type="dxa"/>
@@ -19203,7 +19953,7 @@
         </w:tc>
         <w:tc>
           <w:tcPr>
-            <w:tcW w:w="2127" w:type="dxa"/>
+            <w:tcW w:w="1489" w:type="dxa"/>
             <w:tcMar>
               <w:top w:w="75" w:type="dxa"/>
               <w:left w:w="150" w:type="dxa"/>
@@ -19231,7 +19981,7 @@
         </w:tc>
         <w:tc>
           <w:tcPr>
-            <w:tcW w:w="3165" w:type="dxa"/>
+            <w:tcW w:w="3962" w:type="dxa"/>
             <w:tcMar>
               <w:top w:w="75" w:type="dxa"/>
               <w:left w:w="150" w:type="dxa"/>
@@ -19260,7 +20010,7 @@
       <w:tr>
         <w:tc>
           <w:tcPr>
-            <w:tcW w:w="1271" w:type="dxa"/>
+            <w:tcW w:w="1413" w:type="dxa"/>
             <w:tcMar>
               <w:top w:w="75" w:type="dxa"/>
               <w:left w:w="150" w:type="dxa"/>
@@ -19288,7 +20038,7 @@
         </w:tc>
         <w:tc>
           <w:tcPr>
-            <w:tcW w:w="2447" w:type="dxa"/>
+            <w:tcW w:w="2196" w:type="dxa"/>
             <w:tcMar>
               <w:top w:w="75" w:type="dxa"/>
               <w:left w:w="150" w:type="dxa"/>
@@ -19315,7 +20065,7 @@
         </w:tc>
         <w:tc>
           <w:tcPr>
-            <w:tcW w:w="2127" w:type="dxa"/>
+            <w:tcW w:w="1489" w:type="dxa"/>
             <w:tcMar>
               <w:top w:w="75" w:type="dxa"/>
               <w:left w:w="150" w:type="dxa"/>
@@ -19343,7 +20093,7 @@
         </w:tc>
         <w:tc>
           <w:tcPr>
-            <w:tcW w:w="3165" w:type="dxa"/>
+            <w:tcW w:w="3962" w:type="dxa"/>
             <w:tcMar>
               <w:top w:w="75" w:type="dxa"/>
               <w:left w:w="150" w:type="dxa"/>
@@ -19402,7 +20152,7 @@
       <w:tr>
         <w:tc>
           <w:tcPr>
-            <w:tcW w:w="1271" w:type="dxa"/>
+            <w:tcW w:w="1413" w:type="dxa"/>
             <w:tcMar>
               <w:top w:w="75" w:type="dxa"/>
               <w:left w:w="150" w:type="dxa"/>
@@ -19424,14 +20174,13 @@
                 <w:rStyle w:val="Strong"/>
                 <w:rFonts w:cs="Times New Roman"/>
               </w:rPr>
-              <w:lastRenderedPageBreak/>
               <w:t>Beaconing Attacker</w:t>
             </w:r>
           </w:p>
         </w:tc>
         <w:tc>
           <w:tcPr>
-            <w:tcW w:w="2447" w:type="dxa"/>
+            <w:tcW w:w="2196" w:type="dxa"/>
             <w:tcMar>
               <w:top w:w="75" w:type="dxa"/>
               <w:left w:w="150" w:type="dxa"/>
@@ -19458,7 +20207,7 @@
         </w:tc>
         <w:tc>
           <w:tcPr>
-            <w:tcW w:w="2127" w:type="dxa"/>
+            <w:tcW w:w="1489" w:type="dxa"/>
             <w:tcMar>
               <w:top w:w="75" w:type="dxa"/>
               <w:left w:w="150" w:type="dxa"/>
@@ -19486,7 +20235,7 @@
         </w:tc>
         <w:tc>
           <w:tcPr>
-            <w:tcW w:w="3165" w:type="dxa"/>
+            <w:tcW w:w="3962" w:type="dxa"/>
             <w:tcMar>
               <w:top w:w="75" w:type="dxa"/>
               <w:left w:w="150" w:type="dxa"/>
@@ -19560,12 +20309,203 @@
     <w:p/>
     <w:p>
       <w:r>
-        <w:t>The Ensemble Model successfully implements Contextual Durability. It moves Zero Trust from a stateless "Packet Fighter" to a stateful "Behavior Engine," enabling robust security that respects the continuity of legitimate work.</w:t>
+        <w:t>The Ensemble Model successfully implements Contextual Durability. It moves Zero Trust from a stateless "Packet Fighter"</w:t>
+      </w:r>
+      <w:r>
+        <w:t xml:space="preserve"> that focues on micro-fluctuations per domain area</w:t>
+      </w:r>
+      <w:r>
+        <w:t xml:space="preserve"> to a stateful "Behavior Engine," enabling robust security that respects the continuity of legitimate work.</w:t>
+      </w:r>
+      <w:r>
+        <w:t xml:space="preserve"> </w:t>
+      </w:r>
+      <w:r>
+        <w:t xml:space="preserve">A stateless packet evaluater tries to review </w:t>
+      </w:r>
+      <w:r>
+        <w:t>every individual network packet or API call</w:t>
+      </w:r>
+      <w:r>
+        <w:t xml:space="preserve"> i</w:t>
+      </w:r>
+      <w:r>
+        <w:t xml:space="preserve">nstead of looking at the macro-behavior of the user </w:t>
+      </w:r>
+      <w:r>
+        <w:t>such as a healthy</w:t>
+      </w:r>
+      <w:r>
+        <w:t xml:space="preserve"> device </w:t>
+      </w:r>
+      <w:r>
+        <w:t>or anomalous application</w:t>
+      </w:r>
+      <w:r>
+        <w:t xml:space="preserve"> behavi</w:t>
+      </w:r>
+      <w:r>
+        <w:t xml:space="preserve">our. </w:t>
+      </w:r>
+      <w:r>
+        <w:t>It therfore results in revoked access i</w:t>
+      </w:r>
+      <w:r>
+        <w:t xml:space="preserve">f a remote worker's </w:t>
+      </w:r>
+      <w:r>
+        <w:t>network</w:t>
+      </w:r>
+      <w:r>
+        <w:t xml:space="preserve"> drops a single packet, or their </w:t>
+      </w:r>
+      <w:r>
+        <w:t>congestion window</w:t>
+      </w:r>
+      <w:r>
+        <w:t xml:space="preserve"> spikes for one second causing a latency delay in a health check, because micro-</w:t>
+      </w:r>
+      <w:r>
+        <w:t>fluctutation</w:t>
+      </w:r>
+      <w:r>
+        <w:t>.</w:t>
+      </w:r>
+      <w:r>
+        <w:t xml:space="preserve"> </w:t>
+      </w:r>
+      <w:r>
+        <w:t>A stateful behavior engine on the other hand</w:t>
+      </w:r>
+      <w:r>
+        <w:t xml:space="preserve"> </w:t>
+      </w:r>
+      <w:r>
+        <w:t xml:space="preserve">remembers that the device has been secure </w:t>
+      </w:r>
+      <w:r>
+        <w:t>based on h</w:t>
+      </w:r>
+      <w:r>
+        <w:t>istorical Inertia</w:t>
+      </w:r>
+      <w:r>
+        <w:t xml:space="preserve">, </w:t>
+      </w:r>
+      <w:r>
+        <w:t>absorbs minor, transient network jitters only revokes trust if the </w:t>
+      </w:r>
+      <w:r>
+        <w:rPr>
+          <w:i/>
+          <w:iCs/>
+        </w:rPr>
+        <w:t>behavioral trend</w:t>
+      </w:r>
+      <w:r>
+        <w:t> actually shifts toward an anomaly.</w:t>
+      </w:r>
+      <w:r>
+        <w:t xml:space="preserve"> While </w:t>
+      </w:r>
+      <w:r>
+        <w:t xml:space="preserve"> a </w:t>
+      </w:r>
+      <w:r>
+        <w:rPr>
+          <w:b/>
+          <w:bCs/>
+        </w:rPr>
+        <w:t>stateless "Packet Fighter"</w:t>
+      </w:r>
+      <w:r>
+        <w:t xml:space="preserve"> causes the "Jittery Access" problem where users are constantly booted </w:t>
+      </w:r>
+      <w:r>
+        <w:lastRenderedPageBreak/>
+        <w:t>offline for benign network hiccups</w:t>
+      </w:r>
+      <w:r>
+        <w:t>, the</w:t>
+      </w:r>
+      <w:r>
+        <w:t xml:space="preserve"> Ensemble Model fixes this by looking at the broader continuity of the session.</w:t>
       </w:r>
     </w:p>
     <w:p/>
     <w:p/>
-    <w:p/>
+    <w:p>
+      <w:r>
+        <w:t>The progression of computational architectures in this research underscores a fundamental reality of Zero Trust: security cannot rely on absolute, discrete proofs.</w:t>
+      </w:r>
+    </w:p>
+    <w:p>
+      <w:r>
+        <w:t xml:space="preserve">The evaluation reveals that static frameworks like Single-Domain Trust are fundamentally fragile, oscillating wildly between extreme risk and extreme usability friction. The introduction of Multidomain Base Fusion via Dempster-Shafer theory successfully mitigated </w:t>
+      </w:r>
+      <w:r>
+        <w:t>telemetry</w:t>
+      </w:r>
+      <w:r>
+        <w:t xml:space="preserve"> brittleness, enabling contextual gray-area routing. However, </w:t>
+      </w:r>
+      <w:r>
+        <w:t>this</w:t>
+      </w:r>
+      <w:r>
+        <w:t xml:space="preserve"> spatial-only model failed to account for the ephemerality of the connection context, highlighting the necessity of temporal integration.</w:t>
+      </w:r>
+    </w:p>
+    <w:p>
+      <w:r>
+        <w:t>Both Linear and Exponential time variants proved that </w:t>
+      </w:r>
+      <w:r>
+        <w:rPr>
+          <w:b/>
+          <w:bCs/>
+        </w:rPr>
+        <w:t>Time-to-Live (TTL) must be dynamically bound to contextual risk</w:t>
+      </w:r>
+      <w:r>
+        <w:t>. Yet, the aggressive depreciation demanded by security explicitly conflicts with the continuity demanded by operations.</w:t>
+      </w:r>
+    </w:p>
+    <w:p>
+      <w:r>
+        <w:t>The final </w:t>
+      </w:r>
+      <w:r>
+        <w:rPr>
+          <w:b/>
+          <w:bCs/>
+        </w:rPr>
+        <w:t>Ensemble Trust Model</w:t>
+      </w:r>
+      <w:r>
+        <w:t> represents the synthesis of these conflicting forces. By abstracting access controls into mathematical </w:t>
+      </w:r>
+      <w:r>
+        <w:rPr>
+          <w:i/>
+          <w:iCs/>
+        </w:rPr>
+        <w:t>momentum</w:t>
+      </w:r>
+      <w:r>
+        <w:t>, the architecture recognizes that sustained programmatic access cannot be supported solely by continuous re-verification—which is inherently volatile and decays in value—but must be carried by mathematical </w:t>
+      </w:r>
+      <w:r>
+        <w:rPr>
+          <w:i/>
+          <w:iCs/>
+        </w:rPr>
+        <w:t>behavioral consistency</w:t>
+      </w:r>
+      <w:r>
+        <w:t>. This evolution from implicit trust perimeters to stateful, inertia-driven fusion provides a robust blueprint for next-generation Continuous Adaptive Risk algorithms inside enterprise architectures.</w:t>
+      </w:r>
+    </w:p>
     <w:p/>
     <w:p/>
     <w:p/>
@@ -20214,8 +21154,8 @@
   <w:abstractNum w:abstractNumId="4" w15:restartNumberingAfterBreak="0">
     <w:nsid w:val="0E6A1AC2"/>
     <w:multiLevelType w:val="hybridMultilevel"/>
-    <w:tmpl w:val="F1165FB8"/>
-    <w:lvl w:ilvl="0" w:tplc="0809001B">
+    <w:tmpl w:val="6060B1CA"/>
+    <w:lvl w:ilvl="0" w:tplc="10DC14CA">
       <w:start w:val="1"/>
       <w:numFmt w:val="lowerRoman"/>
       <w:lvlText w:val="%1."/>
@@ -20223,6 +21163,10 @@
       <w:pPr>
         <w:ind w:left="720" w:hanging="360"/>
       </w:pPr>
+      <w:rPr>
+        <w:b/>
+        <w:bCs/>
+      </w:rPr>
     </w:lvl>
     <w:lvl w:ilvl="1" w:tplc="FFFFFFFF" w:tentative="1">
       <w:start w:val="1"/>
@@ -23264,6 +24208,155 @@
     </w:lvl>
   </w:abstractNum>
   <w:abstractNum w:abstractNumId="27" w15:restartNumberingAfterBreak="0">
+    <w:nsid w:val="3B4B5E32"/>
+    <w:multiLevelType w:val="multilevel"/>
+    <w:tmpl w:val="BFFC9E20"/>
+    <w:lvl w:ilvl="0">
+      <w:start w:val="1"/>
+      <w:numFmt w:val="bullet"/>
+      <w:lvlText w:val=""/>
+      <w:lvlJc w:val="left"/>
+      <w:pPr>
+        <w:tabs>
+          <w:tab w:val="num" w:pos="720"/>
+        </w:tabs>
+        <w:ind w:left="720" w:hanging="360"/>
+      </w:pPr>
+      <w:rPr>
+        <w:rFonts w:ascii="Symbol" w:hAnsi="Symbol" w:hint="default"/>
+        <w:sz w:val="20"/>
+      </w:rPr>
+    </w:lvl>
+    <w:lvl w:ilvl="1" w:tentative="1">
+      <w:start w:val="1"/>
+      <w:numFmt w:val="bullet"/>
+      <w:lvlText w:val="o"/>
+      <w:lvlJc w:val="left"/>
+      <w:pPr>
+        <w:tabs>
+          <w:tab w:val="num" w:pos="1440"/>
+        </w:tabs>
+        <w:ind w:left="1440" w:hanging="360"/>
+      </w:pPr>
+      <w:rPr>
+        <w:rFonts w:ascii="Courier New" w:hAnsi="Courier New" w:hint="default"/>
+        <w:sz w:val="20"/>
+      </w:rPr>
+    </w:lvl>
+    <w:lvl w:ilvl="2" w:tentative="1">
+      <w:start w:val="1"/>
+      <w:numFmt w:val="bullet"/>
+      <w:lvlText w:val=""/>
+      <w:lvlJc w:val="left"/>
+      <w:pPr>
+        <w:tabs>
+          <w:tab w:val="num" w:pos="2160"/>
+        </w:tabs>
+        <w:ind w:left="2160" w:hanging="360"/>
+      </w:pPr>
+      <w:rPr>
+        <w:rFonts w:ascii="Wingdings" w:hAnsi="Wingdings" w:hint="default"/>
+        <w:sz w:val="20"/>
+      </w:rPr>
+    </w:lvl>
+    <w:lvl w:ilvl="3" w:tentative="1">
+      <w:start w:val="1"/>
+      <w:numFmt w:val="bullet"/>
+      <w:lvlText w:val=""/>
+      <w:lvlJc w:val="left"/>
+      <w:pPr>
+        <w:tabs>
+          <w:tab w:val="num" w:pos="2880"/>
+        </w:tabs>
+        <w:ind w:left="2880" w:hanging="360"/>
+      </w:pPr>
+      <w:rPr>
+        <w:rFonts w:ascii="Wingdings" w:hAnsi="Wingdings" w:hint="default"/>
+        <w:sz w:val="20"/>
+      </w:rPr>
+    </w:lvl>
+    <w:lvl w:ilvl="4" w:tentative="1">
+      <w:start w:val="1"/>
+      <w:numFmt w:val="bullet"/>
+      <w:lvlText w:val=""/>
+      <w:lvlJc w:val="left"/>
+      <w:pPr>
+        <w:tabs>
+          <w:tab w:val="num" w:pos="3600"/>
+        </w:tabs>
+        <w:ind w:left="3600" w:hanging="360"/>
+      </w:pPr>
+      <w:rPr>
+        <w:rFonts w:ascii="Wingdings" w:hAnsi="Wingdings" w:hint="default"/>
+        <w:sz w:val="20"/>
+      </w:rPr>
+    </w:lvl>
+    <w:lvl w:ilvl="5" w:tentative="1">
+      <w:start w:val="1"/>
+      <w:numFmt w:val="bullet"/>
+      <w:lvlText w:val=""/>
+      <w:lvlJc w:val="left"/>
+      <w:pPr>
+        <w:tabs>
+          <w:tab w:val="num" w:pos="4320"/>
+        </w:tabs>
+        <w:ind w:left="4320" w:hanging="360"/>
+      </w:pPr>
+      <w:rPr>
+        <w:rFonts w:ascii="Wingdings" w:hAnsi="Wingdings" w:hint="default"/>
+        <w:sz w:val="20"/>
+      </w:rPr>
+    </w:lvl>
+    <w:lvl w:ilvl="6" w:tentative="1">
+      <w:start w:val="1"/>
+      <w:numFmt w:val="bullet"/>
+      <w:lvlText w:val=""/>
+      <w:lvlJc w:val="left"/>
+      <w:pPr>
+        <w:tabs>
+          <w:tab w:val="num" w:pos="5040"/>
+        </w:tabs>
+        <w:ind w:left="5040" w:hanging="360"/>
+      </w:pPr>
+      <w:rPr>
+        <w:rFonts w:ascii="Wingdings" w:hAnsi="Wingdings" w:hint="default"/>
+        <w:sz w:val="20"/>
+      </w:rPr>
+    </w:lvl>
+    <w:lvl w:ilvl="7" w:tentative="1">
+      <w:start w:val="1"/>
+      <w:numFmt w:val="bullet"/>
+      <w:lvlText w:val=""/>
+      <w:lvlJc w:val="left"/>
+      <w:pPr>
+        <w:tabs>
+          <w:tab w:val="num" w:pos="5760"/>
+        </w:tabs>
+        <w:ind w:left="5760" w:hanging="360"/>
+      </w:pPr>
+      <w:rPr>
+        <w:rFonts w:ascii="Wingdings" w:hAnsi="Wingdings" w:hint="default"/>
+        <w:sz w:val="20"/>
+      </w:rPr>
+    </w:lvl>
+    <w:lvl w:ilvl="8" w:tentative="1">
+      <w:start w:val="1"/>
+      <w:numFmt w:val="bullet"/>
+      <w:lvlText w:val=""/>
+      <w:lvlJc w:val="left"/>
+      <w:pPr>
+        <w:tabs>
+          <w:tab w:val="num" w:pos="6480"/>
+        </w:tabs>
+        <w:ind w:left="6480" w:hanging="360"/>
+      </w:pPr>
+      <w:rPr>
+        <w:rFonts w:ascii="Wingdings" w:hAnsi="Wingdings" w:hint="default"/>
+        <w:sz w:val="20"/>
+      </w:rPr>
+    </w:lvl>
+  </w:abstractNum>
+  <w:abstractNum w:abstractNumId="28" w15:restartNumberingAfterBreak="0">
     <w:nsid w:val="3C0A15DB"/>
     <w:multiLevelType w:val="multilevel"/>
     <w:tmpl w:val="37D2E100"/>
@@ -23376,7 +24469,7 @@
       </w:pPr>
     </w:lvl>
   </w:abstractNum>
-  <w:abstractNum w:abstractNumId="28" w15:restartNumberingAfterBreak="0">
+  <w:abstractNum w:abstractNumId="29" w15:restartNumberingAfterBreak="0">
     <w:nsid w:val="3C2F0B4C"/>
     <w:multiLevelType w:val="multilevel"/>
     <w:tmpl w:val="367ED02E"/>
@@ -23525,7 +24618,156 @@
       </w:rPr>
     </w:lvl>
   </w:abstractNum>
-  <w:abstractNum w:abstractNumId="29" w15:restartNumberingAfterBreak="0">
+  <w:abstractNum w:abstractNumId="30" w15:restartNumberingAfterBreak="0">
+    <w:nsid w:val="3CAE1D1E"/>
+    <w:multiLevelType w:val="multilevel"/>
+    <w:tmpl w:val="6708256C"/>
+    <w:lvl w:ilvl="0">
+      <w:start w:val="1"/>
+      <w:numFmt w:val="bullet"/>
+      <w:lvlText w:val=""/>
+      <w:lvlJc w:val="left"/>
+      <w:pPr>
+        <w:tabs>
+          <w:tab w:val="num" w:pos="720"/>
+        </w:tabs>
+        <w:ind w:left="720" w:hanging="360"/>
+      </w:pPr>
+      <w:rPr>
+        <w:rFonts w:ascii="Symbol" w:hAnsi="Symbol" w:hint="default"/>
+        <w:sz w:val="20"/>
+      </w:rPr>
+    </w:lvl>
+    <w:lvl w:ilvl="1">
+      <w:start w:val="1"/>
+      <w:numFmt w:val="bullet"/>
+      <w:lvlText w:val="o"/>
+      <w:lvlJc w:val="left"/>
+      <w:pPr>
+        <w:tabs>
+          <w:tab w:val="num" w:pos="1440"/>
+        </w:tabs>
+        <w:ind w:left="1440" w:hanging="360"/>
+      </w:pPr>
+      <w:rPr>
+        <w:rFonts w:ascii="Courier New" w:hAnsi="Courier New" w:hint="default"/>
+        <w:sz w:val="20"/>
+      </w:rPr>
+    </w:lvl>
+    <w:lvl w:ilvl="2" w:tentative="1">
+      <w:start w:val="1"/>
+      <w:numFmt w:val="bullet"/>
+      <w:lvlText w:val=""/>
+      <w:lvlJc w:val="left"/>
+      <w:pPr>
+        <w:tabs>
+          <w:tab w:val="num" w:pos="2160"/>
+        </w:tabs>
+        <w:ind w:left="2160" w:hanging="360"/>
+      </w:pPr>
+      <w:rPr>
+        <w:rFonts w:ascii="Wingdings" w:hAnsi="Wingdings" w:hint="default"/>
+        <w:sz w:val="20"/>
+      </w:rPr>
+    </w:lvl>
+    <w:lvl w:ilvl="3" w:tentative="1">
+      <w:start w:val="1"/>
+      <w:numFmt w:val="bullet"/>
+      <w:lvlText w:val=""/>
+      <w:lvlJc w:val="left"/>
+      <w:pPr>
+        <w:tabs>
+          <w:tab w:val="num" w:pos="2880"/>
+        </w:tabs>
+        <w:ind w:left="2880" w:hanging="360"/>
+      </w:pPr>
+      <w:rPr>
+        <w:rFonts w:ascii="Wingdings" w:hAnsi="Wingdings" w:hint="default"/>
+        <w:sz w:val="20"/>
+      </w:rPr>
+    </w:lvl>
+    <w:lvl w:ilvl="4" w:tentative="1">
+      <w:start w:val="1"/>
+      <w:numFmt w:val="bullet"/>
+      <w:lvlText w:val=""/>
+      <w:lvlJc w:val="left"/>
+      <w:pPr>
+        <w:tabs>
+          <w:tab w:val="num" w:pos="3600"/>
+        </w:tabs>
+        <w:ind w:left="3600" w:hanging="360"/>
+      </w:pPr>
+      <w:rPr>
+        <w:rFonts w:ascii="Wingdings" w:hAnsi="Wingdings" w:hint="default"/>
+        <w:sz w:val="20"/>
+      </w:rPr>
+    </w:lvl>
+    <w:lvl w:ilvl="5" w:tentative="1">
+      <w:start w:val="1"/>
+      <w:numFmt w:val="bullet"/>
+      <w:lvlText w:val=""/>
+      <w:lvlJc w:val="left"/>
+      <w:pPr>
+        <w:tabs>
+          <w:tab w:val="num" w:pos="4320"/>
+        </w:tabs>
+        <w:ind w:left="4320" w:hanging="360"/>
+      </w:pPr>
+      <w:rPr>
+        <w:rFonts w:ascii="Wingdings" w:hAnsi="Wingdings" w:hint="default"/>
+        <w:sz w:val="20"/>
+      </w:rPr>
+    </w:lvl>
+    <w:lvl w:ilvl="6" w:tentative="1">
+      <w:start w:val="1"/>
+      <w:numFmt w:val="bullet"/>
+      <w:lvlText w:val=""/>
+      <w:lvlJc w:val="left"/>
+      <w:pPr>
+        <w:tabs>
+          <w:tab w:val="num" w:pos="5040"/>
+        </w:tabs>
+        <w:ind w:left="5040" w:hanging="360"/>
+      </w:pPr>
+      <w:rPr>
+        <w:rFonts w:ascii="Wingdings" w:hAnsi="Wingdings" w:hint="default"/>
+        <w:sz w:val="20"/>
+      </w:rPr>
+    </w:lvl>
+    <w:lvl w:ilvl="7" w:tentative="1">
+      <w:start w:val="1"/>
+      <w:numFmt w:val="bullet"/>
+      <w:lvlText w:val=""/>
+      <w:lvlJc w:val="left"/>
+      <w:pPr>
+        <w:tabs>
+          <w:tab w:val="num" w:pos="5760"/>
+        </w:tabs>
+        <w:ind w:left="5760" w:hanging="360"/>
+      </w:pPr>
+      <w:rPr>
+        <w:rFonts w:ascii="Wingdings" w:hAnsi="Wingdings" w:hint="default"/>
+        <w:sz w:val="20"/>
+      </w:rPr>
+    </w:lvl>
+    <w:lvl w:ilvl="8" w:tentative="1">
+      <w:start w:val="1"/>
+      <w:numFmt w:val="bullet"/>
+      <w:lvlText w:val=""/>
+      <w:lvlJc w:val="left"/>
+      <w:pPr>
+        <w:tabs>
+          <w:tab w:val="num" w:pos="6480"/>
+        </w:tabs>
+        <w:ind w:left="6480" w:hanging="360"/>
+      </w:pPr>
+      <w:rPr>
+        <w:rFonts w:ascii="Wingdings" w:hAnsi="Wingdings" w:hint="default"/>
+        <w:sz w:val="20"/>
+      </w:rPr>
+    </w:lvl>
+  </w:abstractNum>
+  <w:abstractNum w:abstractNumId="31" w15:restartNumberingAfterBreak="0">
     <w:nsid w:val="3F863886"/>
     <w:multiLevelType w:val="multilevel"/>
     <w:tmpl w:val="3A9A968E"/>
@@ -23674,7 +24916,7 @@
       </w:rPr>
     </w:lvl>
   </w:abstractNum>
-  <w:abstractNum w:abstractNumId="30" w15:restartNumberingAfterBreak="0">
+  <w:abstractNum w:abstractNumId="32" w15:restartNumberingAfterBreak="0">
     <w:nsid w:val="4002476B"/>
     <w:multiLevelType w:val="multilevel"/>
     <w:tmpl w:val="49686E1E"/>
@@ -23787,7 +25029,305 @@
       </w:pPr>
     </w:lvl>
   </w:abstractNum>
-  <w:abstractNum w:abstractNumId="31" w15:restartNumberingAfterBreak="0">
+  <w:abstractNum w:abstractNumId="33" w15:restartNumberingAfterBreak="0">
+    <w:nsid w:val="40D4515C"/>
+    <w:multiLevelType w:val="multilevel"/>
+    <w:tmpl w:val="E4BC7D34"/>
+    <w:lvl w:ilvl="0">
+      <w:start w:val="1"/>
+      <w:numFmt w:val="bullet"/>
+      <w:lvlText w:val=""/>
+      <w:lvlJc w:val="left"/>
+      <w:pPr>
+        <w:tabs>
+          <w:tab w:val="num" w:pos="720"/>
+        </w:tabs>
+        <w:ind w:left="720" w:hanging="360"/>
+      </w:pPr>
+      <w:rPr>
+        <w:rFonts w:ascii="Symbol" w:hAnsi="Symbol" w:hint="default"/>
+        <w:sz w:val="20"/>
+      </w:rPr>
+    </w:lvl>
+    <w:lvl w:ilvl="1" w:tentative="1">
+      <w:start w:val="1"/>
+      <w:numFmt w:val="bullet"/>
+      <w:lvlText w:val="o"/>
+      <w:lvlJc w:val="left"/>
+      <w:pPr>
+        <w:tabs>
+          <w:tab w:val="num" w:pos="1440"/>
+        </w:tabs>
+        <w:ind w:left="1440" w:hanging="360"/>
+      </w:pPr>
+      <w:rPr>
+        <w:rFonts w:ascii="Courier New" w:hAnsi="Courier New" w:hint="default"/>
+        <w:sz w:val="20"/>
+      </w:rPr>
+    </w:lvl>
+    <w:lvl w:ilvl="2" w:tentative="1">
+      <w:start w:val="1"/>
+      <w:numFmt w:val="bullet"/>
+      <w:lvlText w:val=""/>
+      <w:lvlJc w:val="left"/>
+      <w:pPr>
+        <w:tabs>
+          <w:tab w:val="num" w:pos="2160"/>
+        </w:tabs>
+        <w:ind w:left="2160" w:hanging="360"/>
+      </w:pPr>
+      <w:rPr>
+        <w:rFonts w:ascii="Wingdings" w:hAnsi="Wingdings" w:hint="default"/>
+        <w:sz w:val="20"/>
+      </w:rPr>
+    </w:lvl>
+    <w:lvl w:ilvl="3" w:tentative="1">
+      <w:start w:val="1"/>
+      <w:numFmt w:val="bullet"/>
+      <w:lvlText w:val=""/>
+      <w:lvlJc w:val="left"/>
+      <w:pPr>
+        <w:tabs>
+          <w:tab w:val="num" w:pos="2880"/>
+        </w:tabs>
+        <w:ind w:left="2880" w:hanging="360"/>
+      </w:pPr>
+      <w:rPr>
+        <w:rFonts w:ascii="Wingdings" w:hAnsi="Wingdings" w:hint="default"/>
+        <w:sz w:val="20"/>
+      </w:rPr>
+    </w:lvl>
+    <w:lvl w:ilvl="4" w:tentative="1">
+      <w:start w:val="1"/>
+      <w:numFmt w:val="bullet"/>
+      <w:lvlText w:val=""/>
+      <w:lvlJc w:val="left"/>
+      <w:pPr>
+        <w:tabs>
+          <w:tab w:val="num" w:pos="3600"/>
+        </w:tabs>
+        <w:ind w:left="3600" w:hanging="360"/>
+      </w:pPr>
+      <w:rPr>
+        <w:rFonts w:ascii="Wingdings" w:hAnsi="Wingdings" w:hint="default"/>
+        <w:sz w:val="20"/>
+      </w:rPr>
+    </w:lvl>
+    <w:lvl w:ilvl="5" w:tentative="1">
+      <w:start w:val="1"/>
+      <w:numFmt w:val="bullet"/>
+      <w:lvlText w:val=""/>
+      <w:lvlJc w:val="left"/>
+      <w:pPr>
+        <w:tabs>
+          <w:tab w:val="num" w:pos="4320"/>
+        </w:tabs>
+        <w:ind w:left="4320" w:hanging="360"/>
+      </w:pPr>
+      <w:rPr>
+        <w:rFonts w:ascii="Wingdings" w:hAnsi="Wingdings" w:hint="default"/>
+        <w:sz w:val="20"/>
+      </w:rPr>
+    </w:lvl>
+    <w:lvl w:ilvl="6" w:tentative="1">
+      <w:start w:val="1"/>
+      <w:numFmt w:val="bullet"/>
+      <w:lvlText w:val=""/>
+      <w:lvlJc w:val="left"/>
+      <w:pPr>
+        <w:tabs>
+          <w:tab w:val="num" w:pos="5040"/>
+        </w:tabs>
+        <w:ind w:left="5040" w:hanging="360"/>
+      </w:pPr>
+      <w:rPr>
+        <w:rFonts w:ascii="Wingdings" w:hAnsi="Wingdings" w:hint="default"/>
+        <w:sz w:val="20"/>
+      </w:rPr>
+    </w:lvl>
+    <w:lvl w:ilvl="7" w:tentative="1">
+      <w:start w:val="1"/>
+      <w:numFmt w:val="bullet"/>
+      <w:lvlText w:val=""/>
+      <w:lvlJc w:val="left"/>
+      <w:pPr>
+        <w:tabs>
+          <w:tab w:val="num" w:pos="5760"/>
+        </w:tabs>
+        <w:ind w:left="5760" w:hanging="360"/>
+      </w:pPr>
+      <w:rPr>
+        <w:rFonts w:ascii="Wingdings" w:hAnsi="Wingdings" w:hint="default"/>
+        <w:sz w:val="20"/>
+      </w:rPr>
+    </w:lvl>
+    <w:lvl w:ilvl="8" w:tentative="1">
+      <w:start w:val="1"/>
+      <w:numFmt w:val="bullet"/>
+      <w:lvlText w:val=""/>
+      <w:lvlJc w:val="left"/>
+      <w:pPr>
+        <w:tabs>
+          <w:tab w:val="num" w:pos="6480"/>
+        </w:tabs>
+        <w:ind w:left="6480" w:hanging="360"/>
+      </w:pPr>
+      <w:rPr>
+        <w:rFonts w:ascii="Wingdings" w:hAnsi="Wingdings" w:hint="default"/>
+        <w:sz w:val="20"/>
+      </w:rPr>
+    </w:lvl>
+  </w:abstractNum>
+  <w:abstractNum w:abstractNumId="34" w15:restartNumberingAfterBreak="0">
+    <w:nsid w:val="421F5D1D"/>
+    <w:multiLevelType w:val="multilevel"/>
+    <w:tmpl w:val="E9D04E84"/>
+    <w:lvl w:ilvl="0">
+      <w:start w:val="1"/>
+      <w:numFmt w:val="bullet"/>
+      <w:lvlText w:val=""/>
+      <w:lvlJc w:val="left"/>
+      <w:pPr>
+        <w:tabs>
+          <w:tab w:val="num" w:pos="720"/>
+        </w:tabs>
+        <w:ind w:left="720" w:hanging="360"/>
+      </w:pPr>
+      <w:rPr>
+        <w:rFonts w:ascii="Symbol" w:hAnsi="Symbol" w:hint="default"/>
+        <w:sz w:val="20"/>
+      </w:rPr>
+    </w:lvl>
+    <w:lvl w:ilvl="1" w:tentative="1">
+      <w:start w:val="1"/>
+      <w:numFmt w:val="bullet"/>
+      <w:lvlText w:val=""/>
+      <w:lvlJc w:val="left"/>
+      <w:pPr>
+        <w:tabs>
+          <w:tab w:val="num" w:pos="1440"/>
+        </w:tabs>
+        <w:ind w:left="1440" w:hanging="360"/>
+      </w:pPr>
+      <w:rPr>
+        <w:rFonts w:ascii="Symbol" w:hAnsi="Symbol" w:hint="default"/>
+        <w:sz w:val="20"/>
+      </w:rPr>
+    </w:lvl>
+    <w:lvl w:ilvl="2" w:tentative="1">
+      <w:start w:val="1"/>
+      <w:numFmt w:val="bullet"/>
+      <w:lvlText w:val=""/>
+      <w:lvlJc w:val="left"/>
+      <w:pPr>
+        <w:tabs>
+          <w:tab w:val="num" w:pos="2160"/>
+        </w:tabs>
+        <w:ind w:left="2160" w:hanging="360"/>
+      </w:pPr>
+      <w:rPr>
+        <w:rFonts w:ascii="Symbol" w:hAnsi="Symbol" w:hint="default"/>
+        <w:sz w:val="20"/>
+      </w:rPr>
+    </w:lvl>
+    <w:lvl w:ilvl="3" w:tentative="1">
+      <w:start w:val="1"/>
+      <w:numFmt w:val="bullet"/>
+      <w:lvlText w:val=""/>
+      <w:lvlJc w:val="left"/>
+      <w:pPr>
+        <w:tabs>
+          <w:tab w:val="num" w:pos="2880"/>
+        </w:tabs>
+        <w:ind w:left="2880" w:hanging="360"/>
+      </w:pPr>
+      <w:rPr>
+        <w:rFonts w:ascii="Symbol" w:hAnsi="Symbol" w:hint="default"/>
+        <w:sz w:val="20"/>
+      </w:rPr>
+    </w:lvl>
+    <w:lvl w:ilvl="4" w:tentative="1">
+      <w:start w:val="1"/>
+      <w:numFmt w:val="bullet"/>
+      <w:lvlText w:val=""/>
+      <w:lvlJc w:val="left"/>
+      <w:pPr>
+        <w:tabs>
+          <w:tab w:val="num" w:pos="3600"/>
+        </w:tabs>
+        <w:ind w:left="3600" w:hanging="360"/>
+      </w:pPr>
+      <w:rPr>
+        <w:rFonts w:ascii="Symbol" w:hAnsi="Symbol" w:hint="default"/>
+        <w:sz w:val="20"/>
+      </w:rPr>
+    </w:lvl>
+    <w:lvl w:ilvl="5" w:tentative="1">
+      <w:start w:val="1"/>
+      <w:numFmt w:val="bullet"/>
+      <w:lvlText w:val=""/>
+      <w:lvlJc w:val="left"/>
+      <w:pPr>
+        <w:tabs>
+          <w:tab w:val="num" w:pos="4320"/>
+        </w:tabs>
+        <w:ind w:left="4320" w:hanging="360"/>
+      </w:pPr>
+      <w:rPr>
+        <w:rFonts w:ascii="Symbol" w:hAnsi="Symbol" w:hint="default"/>
+        <w:sz w:val="20"/>
+      </w:rPr>
+    </w:lvl>
+    <w:lvl w:ilvl="6" w:tentative="1">
+      <w:start w:val="1"/>
+      <w:numFmt w:val="bullet"/>
+      <w:lvlText w:val=""/>
+      <w:lvlJc w:val="left"/>
+      <w:pPr>
+        <w:tabs>
+          <w:tab w:val="num" w:pos="5040"/>
+        </w:tabs>
+        <w:ind w:left="5040" w:hanging="360"/>
+      </w:pPr>
+      <w:rPr>
+        <w:rFonts w:ascii="Symbol" w:hAnsi="Symbol" w:hint="default"/>
+        <w:sz w:val="20"/>
+      </w:rPr>
+    </w:lvl>
+    <w:lvl w:ilvl="7" w:tentative="1">
+      <w:start w:val="1"/>
+      <w:numFmt w:val="bullet"/>
+      <w:lvlText w:val=""/>
+      <w:lvlJc w:val="left"/>
+      <w:pPr>
+        <w:tabs>
+          <w:tab w:val="num" w:pos="5760"/>
+        </w:tabs>
+        <w:ind w:left="5760" w:hanging="360"/>
+      </w:pPr>
+      <w:rPr>
+        <w:rFonts w:ascii="Symbol" w:hAnsi="Symbol" w:hint="default"/>
+        <w:sz w:val="20"/>
+      </w:rPr>
+    </w:lvl>
+    <w:lvl w:ilvl="8" w:tentative="1">
+      <w:start w:val="1"/>
+      <w:numFmt w:val="bullet"/>
+      <w:lvlText w:val=""/>
+      <w:lvlJc w:val="left"/>
+      <w:pPr>
+        <w:tabs>
+          <w:tab w:val="num" w:pos="6480"/>
+        </w:tabs>
+        <w:ind w:left="6480" w:hanging="360"/>
+      </w:pPr>
+      <w:rPr>
+        <w:rFonts w:ascii="Symbol" w:hAnsi="Symbol" w:hint="default"/>
+        <w:sz w:val="20"/>
+      </w:rPr>
+    </w:lvl>
+  </w:abstractNum>
+  <w:abstractNum w:abstractNumId="35" w15:restartNumberingAfterBreak="0">
     <w:nsid w:val="43543C6C"/>
     <w:multiLevelType w:val="hybridMultilevel"/>
     <w:tmpl w:val="7672887E"/>
@@ -23873,7 +25413,7 @@
       </w:pPr>
     </w:lvl>
   </w:abstractNum>
-  <w:abstractNum w:abstractNumId="32" w15:restartNumberingAfterBreak="0">
+  <w:abstractNum w:abstractNumId="36" w15:restartNumberingAfterBreak="0">
     <w:nsid w:val="43931F02"/>
     <w:multiLevelType w:val="hybridMultilevel"/>
     <w:tmpl w:val="8C4CB21C"/>
@@ -23959,7 +25499,7 @@
       </w:pPr>
     </w:lvl>
   </w:abstractNum>
-  <w:abstractNum w:abstractNumId="33" w15:restartNumberingAfterBreak="0">
+  <w:abstractNum w:abstractNumId="37" w15:restartNumberingAfterBreak="0">
     <w:nsid w:val="442325D7"/>
     <w:multiLevelType w:val="multilevel"/>
     <w:tmpl w:val="C1B26A3A"/>
@@ -24108,7 +25648,7 @@
       </w:rPr>
     </w:lvl>
   </w:abstractNum>
-  <w:abstractNum w:abstractNumId="34" w15:restartNumberingAfterBreak="0">
+  <w:abstractNum w:abstractNumId="38" w15:restartNumberingAfterBreak="0">
     <w:nsid w:val="45B31785"/>
     <w:multiLevelType w:val="hybridMultilevel"/>
     <w:tmpl w:val="B9904A58"/>
@@ -24194,7 +25734,7 @@
       </w:pPr>
     </w:lvl>
   </w:abstractNum>
-  <w:abstractNum w:abstractNumId="35" w15:restartNumberingAfterBreak="0">
+  <w:abstractNum w:abstractNumId="39" w15:restartNumberingAfterBreak="0">
     <w:nsid w:val="4A1C6796"/>
     <w:multiLevelType w:val="multilevel"/>
     <w:tmpl w:val="711A5EC0"/>
@@ -24343,7 +25883,7 @@
       </w:rPr>
     </w:lvl>
   </w:abstractNum>
-  <w:abstractNum w:abstractNumId="36" w15:restartNumberingAfterBreak="0">
+  <w:abstractNum w:abstractNumId="40" w15:restartNumberingAfterBreak="0">
     <w:nsid w:val="4B681D31"/>
     <w:multiLevelType w:val="multilevel"/>
     <w:tmpl w:val="46B04396"/>
@@ -24492,7 +26032,7 @@
       </w:rPr>
     </w:lvl>
   </w:abstractNum>
-  <w:abstractNum w:abstractNumId="37" w15:restartNumberingAfterBreak="0">
+  <w:abstractNum w:abstractNumId="41" w15:restartNumberingAfterBreak="0">
     <w:nsid w:val="4D70002D"/>
     <w:multiLevelType w:val="multilevel"/>
     <w:tmpl w:val="F96C340E"/>
@@ -24641,7 +26181,156 @@
       </w:rPr>
     </w:lvl>
   </w:abstractNum>
-  <w:abstractNum w:abstractNumId="38" w15:restartNumberingAfterBreak="0">
+  <w:abstractNum w:abstractNumId="42" w15:restartNumberingAfterBreak="0">
+    <w:nsid w:val="52611CD1"/>
+    <w:multiLevelType w:val="multilevel"/>
+    <w:tmpl w:val="4FA84EDC"/>
+    <w:lvl w:ilvl="0">
+      <w:start w:val="1"/>
+      <w:numFmt w:val="bullet"/>
+      <w:lvlText w:val=""/>
+      <w:lvlJc w:val="left"/>
+      <w:pPr>
+        <w:tabs>
+          <w:tab w:val="num" w:pos="720"/>
+        </w:tabs>
+        <w:ind w:left="720" w:hanging="360"/>
+      </w:pPr>
+      <w:rPr>
+        <w:rFonts w:ascii="Symbol" w:hAnsi="Symbol" w:hint="default"/>
+        <w:sz w:val="20"/>
+      </w:rPr>
+    </w:lvl>
+    <w:lvl w:ilvl="1" w:tentative="1">
+      <w:start w:val="1"/>
+      <w:numFmt w:val="bullet"/>
+      <w:lvlText w:val=""/>
+      <w:lvlJc w:val="left"/>
+      <w:pPr>
+        <w:tabs>
+          <w:tab w:val="num" w:pos="1440"/>
+        </w:tabs>
+        <w:ind w:left="1440" w:hanging="360"/>
+      </w:pPr>
+      <w:rPr>
+        <w:rFonts w:ascii="Symbol" w:hAnsi="Symbol" w:hint="default"/>
+        <w:sz w:val="20"/>
+      </w:rPr>
+    </w:lvl>
+    <w:lvl w:ilvl="2" w:tentative="1">
+      <w:start w:val="1"/>
+      <w:numFmt w:val="bullet"/>
+      <w:lvlText w:val=""/>
+      <w:lvlJc w:val="left"/>
+      <w:pPr>
+        <w:tabs>
+          <w:tab w:val="num" w:pos="2160"/>
+        </w:tabs>
+        <w:ind w:left="2160" w:hanging="360"/>
+      </w:pPr>
+      <w:rPr>
+        <w:rFonts w:ascii="Symbol" w:hAnsi="Symbol" w:hint="default"/>
+        <w:sz w:val="20"/>
+      </w:rPr>
+    </w:lvl>
+    <w:lvl w:ilvl="3" w:tentative="1">
+      <w:start w:val="1"/>
+      <w:numFmt w:val="bullet"/>
+      <w:lvlText w:val=""/>
+      <w:lvlJc w:val="left"/>
+      <w:pPr>
+        <w:tabs>
+          <w:tab w:val="num" w:pos="2880"/>
+        </w:tabs>
+        <w:ind w:left="2880" w:hanging="360"/>
+      </w:pPr>
+      <w:rPr>
+        <w:rFonts w:ascii="Symbol" w:hAnsi="Symbol" w:hint="default"/>
+        <w:sz w:val="20"/>
+      </w:rPr>
+    </w:lvl>
+    <w:lvl w:ilvl="4" w:tentative="1">
+      <w:start w:val="1"/>
+      <w:numFmt w:val="bullet"/>
+      <w:lvlText w:val=""/>
+      <w:lvlJc w:val="left"/>
+      <w:pPr>
+        <w:tabs>
+          <w:tab w:val="num" w:pos="3600"/>
+        </w:tabs>
+        <w:ind w:left="3600" w:hanging="360"/>
+      </w:pPr>
+      <w:rPr>
+        <w:rFonts w:ascii="Symbol" w:hAnsi="Symbol" w:hint="default"/>
+        <w:sz w:val="20"/>
+      </w:rPr>
+    </w:lvl>
+    <w:lvl w:ilvl="5" w:tentative="1">
+      <w:start w:val="1"/>
+      <w:numFmt w:val="bullet"/>
+      <w:lvlText w:val=""/>
+      <w:lvlJc w:val="left"/>
+      <w:pPr>
+        <w:tabs>
+          <w:tab w:val="num" w:pos="4320"/>
+        </w:tabs>
+        <w:ind w:left="4320" w:hanging="360"/>
+      </w:pPr>
+      <w:rPr>
+        <w:rFonts w:ascii="Symbol" w:hAnsi="Symbol" w:hint="default"/>
+        <w:sz w:val="20"/>
+      </w:rPr>
+    </w:lvl>
+    <w:lvl w:ilvl="6" w:tentative="1">
+      <w:start w:val="1"/>
+      <w:numFmt w:val="bullet"/>
+      <w:lvlText w:val=""/>
+      <w:lvlJc w:val="left"/>
+      <w:pPr>
+        <w:tabs>
+          <w:tab w:val="num" w:pos="5040"/>
+        </w:tabs>
+        <w:ind w:left="5040" w:hanging="360"/>
+      </w:pPr>
+      <w:rPr>
+        <w:rFonts w:ascii="Symbol" w:hAnsi="Symbol" w:hint="default"/>
+        <w:sz w:val="20"/>
+      </w:rPr>
+    </w:lvl>
+    <w:lvl w:ilvl="7" w:tentative="1">
+      <w:start w:val="1"/>
+      <w:numFmt w:val="bullet"/>
+      <w:lvlText w:val=""/>
+      <w:lvlJc w:val="left"/>
+      <w:pPr>
+        <w:tabs>
+          <w:tab w:val="num" w:pos="5760"/>
+        </w:tabs>
+        <w:ind w:left="5760" w:hanging="360"/>
+      </w:pPr>
+      <w:rPr>
+        <w:rFonts w:ascii="Symbol" w:hAnsi="Symbol" w:hint="default"/>
+        <w:sz w:val="20"/>
+      </w:rPr>
+    </w:lvl>
+    <w:lvl w:ilvl="8" w:tentative="1">
+      <w:start w:val="1"/>
+      <w:numFmt w:val="bullet"/>
+      <w:lvlText w:val=""/>
+      <w:lvlJc w:val="left"/>
+      <w:pPr>
+        <w:tabs>
+          <w:tab w:val="num" w:pos="6480"/>
+        </w:tabs>
+        <w:ind w:left="6480" w:hanging="360"/>
+      </w:pPr>
+      <w:rPr>
+        <w:rFonts w:ascii="Symbol" w:hAnsi="Symbol" w:hint="default"/>
+        <w:sz w:val="20"/>
+      </w:rPr>
+    </w:lvl>
+  </w:abstractNum>
+  <w:abstractNum w:abstractNumId="43" w15:restartNumberingAfterBreak="0">
     <w:nsid w:val="5768081B"/>
     <w:multiLevelType w:val="multilevel"/>
     <w:tmpl w:val="2FE48E7E"/>
@@ -24790,7 +26479,7 @@
       </w:rPr>
     </w:lvl>
   </w:abstractNum>
-  <w:abstractNum w:abstractNumId="39" w15:restartNumberingAfterBreak="0">
+  <w:abstractNum w:abstractNumId="44" w15:restartNumberingAfterBreak="0">
     <w:nsid w:val="57952F79"/>
     <w:multiLevelType w:val="multilevel"/>
     <w:tmpl w:val="E42AC89E"/>
@@ -24939,7 +26628,7 @@
       </w:rPr>
     </w:lvl>
   </w:abstractNum>
-  <w:abstractNum w:abstractNumId="40" w15:restartNumberingAfterBreak="0">
+  <w:abstractNum w:abstractNumId="45" w15:restartNumberingAfterBreak="0">
     <w:nsid w:val="590D0B12"/>
     <w:multiLevelType w:val="multilevel"/>
     <w:tmpl w:val="CD085B1E"/>
@@ -25088,7 +26777,7 @@
       </w:rPr>
     </w:lvl>
   </w:abstractNum>
-  <w:abstractNum w:abstractNumId="41" w15:restartNumberingAfterBreak="0">
+  <w:abstractNum w:abstractNumId="46" w15:restartNumberingAfterBreak="0">
     <w:nsid w:val="5BB50446"/>
     <w:multiLevelType w:val="hybridMultilevel"/>
     <w:tmpl w:val="1CB261B0"/>
@@ -25174,7 +26863,7 @@
       </w:pPr>
     </w:lvl>
   </w:abstractNum>
-  <w:abstractNum w:abstractNumId="42" w15:restartNumberingAfterBreak="0">
+  <w:abstractNum w:abstractNumId="47" w15:restartNumberingAfterBreak="0">
     <w:nsid w:val="5DE0359F"/>
     <w:multiLevelType w:val="multilevel"/>
     <w:tmpl w:val="929CD726"/>
@@ -25323,7 +27012,7 @@
       </w:rPr>
     </w:lvl>
   </w:abstractNum>
-  <w:abstractNum w:abstractNumId="43" w15:restartNumberingAfterBreak="0">
+  <w:abstractNum w:abstractNumId="48" w15:restartNumberingAfterBreak="0">
     <w:nsid w:val="5EAF2DAB"/>
     <w:multiLevelType w:val="multilevel"/>
     <w:tmpl w:val="5EEE3AA8"/>
@@ -25472,7 +27161,7 @@
       </w:rPr>
     </w:lvl>
   </w:abstractNum>
-  <w:abstractNum w:abstractNumId="44" w15:restartNumberingAfterBreak="0">
+  <w:abstractNum w:abstractNumId="49" w15:restartNumberingAfterBreak="0">
     <w:nsid w:val="5FB73C71"/>
     <w:multiLevelType w:val="multilevel"/>
     <w:tmpl w:val="8C3C7C60"/>
@@ -25609,7 +27298,7 @@
       </w:rPr>
     </w:lvl>
   </w:abstractNum>
-  <w:abstractNum w:abstractNumId="45" w15:restartNumberingAfterBreak="0">
+  <w:abstractNum w:abstractNumId="50" w15:restartNumberingAfterBreak="0">
     <w:nsid w:val="61456256"/>
     <w:multiLevelType w:val="multilevel"/>
     <w:tmpl w:val="AA340FD0"/>
@@ -25758,7 +27447,7 @@
       </w:rPr>
     </w:lvl>
   </w:abstractNum>
-  <w:abstractNum w:abstractNumId="46" w15:restartNumberingAfterBreak="0">
+  <w:abstractNum w:abstractNumId="51" w15:restartNumberingAfterBreak="0">
     <w:nsid w:val="61FD61DF"/>
     <w:multiLevelType w:val="multilevel"/>
     <w:tmpl w:val="D8A2496A"/>
@@ -25907,7 +27596,7 @@
       </w:rPr>
     </w:lvl>
   </w:abstractNum>
-  <w:abstractNum w:abstractNumId="47" w15:restartNumberingAfterBreak="0">
+  <w:abstractNum w:abstractNumId="52" w15:restartNumberingAfterBreak="0">
     <w:nsid w:val="640B4AB8"/>
     <w:multiLevelType w:val="multilevel"/>
     <w:tmpl w:val="54F0E096"/>
@@ -26056,7 +27745,7 @@
       </w:rPr>
     </w:lvl>
   </w:abstractNum>
-  <w:abstractNum w:abstractNumId="48" w15:restartNumberingAfterBreak="0">
+  <w:abstractNum w:abstractNumId="53" w15:restartNumberingAfterBreak="0">
     <w:nsid w:val="68B1148C"/>
     <w:multiLevelType w:val="multilevel"/>
     <w:tmpl w:val="C4906C1C"/>
@@ -26205,7 +27894,7 @@
       </w:rPr>
     </w:lvl>
   </w:abstractNum>
-  <w:abstractNum w:abstractNumId="49" w15:restartNumberingAfterBreak="0">
+  <w:abstractNum w:abstractNumId="54" w15:restartNumberingAfterBreak="0">
     <w:nsid w:val="699E1BE1"/>
     <w:multiLevelType w:val="multilevel"/>
     <w:tmpl w:val="93D4C22E"/>
@@ -26354,7 +28043,7 @@
       </w:rPr>
     </w:lvl>
   </w:abstractNum>
-  <w:abstractNum w:abstractNumId="50" w15:restartNumberingAfterBreak="0">
+  <w:abstractNum w:abstractNumId="55" w15:restartNumberingAfterBreak="0">
     <w:nsid w:val="6A395F57"/>
     <w:multiLevelType w:val="multilevel"/>
     <w:tmpl w:val="9760CE72"/>
@@ -26503,7 +28192,7 @@
       </w:rPr>
     </w:lvl>
   </w:abstractNum>
-  <w:abstractNum w:abstractNumId="51" w15:restartNumberingAfterBreak="0">
+  <w:abstractNum w:abstractNumId="56" w15:restartNumberingAfterBreak="0">
     <w:nsid w:val="6C80272C"/>
     <w:multiLevelType w:val="multilevel"/>
     <w:tmpl w:val="E3920792"/>
@@ -26652,7 +28341,7 @@
       </w:rPr>
     </w:lvl>
   </w:abstractNum>
-  <w:abstractNum w:abstractNumId="52" w15:restartNumberingAfterBreak="0">
+  <w:abstractNum w:abstractNumId="57" w15:restartNumberingAfterBreak="0">
     <w:nsid w:val="704F4FDF"/>
     <w:multiLevelType w:val="multilevel"/>
     <w:tmpl w:val="DA36E4F4"/>
@@ -26801,7 +28490,7 @@
       </w:rPr>
     </w:lvl>
   </w:abstractNum>
-  <w:abstractNum w:abstractNumId="53" w15:restartNumberingAfterBreak="0">
+  <w:abstractNum w:abstractNumId="58" w15:restartNumberingAfterBreak="0">
     <w:nsid w:val="762C5673"/>
     <w:multiLevelType w:val="multilevel"/>
     <w:tmpl w:val="6B0E7776"/>
@@ -26950,7 +28639,7 @@
       </w:rPr>
     </w:lvl>
   </w:abstractNum>
-  <w:abstractNum w:abstractNumId="54" w15:restartNumberingAfterBreak="0">
+  <w:abstractNum w:abstractNumId="59" w15:restartNumberingAfterBreak="0">
     <w:nsid w:val="7895393D"/>
     <w:multiLevelType w:val="multilevel"/>
     <w:tmpl w:val="2736AE1A"/>
@@ -27099,7 +28788,7 @@
       </w:rPr>
     </w:lvl>
   </w:abstractNum>
-  <w:abstractNum w:abstractNumId="55" w15:restartNumberingAfterBreak="0">
+  <w:abstractNum w:abstractNumId="60" w15:restartNumberingAfterBreak="0">
     <w:nsid w:val="790D452B"/>
     <w:multiLevelType w:val="multilevel"/>
     <w:tmpl w:val="6D12BB56"/>
@@ -27248,7 +28937,7 @@
       </w:rPr>
     </w:lvl>
   </w:abstractNum>
-  <w:abstractNum w:abstractNumId="56" w15:restartNumberingAfterBreak="0">
+  <w:abstractNum w:abstractNumId="61" w15:restartNumberingAfterBreak="0">
     <w:nsid w:val="7A4B670B"/>
     <w:multiLevelType w:val="multilevel"/>
     <w:tmpl w:val="99002726"/>
@@ -27398,7 +29087,7 @@
     </w:lvl>
   </w:abstractNum>
   <w:num w:numId="1" w16cid:durableId="161359147">
-    <w:abstractNumId w:val="45"/>
+    <w:abstractNumId w:val="50"/>
   </w:num>
   <w:num w:numId="2" w16cid:durableId="700282848">
     <w:abstractNumId w:val="14"/>
@@ -27413,19 +29102,19 @@
     <w:abstractNumId w:val="3"/>
   </w:num>
   <w:num w:numId="6" w16cid:durableId="1966421021">
-    <w:abstractNumId w:val="30"/>
+    <w:abstractNumId w:val="32"/>
   </w:num>
   <w:num w:numId="7" w16cid:durableId="1677226457">
     <w:abstractNumId w:val="0"/>
   </w:num>
   <w:num w:numId="8" w16cid:durableId="10617186">
-    <w:abstractNumId w:val="48"/>
+    <w:abstractNumId w:val="53"/>
   </w:num>
   <w:num w:numId="9" w16cid:durableId="350300394">
-    <w:abstractNumId w:val="29"/>
+    <w:abstractNumId w:val="31"/>
   </w:num>
   <w:num w:numId="10" w16cid:durableId="1135290385">
-    <w:abstractNumId w:val="37"/>
+    <w:abstractNumId w:val="41"/>
   </w:num>
   <w:num w:numId="11" w16cid:durableId="214975956">
     <w:abstractNumId w:val="19"/>
@@ -27434,7 +29123,7 @@
     <w:abstractNumId w:val="5"/>
   </w:num>
   <w:num w:numId="13" w16cid:durableId="620037186">
-    <w:abstractNumId w:val="55"/>
+    <w:abstractNumId w:val="60"/>
   </w:num>
   <w:num w:numId="14" w16cid:durableId="204217451">
     <w:abstractNumId w:val="8"/>
@@ -27446,7 +29135,7 @@
     <w:abstractNumId w:val="22"/>
   </w:num>
   <w:num w:numId="17" w16cid:durableId="852303013">
-    <w:abstractNumId w:val="53"/>
+    <w:abstractNumId w:val="58"/>
   </w:num>
   <w:num w:numId="18" w16cid:durableId="2022388751">
     <w:abstractNumId w:val="13"/>
@@ -27458,37 +29147,37 @@
     <w:abstractNumId w:val="15"/>
   </w:num>
   <w:num w:numId="21" w16cid:durableId="2018195374">
-    <w:abstractNumId w:val="31"/>
+    <w:abstractNumId w:val="35"/>
   </w:num>
   <w:num w:numId="22" w16cid:durableId="1159267474">
     <w:abstractNumId w:val="4"/>
   </w:num>
   <w:num w:numId="23" w16cid:durableId="1093011117">
-    <w:abstractNumId w:val="32"/>
+    <w:abstractNumId w:val="36"/>
   </w:num>
   <w:num w:numId="24" w16cid:durableId="793406066">
-    <w:abstractNumId w:val="41"/>
+    <w:abstractNumId w:val="46"/>
   </w:num>
   <w:num w:numId="25" w16cid:durableId="261690170">
-    <w:abstractNumId w:val="34"/>
+    <w:abstractNumId w:val="38"/>
   </w:num>
   <w:num w:numId="26" w16cid:durableId="1244414038">
-    <w:abstractNumId w:val="50"/>
+    <w:abstractNumId w:val="55"/>
   </w:num>
   <w:num w:numId="27" w16cid:durableId="937642480">
-    <w:abstractNumId w:val="42"/>
+    <w:abstractNumId w:val="47"/>
   </w:num>
   <w:num w:numId="28" w16cid:durableId="865294373">
-    <w:abstractNumId w:val="36"/>
+    <w:abstractNumId w:val="40"/>
   </w:num>
   <w:num w:numId="29" w16cid:durableId="1998991214">
-    <w:abstractNumId w:val="39"/>
+    <w:abstractNumId w:val="44"/>
   </w:num>
   <w:num w:numId="30" w16cid:durableId="1459907546">
     <w:abstractNumId w:val="23"/>
   </w:num>
   <w:num w:numId="31" w16cid:durableId="2030794829">
-    <w:abstractNumId w:val="46"/>
+    <w:abstractNumId w:val="51"/>
   </w:num>
   <w:num w:numId="32" w16cid:durableId="1090084409">
     <w:abstractNumId w:val="9"/>
@@ -27497,7 +29186,7 @@
     <w:abstractNumId w:val="1"/>
   </w:num>
   <w:num w:numId="34" w16cid:durableId="1748923106">
-    <w:abstractNumId w:val="49"/>
+    <w:abstractNumId w:val="54"/>
   </w:num>
   <w:num w:numId="35" w16cid:durableId="1320695716">
     <w:abstractNumId w:val="17"/>
@@ -27533,13 +29222,13 @@
     </w:lvlOverride>
   </w:num>
   <w:num w:numId="37" w16cid:durableId="732897737">
-    <w:abstractNumId w:val="35"/>
+    <w:abstractNumId w:val="39"/>
   </w:num>
   <w:num w:numId="38" w16cid:durableId="99565891">
-    <w:abstractNumId w:val="38"/>
+    <w:abstractNumId w:val="43"/>
   </w:num>
   <w:num w:numId="39" w16cid:durableId="2018997596">
-    <w:abstractNumId w:val="40"/>
+    <w:abstractNumId w:val="45"/>
   </w:num>
   <w:num w:numId="40" w16cid:durableId="1315523573">
     <w:abstractNumId w:val="24"/>
@@ -27548,31 +29237,31 @@
     <w:abstractNumId w:val="11"/>
   </w:num>
   <w:num w:numId="42" w16cid:durableId="1962690528">
-    <w:abstractNumId w:val="44"/>
+    <w:abstractNumId w:val="49"/>
   </w:num>
   <w:num w:numId="43" w16cid:durableId="848831886">
-    <w:abstractNumId w:val="47"/>
+    <w:abstractNumId w:val="52"/>
   </w:num>
   <w:num w:numId="44" w16cid:durableId="1520243688">
-    <w:abstractNumId w:val="51"/>
+    <w:abstractNumId w:val="56"/>
   </w:num>
   <w:num w:numId="45" w16cid:durableId="1569195964">
-    <w:abstractNumId w:val="43"/>
+    <w:abstractNumId w:val="48"/>
   </w:num>
   <w:num w:numId="46" w16cid:durableId="1705642442">
-    <w:abstractNumId w:val="54"/>
+    <w:abstractNumId w:val="59"/>
   </w:num>
   <w:num w:numId="47" w16cid:durableId="674572565">
     <w:abstractNumId w:val="26"/>
   </w:num>
   <w:num w:numId="48" w16cid:durableId="1968588598">
+    <w:abstractNumId w:val="29"/>
+  </w:num>
+  <w:num w:numId="49" w16cid:durableId="852573788">
     <w:abstractNumId w:val="28"/>
   </w:num>
-  <w:num w:numId="49" w16cid:durableId="852573788">
-    <w:abstractNumId w:val="27"/>
-  </w:num>
   <w:num w:numId="50" w16cid:durableId="463079264">
-    <w:abstractNumId w:val="56"/>
+    <w:abstractNumId w:val="61"/>
   </w:num>
   <w:num w:numId="51" w16cid:durableId="501163191">
     <w:abstractNumId w:val="10"/>
@@ -27581,7 +29270,7 @@
     <w:abstractNumId w:val="20"/>
   </w:num>
   <w:num w:numId="53" w16cid:durableId="1707411152">
-    <w:abstractNumId w:val="33"/>
+    <w:abstractNumId w:val="37"/>
   </w:num>
   <w:num w:numId="54" w16cid:durableId="2108574892">
     <w:abstractNumId w:val="21"/>
@@ -27593,7 +29282,7 @@
     <w:abstractNumId w:val="18"/>
   </w:num>
   <w:num w:numId="57" w16cid:durableId="1877156354">
-    <w:abstractNumId w:val="52"/>
+    <w:abstractNumId w:val="57"/>
   </w:num>
   <w:num w:numId="58" w16cid:durableId="801192420">
     <w:abstractNumId w:val="6"/>
@@ -27627,6 +29316,21 @@
     <w:lvlOverride w:ilvl="8">
       <w:startOverride w:val="1"/>
     </w:lvlOverride>
+  </w:num>
+  <w:num w:numId="60" w16cid:durableId="1795565011">
+    <w:abstractNumId w:val="27"/>
+  </w:num>
+  <w:num w:numId="61" w16cid:durableId="1316101963">
+    <w:abstractNumId w:val="33"/>
+  </w:num>
+  <w:num w:numId="62" w16cid:durableId="107553663">
+    <w:abstractNumId w:val="30"/>
+  </w:num>
+  <w:num w:numId="63" w16cid:durableId="1329945872">
+    <w:abstractNumId w:val="34"/>
+  </w:num>
+  <w:num w:numId="64" w16cid:durableId="1334339126">
+    <w:abstractNumId w:val="42"/>
   </w:num>
 </w:numbering>
 </file>
@@ -28043,7 +29747,7 @@
     <w:link w:val="Heading1Char"/>
     <w:uiPriority w:val="9"/>
     <w:qFormat/>
-    <w:rsid w:val="00D37DCD"/>
+    <w:rsid w:val="001B66F4"/>
     <w:pPr>
       <w:keepNext/>
       <w:keepLines/>
@@ -28054,9 +29758,8 @@
       <w:outlineLvl w:val="0"/>
     </w:pPr>
     <w:rPr>
-      <w:rFonts w:asciiTheme="majorHAnsi" w:eastAsiaTheme="majorEastAsia" w:hAnsiTheme="majorHAnsi" w:cstheme="majorBidi"/>
-      <w:color w:val="0F4761" w:themeColor="accent1" w:themeShade="BF"/>
-      <w:sz w:val="40"/>
+      <w:rFonts w:eastAsiaTheme="majorEastAsia" w:cstheme="majorBidi"/>
+      <w:b/>
       <w:szCs w:val="40"/>
     </w:rPr>
   </w:style>
@@ -28275,11 +29978,10 @@
     <w:basedOn w:val="DefaultParagraphFont"/>
     <w:link w:val="Heading1"/>
     <w:uiPriority w:val="9"/>
-    <w:rsid w:val="00E33566"/>
+    <w:rsid w:val="001B66F4"/>
     <w:rPr>
-      <w:rFonts w:asciiTheme="majorHAnsi" w:eastAsiaTheme="majorEastAsia" w:hAnsiTheme="majorHAnsi" w:cstheme="majorBidi"/>
-      <w:color w:val="0F4761" w:themeColor="accent1" w:themeShade="BF"/>
-      <w:sz w:val="40"/>
+      <w:rFonts w:ascii="Times New Roman" w:eastAsiaTheme="majorEastAsia" w:hAnsi="Times New Roman" w:cstheme="majorBidi"/>
+      <w:b/>
       <w:szCs w:val="40"/>
     </w:rPr>
   </w:style>

</xml_diff>

<commit_message>
feat: Add initial thesis document, new appendices detailing trust model simulations and code, and literature review content, while updating the implementation chapter and conclusions.
</commit_message>
<xml_diff>
--- a/Implementation Chapter.docx
+++ b/Implementation Chapter.docx
@@ -454,7 +454,7 @@
                     <pic:cNvPicPr/>
                   </pic:nvPicPr>
                   <pic:blipFill>
-                    <a:blip r:embed="rId7"/>
+                    <a:blip r:embed="rId8"/>
                     <a:stretch>
                       <a:fillRect/>
                     </a:stretch>
@@ -508,7 +508,7 @@
                     <pic:cNvPicPr/>
                   </pic:nvPicPr>
                   <pic:blipFill>
-                    <a:blip r:embed="rId8"/>
+                    <a:blip r:embed="rId9"/>
                     <a:stretch>
                       <a:fillRect/>
                     </a:stretch>
@@ -563,7 +563,7 @@
                     <pic:cNvPicPr/>
                   </pic:nvPicPr>
                   <pic:blipFill>
-                    <a:blip r:embed="rId9"/>
+                    <a:blip r:embed="rId10"/>
                     <a:stretch>
                       <a:fillRect/>
                     </a:stretch>
@@ -1982,7 +1982,7 @@
                     <pic:cNvPicPr/>
                   </pic:nvPicPr>
                   <pic:blipFill rotWithShape="1">
-                    <a:blip r:embed="rId10">
+                    <a:blip r:embed="rId11">
                       <a:extLst>
                         <a:ext uri="{28A0092B-C50C-407E-A947-70E740481C1C}">
                           <a14:useLocalDpi xmlns:a14="http://schemas.microsoft.com/office/drawing/2010/main" val="0"/>
@@ -2049,7 +2049,7 @@
                     <pic:cNvPicPr/>
                   </pic:nvPicPr>
                   <pic:blipFill rotWithShape="1">
-                    <a:blip r:embed="rId11">
+                    <a:blip r:embed="rId12">
                       <a:extLst>
                         <a:ext uri="{28A0092B-C50C-407E-A947-70E740481C1C}">
                           <a14:useLocalDpi xmlns:a14="http://schemas.microsoft.com/office/drawing/2010/main" val="0"/>
@@ -2391,7 +2391,7 @@
                     <pic:cNvPicPr/>
                   </pic:nvPicPr>
                   <pic:blipFill rotWithShape="1">
-                    <a:blip r:embed="rId12" cstate="print">
+                    <a:blip r:embed="rId13" cstate="print">
                       <a:extLst>
                         <a:ext uri="{28A0092B-C50C-407E-A947-70E740481C1C}">
                           <a14:useLocalDpi xmlns:a14="http://schemas.microsoft.com/office/drawing/2010/main" val="0"/>
@@ -2582,7 +2582,7 @@
                     <pic:cNvPicPr/>
                   </pic:nvPicPr>
                   <pic:blipFill>
-                    <a:blip r:embed="rId13">
+                    <a:blip r:embed="rId14">
                       <a:extLst>
                         <a:ext uri="{28A0092B-C50C-407E-A947-70E740481C1C}">
                           <a14:useLocalDpi xmlns:a14="http://schemas.microsoft.com/office/drawing/2010/main" val="0"/>
@@ -2630,7 +2630,7 @@
                     <pic:cNvPicPr/>
                   </pic:nvPicPr>
                   <pic:blipFill>
-                    <a:blip r:embed="rId14" cstate="print">
+                    <a:blip r:embed="rId15" cstate="print">
                       <a:extLst>
                         <a:ext uri="{28A0092B-C50C-407E-A947-70E740481C1C}">
                           <a14:useLocalDpi xmlns:a14="http://schemas.microsoft.com/office/drawing/2010/main" val="0"/>
@@ -2891,7 +2891,7 @@
                     <pic:cNvPicPr/>
                   </pic:nvPicPr>
                   <pic:blipFill>
-                    <a:blip r:embed="rId15">
+                    <a:blip r:embed="rId16">
                       <a:extLst>
                         <a:ext uri="{28A0092B-C50C-407E-A947-70E740481C1C}">
                           <a14:useLocalDpi xmlns:a14="http://schemas.microsoft.com/office/drawing/2010/main" val="0"/>
@@ -2953,7 +2953,7 @@
                     <pic:cNvPicPr/>
                   </pic:nvPicPr>
                   <pic:blipFill>
-                    <a:blip r:embed="rId16"/>
+                    <a:blip r:embed="rId17"/>
                     <a:stretch>
                       <a:fillRect/>
                     </a:stretch>
@@ -3043,7 +3043,7 @@
                     <pic:cNvPicPr/>
                   </pic:nvPicPr>
                   <pic:blipFill>
-                    <a:blip r:embed="rId17">
+                    <a:blip r:embed="rId18">
                       <a:extLst>
                         <a:ext uri="{28A0092B-C50C-407E-A947-70E740481C1C}">
                           <a14:useLocalDpi xmlns:a14="http://schemas.microsoft.com/office/drawing/2010/main" val="0"/>
@@ -3091,7 +3091,7 @@
                     <pic:cNvPicPr/>
                   </pic:nvPicPr>
                   <pic:blipFill>
-                    <a:blip r:embed="rId18"/>
+                    <a:blip r:embed="rId19"/>
                     <a:stretch>
                       <a:fillRect/>
                     </a:stretch>
@@ -3224,7 +3224,7 @@
                     <pic:cNvPicPr/>
                   </pic:nvPicPr>
                   <pic:blipFill>
-                    <a:blip r:embed="rId19"/>
+                    <a:blip r:embed="rId20"/>
                     <a:stretch>
                       <a:fillRect/>
                     </a:stretch>
@@ -3266,7 +3266,7 @@
                     <pic:cNvPicPr/>
                   </pic:nvPicPr>
                   <pic:blipFill>
-                    <a:blip r:embed="rId20">
+                    <a:blip r:embed="rId21">
                       <a:extLst>
                         <a:ext uri="{28A0092B-C50C-407E-A947-70E740481C1C}">
                           <a14:useLocalDpi xmlns:a14="http://schemas.microsoft.com/office/drawing/2010/main" val="0"/>
@@ -3314,7 +3314,7 @@
                     <pic:cNvPicPr/>
                   </pic:nvPicPr>
                   <pic:blipFill>
-                    <a:blip r:embed="rId21">
+                    <a:blip r:embed="rId22">
                       <a:extLst>
                         <a:ext uri="{28A0092B-C50C-407E-A947-70E740481C1C}">
                           <a14:useLocalDpi xmlns:a14="http://schemas.microsoft.com/office/drawing/2010/main" val="0"/>
@@ -3363,7 +3363,7 @@
                     <pic:cNvPicPr/>
                   </pic:nvPicPr>
                   <pic:blipFill>
-                    <a:blip r:embed="rId22" cstate="print">
+                    <a:blip r:embed="rId23" cstate="print">
                       <a:extLst>
                         <a:ext uri="{28A0092B-C50C-407E-A947-70E740481C1C}">
                           <a14:useLocalDpi xmlns:a14="http://schemas.microsoft.com/office/drawing/2010/main" val="0"/>
@@ -3631,7 +3631,7 @@
                     <pic:cNvPicPr/>
                   </pic:nvPicPr>
                   <pic:blipFill>
-                    <a:blip r:embed="rId23"/>
+                    <a:blip r:embed="rId24"/>
                     <a:stretch>
                       <a:fillRect/>
                     </a:stretch>
@@ -3739,7 +3739,7 @@
                     <pic:cNvPicPr/>
                   </pic:nvPicPr>
                   <pic:blipFill>
-                    <a:blip r:embed="rId24">
+                    <a:blip r:embed="rId25">
                       <a:extLst>
                         <a:ext uri="{28A0092B-C50C-407E-A947-70E740481C1C}">
                           <a14:useLocalDpi xmlns:a14="http://schemas.microsoft.com/office/drawing/2010/main" val="0"/>
@@ -3795,7 +3795,7 @@
                     <pic:cNvPicPr/>
                   </pic:nvPicPr>
                   <pic:blipFill>
-                    <a:blip r:embed="rId25" cstate="print">
+                    <a:blip r:embed="rId26" cstate="print">
                       <a:extLst>
                         <a:ext uri="{28A0092B-C50C-407E-A947-70E740481C1C}">
                           <a14:useLocalDpi xmlns:a14="http://schemas.microsoft.com/office/drawing/2010/main" val="0"/>
@@ -3842,7 +3842,7 @@
                     <pic:cNvPicPr/>
                   </pic:nvPicPr>
                   <pic:blipFill>
-                    <a:blip r:embed="rId26" cstate="print">
+                    <a:blip r:embed="rId27" cstate="print">
                       <a:extLst>
                         <a:ext uri="{28A0092B-C50C-407E-A947-70E740481C1C}">
                           <a14:useLocalDpi xmlns:a14="http://schemas.microsoft.com/office/drawing/2010/main" val="0"/>
@@ -4058,7 +4058,7 @@
                     <pic:cNvPicPr/>
                   </pic:nvPicPr>
                   <pic:blipFill>
-                    <a:blip r:embed="rId27"/>
+                    <a:blip r:embed="rId28"/>
                     <a:stretch>
                       <a:fillRect/>
                     </a:stretch>
@@ -4101,7 +4101,7 @@
                     <pic:cNvPicPr/>
                   </pic:nvPicPr>
                   <pic:blipFill>
-                    <a:blip r:embed="rId28">
+                    <a:blip r:embed="rId29">
                       <a:extLst>
                         <a:ext uri="{28A0092B-C50C-407E-A947-70E740481C1C}">
                           <a14:useLocalDpi xmlns:a14="http://schemas.microsoft.com/office/drawing/2010/main" val="0"/>
@@ -4149,7 +4149,7 @@
                     <pic:cNvPicPr/>
                   </pic:nvPicPr>
                   <pic:blipFill>
-                    <a:blip r:embed="rId29" cstate="print">
+                    <a:blip r:embed="rId30" cstate="print">
                       <a:extLst>
                         <a:ext uri="{28A0092B-C50C-407E-A947-70E740481C1C}">
                           <a14:useLocalDpi xmlns:a14="http://schemas.microsoft.com/office/drawing/2010/main" val="0"/>
@@ -4198,7 +4198,7 @@
                     <pic:cNvPicPr/>
                   </pic:nvPicPr>
                   <pic:blipFill>
-                    <a:blip r:embed="rId30" cstate="print">
+                    <a:blip r:embed="rId31" cstate="print">
                       <a:extLst>
                         <a:ext uri="{28A0092B-C50C-407E-A947-70E740481C1C}">
                           <a14:useLocalDpi xmlns:a14="http://schemas.microsoft.com/office/drawing/2010/main" val="0"/>
@@ -4246,7 +4246,7 @@
                     <pic:cNvPicPr/>
                   </pic:nvPicPr>
                   <pic:blipFill>
-                    <a:blip r:embed="rId31"/>
+                    <a:blip r:embed="rId32"/>
                     <a:stretch>
                       <a:fillRect/>
                     </a:stretch>
@@ -4286,7 +4286,7 @@
                     <pic:cNvPicPr/>
                   </pic:nvPicPr>
                   <pic:blipFill>
-                    <a:blip r:embed="rId32"/>
+                    <a:blip r:embed="rId33"/>
                     <a:stretch>
                       <a:fillRect/>
                     </a:stretch>
@@ -4646,7 +4646,7 @@
                     <pic:cNvPicPr/>
                   </pic:nvPicPr>
                   <pic:blipFill>
-                    <a:blip r:embed="rId33"/>
+                    <a:blip r:embed="rId34"/>
                     <a:stretch>
                       <a:fillRect/>
                     </a:stretch>
@@ -4690,7 +4690,7 @@
                     <pic:cNvPicPr/>
                   </pic:nvPicPr>
                   <pic:blipFill>
-                    <a:blip r:embed="rId34" cstate="print">
+                    <a:blip r:embed="rId35" cstate="print">
                       <a:extLst>
                         <a:ext uri="{28A0092B-C50C-407E-A947-70E740481C1C}">
                           <a14:useLocalDpi xmlns:a14="http://schemas.microsoft.com/office/drawing/2010/main" val="0"/>
@@ -4807,7 +4807,7 @@
                     <pic:cNvPicPr/>
                   </pic:nvPicPr>
                   <pic:blipFill>
-                    <a:blip r:embed="rId35"/>
+                    <a:blip r:embed="rId36"/>
                     <a:stretch>
                       <a:fillRect/>
                     </a:stretch>
@@ -4849,7 +4849,7 @@
                     <pic:cNvPicPr/>
                   </pic:nvPicPr>
                   <pic:blipFill>
-                    <a:blip r:embed="rId36"/>
+                    <a:blip r:embed="rId37"/>
                     <a:stretch>
                       <a:fillRect/>
                     </a:stretch>
@@ -4892,7 +4892,7 @@
                     <pic:cNvPicPr/>
                   </pic:nvPicPr>
                   <pic:blipFill>
-                    <a:blip r:embed="rId37"/>
+                    <a:blip r:embed="rId38"/>
                     <a:stretch>
                       <a:fillRect/>
                     </a:stretch>
@@ -4935,7 +4935,7 @@
                     <pic:cNvPicPr/>
                   </pic:nvPicPr>
                   <pic:blipFill>
-                    <a:blip r:embed="rId38"/>
+                    <a:blip r:embed="rId39"/>
                     <a:stretch>
                       <a:fillRect/>
                     </a:stretch>
@@ -4977,7 +4977,7 @@
                     <pic:cNvPicPr/>
                   </pic:nvPicPr>
                   <pic:blipFill>
-                    <a:blip r:embed="rId39"/>
+                    <a:blip r:embed="rId40"/>
                     <a:stretch>
                       <a:fillRect/>
                     </a:stretch>
@@ -5067,7 +5067,7 @@
                     <pic:cNvPicPr/>
                   </pic:nvPicPr>
                   <pic:blipFill>
-                    <a:blip r:embed="rId40"/>
+                    <a:blip r:embed="rId41"/>
                     <a:stretch>
                       <a:fillRect/>
                     </a:stretch>
@@ -5114,7 +5114,7 @@
                     <pic:cNvPicPr/>
                   </pic:nvPicPr>
                   <pic:blipFill>
-                    <a:blip r:embed="rId41"/>
+                    <a:blip r:embed="rId42"/>
                     <a:stretch>
                       <a:fillRect/>
                     </a:stretch>
@@ -5169,7 +5169,7 @@
                     <pic:cNvPicPr/>
                   </pic:nvPicPr>
                   <pic:blipFill>
-                    <a:blip r:embed="rId42"/>
+                    <a:blip r:embed="rId43"/>
                     <a:stretch>
                       <a:fillRect/>
                     </a:stretch>
@@ -5216,7 +5216,7 @@
                     <pic:cNvPicPr/>
                   </pic:nvPicPr>
                   <pic:blipFill>
-                    <a:blip r:embed="rId43"/>
+                    <a:blip r:embed="rId44"/>
                     <a:stretch>
                       <a:fillRect/>
                     </a:stretch>
@@ -5263,7 +5263,7 @@
                     <pic:cNvPicPr/>
                   </pic:nvPicPr>
                   <pic:blipFill>
-                    <a:blip r:embed="rId44"/>
+                    <a:blip r:embed="rId45"/>
                     <a:stretch>
                       <a:fillRect/>
                     </a:stretch>
@@ -5371,7 +5371,7 @@
                     <pic:cNvPicPr/>
                   </pic:nvPicPr>
                   <pic:blipFill>
-                    <a:blip r:embed="rId45"/>
+                    <a:blip r:embed="rId46"/>
                     <a:stretch>
                       <a:fillRect/>
                     </a:stretch>
@@ -5718,6 +5718,8 @@
         <w:t xml:space="preserve"> They  range from very high trust levels (0.9-1.0) as the highest level to untrusted environemnts(less that 0.5) as the lowest tier. The lowest tier primarily indicates that ignorance(lack of metadata or uncertainty) exceeds the leve of information required to make decision. This forms the basis for assigning trust values to different scenarios</w:t>
       </w:r>
     </w:p>
+    <w:p/>
+    <w:p/>
     <w:p>
       <w:pPr>
         <w:rPr>
@@ -5730,6 +5732,7 @@
           <w:b/>
           <w:bCs/>
         </w:rPr>
+        <w:lastRenderedPageBreak/>
         <w:t>Trust Score (Base Score)</w:t>
       </w:r>
       <w:r>
@@ -5754,10 +5757,10 @@
         <w:tblLook w:val="04A0" w:firstRow="1" w:lastRow="0" w:firstColumn="1" w:lastColumn="0" w:noHBand="0" w:noVBand="1"/>
       </w:tblPr>
       <w:tblGrid>
-        <w:gridCol w:w="992"/>
-        <w:gridCol w:w="1423"/>
-        <w:gridCol w:w="3891"/>
-        <w:gridCol w:w="2704"/>
+        <w:gridCol w:w="996"/>
+        <w:gridCol w:w="1336"/>
+        <w:gridCol w:w="3942"/>
+        <w:gridCol w:w="2736"/>
       </w:tblGrid>
       <w:tr>
         <w:trPr>
@@ -5771,7 +5774,6 @@
           </w:tcPr>
           <w:p>
             <w:r>
-              <w:lastRenderedPageBreak/>
               <w:t>Range</w:t>
             </w:r>
           </w:p>
@@ -5830,8 +5832,32 @@
             <w:hideMark/>
           </w:tcPr>
           <w:p>
-            <w:r>
+            <w:pPr>
+              <w:rPr>
+                <w:b w:val="0"/>
+                <w:bCs w:val="0"/>
+              </w:rPr>
+            </w:pPr>
+            <w:r>
+              <w:rPr>
+                <w:b w:val="0"/>
+                <w:bCs w:val="0"/>
+              </w:rPr>
               <w:t>0.90 - 1.00</w:t>
+            </w:r>
+          </w:p>
+        </w:tc>
+        <w:tc>
+          <w:tcPr>
+            <w:tcW w:w="0" w:type="auto"/>
+            <w:hideMark/>
+          </w:tcPr>
+          <w:p>
+            <w:pPr>
+              <w:cnfStyle w:val="000000100000" w:firstRow="0" w:lastRow="0" w:firstColumn="0" w:lastColumn="0" w:oddVBand="0" w:evenVBand="0" w:oddHBand="1" w:evenHBand="0" w:firstRowFirstColumn="0" w:firstRowLastColumn="0" w:lastRowFirstColumn="0" w:lastRowLastColumn="0"/>
+            </w:pPr>
+            <w:r>
+              <w:t>Critical / High</w:t>
             </w:r>
           </w:p>
         </w:tc>
@@ -5849,24 +5875,6 @@
                 <w:b/>
                 <w:bCs/>
               </w:rPr>
-              <w:t>Critical / High</w:t>
-            </w:r>
-          </w:p>
-        </w:tc>
-        <w:tc>
-          <w:tcPr>
-            <w:tcW w:w="0" w:type="auto"/>
-            <w:hideMark/>
-          </w:tcPr>
-          <w:p>
-            <w:pPr>
-              <w:cnfStyle w:val="000000100000" w:firstRow="0" w:lastRow="0" w:firstColumn="0" w:lastColumn="0" w:oddVBand="0" w:evenVBand="0" w:oddHBand="1" w:evenHBand="0" w:firstRowFirstColumn="0" w:firstRowLastColumn="0" w:lastRowFirstColumn="0" w:lastRowLastColumn="0"/>
-            </w:pPr>
-            <w:r>
-              <w:rPr>
-                <w:b/>
-                <w:bCs/>
-              </w:rPr>
               <w:t>Managed &amp; Compliant</w:t>
             </w:r>
             <w:r>
@@ -5897,7 +5905,17 @@
             <w:hideMark/>
           </w:tcPr>
           <w:p>
-            <w:r>
+            <w:pPr>
+              <w:rPr>
+                <w:b w:val="0"/>
+                <w:bCs w:val="0"/>
+              </w:rPr>
+            </w:pPr>
+            <w:r>
+              <w:rPr>
+                <w:b w:val="0"/>
+                <w:bCs w:val="0"/>
+              </w:rPr>
               <w:t>0.70 - 0.89</w:t>
             </w:r>
           </w:p>
@@ -5912,10 +5930,6 @@
               <w:cnfStyle w:val="000000000000" w:firstRow="0" w:lastRow="0" w:firstColumn="0" w:lastColumn="0" w:oddVBand="0" w:evenVBand="0" w:oddHBand="0" w:evenHBand="0" w:firstRowFirstColumn="0" w:firstRowLastColumn="0" w:lastRowFirstColumn="0" w:lastRowLastColumn="0"/>
             </w:pPr>
             <w:r>
-              <w:rPr>
-                <w:b/>
-                <w:bCs/>
-              </w:rPr>
               <w:t>High / Medium</w:t>
             </w:r>
           </w:p>
@@ -5967,8 +5981,32 @@
             <w:hideMark/>
           </w:tcPr>
           <w:p>
-            <w:r>
+            <w:pPr>
+              <w:rPr>
+                <w:b w:val="0"/>
+                <w:bCs w:val="0"/>
+              </w:rPr>
+            </w:pPr>
+            <w:r>
+              <w:rPr>
+                <w:b w:val="0"/>
+                <w:bCs w:val="0"/>
+              </w:rPr>
               <w:t>0.50 - 0.69</w:t>
+            </w:r>
+          </w:p>
+        </w:tc>
+        <w:tc>
+          <w:tcPr>
+            <w:tcW w:w="0" w:type="auto"/>
+            <w:hideMark/>
+          </w:tcPr>
+          <w:p>
+            <w:pPr>
+              <w:cnfStyle w:val="000000100000" w:firstRow="0" w:lastRow="0" w:firstColumn="0" w:lastColumn="0" w:oddVBand="0" w:evenVBand="0" w:oddHBand="1" w:evenHBand="0" w:firstRowFirstColumn="0" w:firstRowLastColumn="0" w:lastRowFirstColumn="0" w:lastRowLastColumn="0"/>
+            </w:pPr>
+            <w:r>
+              <w:t>Medium / Low</w:t>
             </w:r>
           </w:p>
         </w:tc>
@@ -5986,24 +6024,6 @@
                 <w:b/>
                 <w:bCs/>
               </w:rPr>
-              <w:t>Medium / Low</w:t>
-            </w:r>
-          </w:p>
-        </w:tc>
-        <w:tc>
-          <w:tcPr>
-            <w:tcW w:w="0" w:type="auto"/>
-            <w:hideMark/>
-          </w:tcPr>
-          <w:p>
-            <w:pPr>
-              <w:cnfStyle w:val="000000100000" w:firstRow="0" w:lastRow="0" w:firstColumn="0" w:lastColumn="0" w:oddVBand="0" w:evenVBand="0" w:oddHBand="1" w:evenHBand="0" w:firstRowFirstColumn="0" w:firstRowLastColumn="0" w:lastRowFirstColumn="0" w:lastRowLastColumn="0"/>
-            </w:pPr>
-            <w:r>
-              <w:rPr>
-                <w:b/>
-                <w:bCs/>
-              </w:rPr>
               <w:t>Unknown / Gray</w:t>
             </w:r>
             <w:r>
@@ -6034,7 +6054,17 @@
             <w:hideMark/>
           </w:tcPr>
           <w:p>
-            <w:r>
+            <w:pPr>
+              <w:rPr>
+                <w:b w:val="0"/>
+                <w:bCs w:val="0"/>
+              </w:rPr>
+            </w:pPr>
+            <w:r>
+              <w:rPr>
+                <w:b w:val="0"/>
+                <w:bCs w:val="0"/>
+              </w:rPr>
               <w:t>&lt; 0.50</w:t>
             </w:r>
           </w:p>
@@ -6049,10 +6079,6 @@
               <w:cnfStyle w:val="000000000000" w:firstRow="0" w:lastRow="0" w:firstColumn="0" w:lastColumn="0" w:oddVBand="0" w:evenVBand="0" w:oddHBand="0" w:evenHBand="0" w:firstRowFirstColumn="0" w:firstRowLastColumn="0" w:lastRowFirstColumn="0" w:lastRowLastColumn="0"/>
             </w:pPr>
             <w:r>
-              <w:rPr>
-                <w:b/>
-                <w:bCs/>
-              </w:rPr>
               <w:t>Untrusted</w:t>
             </w:r>
           </w:p>
@@ -6297,11 +6323,17 @@
       <w:r>
         <w:t>.</w:t>
       </w:r>
-    </w:p>
-    <w:p/>
-    <w:p>
-      <w:r>
-        <w:t>Table 8.5 shows the reference matrix for signal and metadata variance based on contexts</w:t>
+      <w:r>
+        <w:t xml:space="preserve"> </w:t>
+      </w:r>
+      <w:r>
+        <w:rPr>
+          <w:color w:val="C00000"/>
+        </w:rPr>
+        <w:t xml:space="preserve">Table 8.5 </w:t>
+      </w:r>
+      <w:r>
+        <w:t>shows the reference matrix for signal and metadata variance based on contexts</w:t>
       </w:r>
     </w:p>
     <w:p>
@@ -6311,11 +6343,20 @@
           <w:bCs/>
         </w:rPr>
       </w:pPr>
-      <w:r>
+    </w:p>
+    <w:p>
+      <w:pPr>
         <w:rPr>
           <w:b/>
           <w:bCs/>
         </w:rPr>
+      </w:pPr>
+      <w:r>
+        <w:rPr>
+          <w:b/>
+          <w:bCs/>
+        </w:rPr>
+        <w:lastRenderedPageBreak/>
         <w:t>Stability (Variance)</w:t>
       </w:r>
       <w:r>
@@ -6353,8 +6394,8 @@
         <w:tblLook w:val="04A0" w:firstRow="1" w:lastRow="0" w:firstColumn="1" w:lastColumn="0" w:noHBand="0" w:noVBand="1"/>
       </w:tblPr>
       <w:tblGrid>
-        <w:gridCol w:w="1061"/>
-        <w:gridCol w:w="1207"/>
+        <w:gridCol w:w="1101"/>
+        <w:gridCol w:w="1167"/>
         <w:gridCol w:w="3397"/>
         <w:gridCol w:w="3345"/>
       </w:tblGrid>
@@ -6386,7 +6427,6 @@
                 <w:b/>
                 <w:bCs/>
               </w:rPr>
-              <w:lastRenderedPageBreak/>
               <w:t>Value</w:t>
             </w:r>
           </w:p>
@@ -6491,10 +6531,6 @@
           </w:tcPr>
           <w:p>
             <w:r>
-              <w:rPr>
-                <w:b/>
-                <w:bCs/>
-              </w:rPr>
               <w:t>0.01 - 0.02</w:t>
             </w:r>
           </w:p>
@@ -6513,10 +6549,6 @@
           </w:tcPr>
           <w:p>
             <w:r>
-              <w:rPr>
-                <w:b/>
-                <w:bCs/>
-              </w:rPr>
               <w:t>Stable</w:t>
             </w:r>
           </w:p>
@@ -6580,10 +6612,6 @@
           </w:tcPr>
           <w:p>
             <w:r>
-              <w:rPr>
-                <w:b/>
-                <w:bCs/>
-              </w:rPr>
               <w:t>0.03 - 0.05</w:t>
             </w:r>
           </w:p>
@@ -6602,10 +6630,6 @@
           </w:tcPr>
           <w:p>
             <w:r>
-              <w:rPr>
-                <w:b/>
-                <w:bCs/>
-              </w:rPr>
               <w:t>Variable</w:t>
             </w:r>
           </w:p>
@@ -6669,10 +6693,6 @@
           </w:tcPr>
           <w:p>
             <w:r>
-              <w:rPr>
-                <w:b/>
-                <w:bCs/>
-              </w:rPr>
               <w:t>0.10 - 0.20</w:t>
             </w:r>
           </w:p>
@@ -6691,10 +6711,6 @@
           </w:tcPr>
           <w:p>
             <w:r>
-              <w:rPr>
-                <w:b/>
-                <w:bCs/>
-              </w:rPr>
               <w:t>Unstable</w:t>
             </w:r>
           </w:p>
@@ -6758,10 +6774,6 @@
           </w:tcPr>
           <w:p>
             <w:r>
-              <w:rPr>
-                <w:b/>
-                <w:bCs/>
-              </w:rPr>
               <w:t>&gt; 0.25</w:t>
             </w:r>
           </w:p>
@@ -6780,10 +6792,6 @@
           </w:tcPr>
           <w:p>
             <w:r>
-              <w:rPr>
-                <w:b/>
-                <w:bCs/>
-              </w:rPr>
               <w:t>Chaotic</w:t>
             </w:r>
           </w:p>
@@ -7007,6 +7015,13 @@
               </w:rPr>
               <w:t>Industry Equivalent</w:t>
             </w:r>
+            <w:r>
+              <w:rPr>
+                <w:b/>
+                <w:bCs/>
+              </w:rPr>
+              <w:t xml:space="preserve"> Mapping</w:t>
+            </w:r>
           </w:p>
         </w:tc>
       </w:tr>
@@ -7085,14 +7100,40 @@
           </w:tcPr>
           <w:p>
             <w:r>
+              <w:t>NIST SP 800-</w:t>
+            </w:r>
+            <w:r>
+              <w:t>63B</w:t>
+            </w:r>
+            <w:r>
               <w:rPr>
                 <w:b/>
                 <w:bCs/>
               </w:rPr>
+              <w:t>-</w:t>
+            </w:r>
+            <w:r>
+              <w:rPr>
+                <w:b/>
+                <w:bCs/>
+              </w:rPr>
+              <w:t xml:space="preserve"> </w:t>
+            </w:r>
+            <w:r>
+              <w:rPr>
+                <w:b/>
+                <w:bCs/>
+              </w:rPr>
               <w:t>High Confidence</w:t>
             </w:r>
             <w:r>
-              <w:t> (NIST) / </w:t>
+              <w:t> </w:t>
+            </w:r>
+            <w:r>
+              <w:t>and</w:t>
+            </w:r>
+            <w:r>
+              <w:t> </w:t>
             </w:r>
             <w:r>
               <w:rPr>
@@ -8085,6 +8126,87 @@
           <w:tab w:val="num" w:pos="720"/>
         </w:tabs>
       </w:pPr>
+      <w:r>
+        <w:lastRenderedPageBreak/>
+        <w:t>The absence of access policie</w:t>
+      </w:r>
+      <w:r>
+        <w:t xml:space="preserve">s </w:t>
+      </w:r>
+      <w:r>
+        <w:t xml:space="preserve">often manifesting as "Implicit Trust" or "No Policy" following creates an existential vulnerability within modern, heterogeneous enterprise environments. In such open-policy ecosystems, </w:t>
+      </w:r>
+      <w:r>
+        <w:t>any entity can a</w:t>
+      </w:r>
+      <w:r>
+        <w:t>ccess any resource</w:t>
+      </w:r>
+      <w:r>
+        <w:t xml:space="preserve">, </w:t>
+      </w:r>
+      <w:r>
+        <w:t xml:space="preserve"> and once access is g</w:t>
+      </w:r>
+      <w:r>
+        <w:t>ranted</w:t>
+      </w:r>
+      <w:r>
+        <w:t>, data exfiltration,intrusions on network segments and</w:t>
+      </w:r>
+      <w:r>
+        <w:t xml:space="preserve"> unchecked lateral mobility</w:t>
+      </w:r>
+      <w:r>
+        <w:t xml:space="preserve"> become</w:t>
+      </w:r>
+      <w:r>
+        <w:t xml:space="preserve"> normal occurences</w:t>
+      </w:r>
+      <w:r>
+        <w:t>. Without continuous verification policies dictating </w:t>
+      </w:r>
+      <w:r>
+        <w:rPr>
+          <w:i/>
+          <w:iCs/>
+        </w:rPr>
+        <w:t>what</w:t>
+      </w:r>
+      <w:r>
+        <w:t> a specific user can access and </w:t>
+      </w:r>
+      <w:r>
+        <w:rPr>
+          <w:i/>
+          <w:iCs/>
+        </w:rPr>
+        <w:t>when</w:t>
+      </w:r>
+      <w:r>
+        <w:t xml:space="preserve">, this implicit trust becomes the primary vector for rapid malware propagation. </w:t>
+      </w:r>
+      <w:r>
+        <w:t>Malware</w:t>
+      </w:r>
+      <w:r>
+        <w:t xml:space="preserve"> operations</w:t>
+      </w:r>
+      <w:r>
+        <w:t xml:space="preserve"> such as</w:t>
+      </w:r>
+      <w:r>
+        <w:t xml:space="preserve"> ransomware</w:t>
+      </w:r>
+      <w:r>
+        <w:t xml:space="preserve"> exploit </w:t>
+      </w:r>
+      <w:r>
+        <w:t>the absence of access control policies</w:t>
+      </w:r>
+      <w:r>
+        <w:t xml:space="preserve"> to automatically traverse horizontally, encrypting critical assets across servers and workstations that should have been mathematically isolated from the initial point of ingress (IBM Security,  2024).</w:t>
+      </w:r>
     </w:p>
     <w:p>
       <w:pPr>
@@ -8092,6 +8214,21 @@
           <w:tab w:val="num" w:pos="720"/>
         </w:tabs>
       </w:pPr>
+      <w:r>
+        <w:t>Furthermore, open access severely exacerbate the risk and financial impact of internal data misuse and exfiltration. In environments lacking authorization thresholds, both malicious insiders and compromised external actors operate with a surplus of unsanctioned privileges. The inability to dynamically restrict access based on shifting contextual risk (e.g., a sudden login from an anomalous location or via an unpatched device) allows attackers ample time to locate and siphon sensitive data undetected</w:t>
+      </w:r>
+      <w:r>
+        <w:t xml:space="preserve"> </w:t>
+      </w:r>
+      <w:r>
+        <w:t xml:space="preserve">from </w:t>
+      </w:r>
+      <w:r>
+        <w:t>legacy, open-trust paradigms (Gartner, 2023; IBM Security, 2024)</w:t>
+      </w:r>
+      <w:r>
+        <w:t>. Thus, enforcing a continuous, mathematically justified policy tiering system is not merely an exercise in theoretical security, but a quantifiable requirement for operational survival against automated modern threats.</w:t>
+      </w:r>
     </w:p>
     <w:p>
       <w:pPr>
@@ -8102,23 +8239,87 @@
     </w:p>
     <w:p>
       <w:pPr>
-        <w:tabs>
-          <w:tab w:val="num" w:pos="720"/>
-        </w:tabs>
-      </w:pPr>
+        <w:pStyle w:val="Heading3"/>
+      </w:pPr>
+      <w:r>
+        <w:t>Testcase 1:</w:t>
+      </w:r>
+      <w:r>
+        <w:t xml:space="preserve"> </w:t>
+      </w:r>
+      <w:r>
+        <w:t>Evaluation</w:t>
+      </w:r>
+      <w:r>
+        <w:t xml:space="preserve"> of</w:t>
+      </w:r>
+      <w:r>
+        <w:t xml:space="preserve"> Single Criteria Policy</w:t>
+      </w:r>
     </w:p>
     <w:p>
       <w:pPr>
         <w:tabs>
           <w:tab w:val="num" w:pos="720"/>
         </w:tabs>
-      </w:pPr>
+        <w:rPr>
+          <w:color w:val="C00000"/>
+        </w:rPr>
+      </w:pPr>
+      <w:r>
+        <w:t>This testcase considers a single domain criteria based access decisions. The decisions are made based onfulfilment of specific criteria within a single domain. These may include user rol</w:t>
+      </w:r>
+      <w:r>
+        <w:t>e</w:t>
+      </w:r>
+      <w:r>
+        <w:t>s, device posture or application profile. This was performed by a r</w:t>
+      </w:r>
+      <w:r>
+        <w:t>ego</w:t>
+      </w:r>
+      <w:r>
+        <w:t xml:space="preserve"> script enforcing a criterion per</w:t>
+      </w:r>
+      <w:r>
+        <w:t xml:space="preserve"> domain on</w:t>
+      </w:r>
+      <w:r>
+        <w:t xml:space="preserve"> </w:t>
+      </w:r>
+      <w:r>
+        <w:t>User-role, Device-Posture and Application-Profile</w:t>
+      </w:r>
+      <w:r>
+        <w:t xml:space="preserve"> as shown </w:t>
+      </w:r>
+      <w:r>
+        <w:rPr>
+          <w:color w:val="C00000"/>
+        </w:rPr>
+        <w:t>in Table 8.3</w:t>
+      </w:r>
+      <w:r>
+        <w:t xml:space="preserve">. The rego snippet is shown in </w:t>
+      </w:r>
+      <w:r>
+        <w:rPr>
+          <w:color w:val="C00000"/>
+        </w:rPr>
+        <w:t>Figure 8.7</w:t>
+      </w:r>
     </w:p>
     <w:p>
       <w:pPr>
         <w:tabs>
           <w:tab w:val="num" w:pos="720"/>
         </w:tabs>
+        <w:sectPr>
+          <w:pgSz w:w="11900" w:h="16840"/>
+          <w:pgMar w:top="1440" w:right="1440" w:bottom="1440" w:left="1440" w:header="708" w:footer="708" w:gutter="0"/>
+          <w:cols w:space="708"/>
+          <w:docGrid w:linePitch="360"/>
+        </w:sectPr>
       </w:pPr>
     </w:p>
     <w:p>
@@ -8130,73 +8331,6 @@
     </w:p>
     <w:p>
       <w:pPr>
-        <w:pStyle w:val="Heading3"/>
-      </w:pPr>
-      <w:r>
-        <w:t>Testcase 1</w:t>
-      </w:r>
-      <w:r>
-        <w:t xml:space="preserve"> Evaluation</w:t>
-      </w:r>
-      <w:r>
-        <w:t>: Single Criteria Policy</w:t>
-      </w:r>
-    </w:p>
-    <w:p>
-      <w:pPr>
-        <w:tabs>
-          <w:tab w:val="num" w:pos="720"/>
-        </w:tabs>
-        <w:rPr>
-          <w:color w:val="C00000"/>
-        </w:rPr>
-      </w:pPr>
-      <w:r>
-        <w:t>This testcase considers a single domain criteria based access decisions. The decisions are made based onfulfilment of specific criteria within a single domain. These may include user rols, device posture or application profile. This was performed by a r</w:t>
-      </w:r>
-      <w:r>
-        <w:t>ego</w:t>
-      </w:r>
-      <w:r>
-        <w:t xml:space="preserve"> script enforcing a criterion per</w:t>
-      </w:r>
-      <w:r>
-        <w:t xml:space="preserve"> domain on</w:t>
-      </w:r>
-      <w:r>
-        <w:t xml:space="preserve"> </w:t>
-      </w:r>
-      <w:r>
-        <w:t>User-role, Device-Posture and Application-Profile</w:t>
-      </w:r>
-      <w:r>
-        <w:t xml:space="preserve"> as shown </w:t>
-      </w:r>
-      <w:r>
-        <w:rPr>
-          <w:color w:val="C00000"/>
-        </w:rPr>
-        <w:t>in Table 8.3</w:t>
-      </w:r>
-      <w:r>
-        <w:t xml:space="preserve">. The rego snippet is shown in </w:t>
-      </w:r>
-      <w:r>
-        <w:rPr>
-          <w:color w:val="C00000"/>
-        </w:rPr>
-        <w:t>Figure 8.7</w:t>
-      </w:r>
-    </w:p>
-    <w:p>
-      <w:pPr>
-        <w:tabs>
-          <w:tab w:val="num" w:pos="720"/>
-        </w:tabs>
-      </w:pPr>
-    </w:p>
-    <w:p>
-      <w:pPr>
         <w:tabs>
           <w:tab w:val="num" w:pos="720"/>
         </w:tabs>
@@ -8205,6 +8339,7 @@
           <w:bCs/>
         </w:rPr>
         <w:sectPr>
+          <w:type w:val="continuous"/>
           <w:pgSz w:w="11900" w:h="16840"/>
           <w:pgMar w:top="1440" w:right="1440" w:bottom="1440" w:left="1440" w:header="708" w:footer="708" w:gutter="0"/>
           <w:cols w:space="708"/>
@@ -8505,6 +8640,7 @@
                 <w:b/>
                 <w:bCs/>
               </w:rPr>
+              <w:lastRenderedPageBreak/>
               <w:t>Device</w:t>
             </w:r>
           </w:p>
@@ -8853,7 +8989,7 @@
                     <pic:cNvPicPr/>
                   </pic:nvPicPr>
                   <pic:blipFill>
-                    <a:blip r:embed="rId46"/>
+                    <a:blip r:embed="rId47"/>
                     <a:stretch>
                       <a:fillRect/>
                     </a:stretch>
@@ -8893,6 +9029,106 @@
         <w:tabs>
           <w:tab w:val="num" w:pos="720"/>
         </w:tabs>
+      </w:pPr>
+      <w:r>
+        <w:lastRenderedPageBreak/>
+        <w:t>While an improvement over entirely open networks, access control models reliant on single-domain criteria (such as evaluating </w:t>
+      </w:r>
+      <w:r>
+        <w:rPr>
+          <w:i/>
+          <w:iCs/>
+        </w:rPr>
+        <w:t>only</w:t>
+      </w:r>
+      <w:r>
+        <w:t> device posture or </w:t>
+      </w:r>
+      <w:r>
+        <w:rPr>
+          <w:i/>
+          <w:iCs/>
+        </w:rPr>
+        <w:t>only</w:t>
+      </w:r>
+      <w:r>
+        <w:t xml:space="preserve"> network location) remain fundamentally fragile in the face of modern enterprise threats. The core limitation of a single-factor approach is its lack of contextual depth; it inherently trusts a single axis of verification while remaining blind to systemic compromises occurring in adjacent domains. For example, if an architecture grants access based solely on a valid, uncompromised remote access gateway </w:t>
+      </w:r>
+      <w:r>
+        <w:t>such as</w:t>
+      </w:r>
+      <w:r>
+        <w:t xml:space="preserve"> a VPN connection without secondary hardware checks), an adversary who successfully executes a credential stuffing or phishing attack can immediately inherit that trust. Recent incident analyses have demonstrated that adversaries frequently exploit these single-point-of-verification architectures to bypass initial defenses, leveraging the established trust in one domain to facilitate rapid lateral movement and deploy ransomware throughout the wider environment</w:t>
+      </w:r>
+      <w:r>
+        <w:t xml:space="preserve"> as seconded by</w:t>
+      </w:r>
+      <w:r>
+        <w:t xml:space="preserve"> </w:t>
+      </w:r>
+      <w:r>
+        <w:rPr>
+          <w:color w:val="C00000"/>
+        </w:rPr>
+        <w:t xml:space="preserve">Alder </w:t>
+      </w:r>
+      <w:r>
+        <w:rPr>
+          <w:color w:val="C00000"/>
+        </w:rPr>
+        <w:t>(</w:t>
+      </w:r>
+      <w:r>
+        <w:rPr>
+          <w:color w:val="C00000"/>
+        </w:rPr>
+        <w:t>2025)</w:t>
+      </w:r>
+      <w:r>
+        <w:t>.</w:t>
+      </w:r>
+    </w:p>
+    <w:p>
+      <w:pPr>
+        <w:tabs>
+          <w:tab w:val="num" w:pos="720"/>
+        </w:tabs>
+      </w:pPr>
+      <w:r>
+        <w:t>This structural myopia dramatically escalates the likelihood of data misuse and resource hijacking. A single-domain model cannot reconcile conflicting contextual signals</w:t>
+      </w:r>
+      <w:r>
+        <w:t xml:space="preserve"> </w:t>
+      </w:r>
+      <w:r>
+        <w:t xml:space="preserve">such as a valid identity token attempting to download massive volumes of sensitive data from a geographically anomalous IP address. Because the system's policy engine only verifies the identity token (the single criteria), the anomalous, potentially malicious behavioral context is ignored. This failure to correlate multi-vector telemetry allows attackers to </w:t>
+      </w:r>
+      <w:r>
+        <w:t>access restricted resources</w:t>
+      </w:r>
+      <w:r>
+        <w:t xml:space="preserve"> undetected, utilizing legitimate administrative credentials for unauthorized data exfiltration or resource manipulation (Elastic Security Labs, 2024). To effectively mitigate these risks, modern Zero Trust frameworks must transcend single-domain checks, evolving toward continuous, multidomain verification engines that dynamically analyze identity, device health, network context, and application behavior in tandem.</w:t>
+      </w:r>
+    </w:p>
+    <w:p>
+      <w:pPr>
+        <w:tabs>
+          <w:tab w:val="num" w:pos="720"/>
+        </w:tabs>
+      </w:pPr>
+    </w:p>
+    <w:p>
+      <w:pPr>
+        <w:tabs>
+          <w:tab w:val="num" w:pos="720"/>
+        </w:tabs>
+        <w:sectPr>
+          <w:type w:val="continuous"/>
+          <w:pgSz w:w="11900" w:h="16840"/>
+          <w:pgMar w:top="1440" w:right="1440" w:bottom="1440" w:left="1440" w:header="708" w:footer="708" w:gutter="0"/>
+          <w:cols w:space="708"/>
+          <w:docGrid w:linePitch="360"/>
+        </w:sectPr>
       </w:pPr>
     </w:p>
     <w:p>
@@ -9595,6 +9831,9 @@
         <w:tabs>
           <w:tab w:val="num" w:pos="720"/>
         </w:tabs>
+        <w:rPr>
+          <w:noProof/>
+        </w:rPr>
       </w:pPr>
       <w:r>
         <w:rPr>
@@ -9616,7 +9855,7 @@
                     <pic:cNvPicPr/>
                   </pic:nvPicPr>
                   <pic:blipFill>
-                    <a:blip r:embed="rId47"/>
+                    <a:blip r:embed="rId48"/>
                     <a:stretch>
                       <a:fillRect/>
                     </a:stretch>
@@ -9662,7 +9901,7 @@
                     <pic:cNvPicPr/>
                   </pic:nvPicPr>
                   <pic:blipFill>
-                    <a:blip r:embed="rId48"/>
+                    <a:blip r:embed="rId49"/>
                     <a:stretch>
                       <a:fillRect/>
                     </a:stretch>
@@ -9708,7 +9947,7 @@
                     <pic:cNvPicPr/>
                   </pic:nvPicPr>
                   <pic:blipFill>
-                    <a:blip r:embed="rId49"/>
+                    <a:blip r:embed="rId50"/>
                     <a:stretch>
                       <a:fillRect/>
                     </a:stretch>
@@ -9734,38 +9973,53 @@
         <w:tabs>
           <w:tab w:val="num" w:pos="720"/>
         </w:tabs>
+        <w:rPr>
+          <w:noProof/>
+        </w:rPr>
       </w:pPr>
     </w:p>
     <w:p>
       <w:pPr>
-        <w:pStyle w:val="Heading3"/>
-      </w:pPr>
-      <w:r>
-        <w:t>TestCase 3: Multi-</w:t>
-      </w:r>
-      <w:r>
-        <w:t>D</w:t>
-      </w:r>
-      <w:r>
-        <w:t xml:space="preserve">omain with Static </w:t>
-      </w:r>
-      <w:r>
-        <w:t>T</w:t>
-      </w:r>
-      <w:r>
-        <w:t xml:space="preserve">rust </w:t>
-      </w:r>
-      <w:r>
-        <w:t>S</w:t>
-      </w:r>
-      <w:r>
-        <w:t xml:space="preserve">cores and </w:t>
-      </w:r>
-      <w:r>
-        <w:t xml:space="preserve">Domain </w:t>
-      </w:r>
-      <w:r>
-        <w:t xml:space="preserve">weights </w:t>
+        <w:tabs>
+          <w:tab w:val="num" w:pos="720"/>
+        </w:tabs>
+      </w:pPr>
+      <w:r>
+        <w:t xml:space="preserve">While </w:t>
+      </w:r>
+      <w:r>
+        <w:t xml:space="preserve">this testcase represents </w:t>
+      </w:r>
+      <w:r>
+        <w:t>a marked improvement over single-domain architectures, Hierarchical Multi-domain Policy (HMP) introduces its own set of structural vulnerabilities when deployed in modern, heterogeneous enterprise environments. HMP architectures inherently rely on a rigid, top-down derivation of trust, where macro-level security postures cascade down to discrete micro-domains</w:t>
+      </w:r>
+      <w:r>
+        <w:t xml:space="preserve"> such as</w:t>
+      </w:r>
+      <w:r>
+        <w:t xml:space="preserve"> a corporate root policy dictating the access constraints of an isolated cloud enclave. However, recent analyses demonstrate that this hierarchical rigidity struggles to adapt to the ephemeral nature of modern </w:t>
+      </w:r>
+      <w:r>
+        <w:t>network</w:t>
+      </w:r>
+      <w:r>
+        <w:t xml:space="preserve"> workloads and remote access scenarios. Because HMP systems often enforce static rules that lag behind </w:t>
+      </w:r>
+      <w:r>
+        <w:lastRenderedPageBreak/>
+        <w:t>real-time contextual shifts, adversaries frequently exploit the operational delay between micro-domain state changes and macro-policy updates. If an attacker compromises a lower-tier domain</w:t>
+      </w:r>
+      <w:r>
+        <w:t xml:space="preserve"> </w:t>
+      </w:r>
+      <w:r>
+        <w:t>such as an improperly configured microservice or an edge IoT device</w:t>
+      </w:r>
+      <w:r>
+        <w:t xml:space="preserve">, </w:t>
+      </w:r>
+      <w:r>
+        <w:t>they can leverage the inherent trust pathways designed for inter-domain communication to bypass the broader security hierarchy, facilitating covert malware propagation (Cloud Security Alliance, 2025; Wang et al., 2024).</w:t>
       </w:r>
     </w:p>
     <w:p>
@@ -9773,16 +10027,71 @@
         <w:tabs>
           <w:tab w:val="num" w:pos="720"/>
         </w:tabs>
+      </w:pPr>
+      <w:r>
+        <w:t xml:space="preserve">Furthermore, the complexity of orchestrating hierarchical trust across distributed </w:t>
+      </w:r>
+      <w:r>
+        <w:t xml:space="preserve">and </w:t>
+      </w:r>
+      <w:r>
+        <w:t>cloud infrastructures often leads to severe policy misconfigurations, dramatically increasing the surface area for data and resource misuse. In an effort to maintain operational continuity across disparate domains, network administrators frequently implement overly permissive inter-domain routing rules, creating fatal security gaps. When a malicious actor or an insider threat gains access to a federated domain characterized by these loose hierarchical bonds, they can exploit the systemic administrative overhead to manipulate access privileges, enabling the lateral exfiltration of sensitive datasets via trusted third-party APIs or supply chain vectors. As advanced, AI-augmented threats continue to target these structural seams within complex policy matrices, it becomes evident that rigid hierarchical models must evolve into fully dynamic, continuously evaluated contextual fabrics to prevent catastrophic data breaches (Al-Sanjary et al., 2023; Cloud Security Alliance, 2025).</w:t>
+      </w:r>
+    </w:p>
+    <w:p>
+      <w:pPr>
+        <w:tabs>
+          <w:tab w:val="num" w:pos="720"/>
+        </w:tabs>
+      </w:pPr>
+    </w:p>
+    <w:p>
+      <w:pPr>
+        <w:pStyle w:val="Heading3"/>
+      </w:pPr>
+      <w:r>
+        <w:t>TestCase 3: Multi-</w:t>
+      </w:r>
+      <w:r>
+        <w:t>D</w:t>
+      </w:r>
+      <w:r>
+        <w:t xml:space="preserve">omain with Static </w:t>
+      </w:r>
+      <w:r>
+        <w:t>T</w:t>
+      </w:r>
+      <w:r>
+        <w:t xml:space="preserve">rust </w:t>
+      </w:r>
+      <w:r>
+        <w:t>S</w:t>
+      </w:r>
+      <w:r>
+        <w:t xml:space="preserve">cores and </w:t>
+      </w:r>
+      <w:r>
+        <w:t xml:space="preserve">Domain </w:t>
+      </w:r>
+      <w:r>
+        <w:t xml:space="preserve">weights </w:t>
+      </w:r>
+    </w:p>
+    <w:p>
+      <w:pPr>
+        <w:tabs>
+          <w:tab w:val="num" w:pos="720"/>
+        </w:tabs>
         <w:rPr>
           <w:color w:val="C00000"/>
         </w:rPr>
       </w:pPr>
       <w:r>
-        <w:t xml:space="preserve">Modern Zero Trust architectures need to treat trust as continuous and dynamic, influenced by posture, behavior, and scenarios that defined context. This means that binary or ternary trust labels  such as trusted, semi-trusted and untrusted are overly simplistic to hanndle these contexts especially in heterogenous enterprise neeworks. As such, this tescase looks at weighting trusts values depending on context. The focus is static weighting of different domain areas to determine an eventual trust score that is compared against thresholds that detrmine </w:t>
+        <w:t xml:space="preserve">Modern Zero Trust architectures need to treat trust as continuous and dynamic, influenced by posture, behavior, and scenarios that defined context. This means that binary or ternary trust labels  such as trusted, semi-trusted and untrusted are overly simplistic to hanndle these contexts especially in heterogenous enterprise neeworks. As such, this tescase looks at weighting trusts values depending on context. The focus is static weighting of different domain areas to determine an eventual trust score that is compared against thresholds that detrmine access levels. This testcase forms a fundamental foundation towards more dynamic and cntextual trust estimation and/or determination. Trust score inputs are defined within quuries and used t calaculae trust based on weights provided in the rego scripts. The eventual trust scores are check against predetermined rresholds for full, limited or no access decisions. This  aligns with the multi-criteria, score based continuous trust evaluation principle of Zero Trust. Tunability, and bridging or rule based and probabilistic authorization becomes a critical outcome in this testcase. The rego file snippet, input and output for different subcases within </w:t>
       </w:r>
       <w:r>
         <w:lastRenderedPageBreak/>
-        <w:t xml:space="preserve">access levels. This testcase forms a fundamental foundation towards more dynamic and cntextual trust estimation and/or determination. Trust score inputs are defined within quuries and used t calaculae trust based on weights provided in the rego scripts. The eventual trust scores are check against predetermined rresholds for full, limited or no access decisions. This  aligns with the multi-criteria, score based continuous trust evaluation principle of Zero Trust. Tunability, and bridging or rule based and probabilistic authorization becomes a critical outcome in this testcase. The rego file snippet, input and output for different subcases within this tescase have been show in </w:t>
+        <w:t xml:space="preserve">this tescase have been show in </w:t>
       </w:r>
       <w:r>
         <w:rPr>
@@ -9836,7 +10145,7 @@
                     <pic:cNvPicPr/>
                   </pic:nvPicPr>
                   <pic:blipFill>
-                    <a:blip r:embed="rId50"/>
+                    <a:blip r:embed="rId51"/>
                     <a:stretch>
                       <a:fillRect/>
                     </a:stretch>
@@ -9883,7 +10192,7 @@
                     <pic:cNvPicPr/>
                   </pic:nvPicPr>
                   <pic:blipFill>
-                    <a:blip r:embed="rId51"/>
+                    <a:blip r:embed="rId52"/>
                     <a:stretch>
                       <a:fillRect/>
                     </a:stretch>
@@ -9950,7 +10259,7 @@
                     <pic:cNvPicPr/>
                   </pic:nvPicPr>
                   <pic:blipFill>
-                    <a:blip r:embed="rId52"/>
+                    <a:blip r:embed="rId53"/>
                     <a:stretch>
                       <a:fillRect/>
                     </a:stretch>
@@ -9996,7 +10305,7 @@
                     <pic:cNvPicPr/>
                   </pic:nvPicPr>
                   <pic:blipFill>
-                    <a:blip r:embed="rId53"/>
+                    <a:blip r:embed="rId54"/>
                     <a:stretch>
                       <a:fillRect/>
                     </a:stretch>
@@ -10063,7 +10372,7 @@
                     <pic:cNvPicPr/>
                   </pic:nvPicPr>
                   <pic:blipFill>
-                    <a:blip r:embed="rId54"/>
+                    <a:blip r:embed="rId55"/>
                     <a:stretch>
                       <a:fillRect/>
                     </a:stretch>
@@ -10109,7 +10418,7 @@
                     <pic:cNvPicPr/>
                   </pic:nvPicPr>
                   <pic:blipFill>
-                    <a:blip r:embed="rId55"/>
+                    <a:blip r:embed="rId56"/>
                     <a:stretch>
                       <a:fillRect/>
                     </a:stretch>
@@ -10166,7 +10475,7 @@
                     <pic:cNvPicPr/>
                   </pic:nvPicPr>
                   <pic:blipFill>
-                    <a:blip r:embed="rId56"/>
+                    <a:blip r:embed="rId57"/>
                     <a:stretch>
                       <a:fillRect/>
                     </a:stretch>
@@ -10209,7 +10518,7 @@
                     <pic:cNvPicPr/>
                   </pic:nvPicPr>
                   <pic:blipFill>
-                    <a:blip r:embed="rId57"/>
+                    <a:blip r:embed="rId58"/>
                     <a:stretch>
                       <a:fillRect/>
                     </a:stretch>
@@ -10273,11 +10582,17 @@
         <w:tabs>
           <w:tab w:val="num" w:pos="720"/>
         </w:tabs>
+        <w:rPr>
+          <w:i/>
+          <w:iCs/>
+        </w:rPr>
       </w:pPr>
       <w:r>
         <w:rPr>
           <w:b/>
           <w:bCs/>
+          <w:i/>
+          <w:iCs/>
         </w:rPr>
         <w:t>Aggregate Trust</w:t>
       </w:r>
@@ -10285,14 +10600,17 @@
         <w:rPr>
           <w:b/>
           <w:bCs/>
+          <w:i/>
+          <w:iCs/>
         </w:rPr>
         <w:t>=</w:t>
       </w:r>
       <w:r>
-        <w:t> (user_trust × 0.4) + (device_trust × 0.4) + ((1 - app_risk) × 0.2)</w:t>
-      </w:r>
-      <w:r>
-        <w:t xml:space="preserve"> </w:t>
+        <w:rPr>
+          <w:i/>
+          <w:iCs/>
+        </w:rPr>
+        <w:t xml:space="preserve"> (user_trust × 0.4) + (device_trust × 0.4) + ((1 - app_risk) × 0.2) </w:t>
       </w:r>
     </w:p>
     <w:p>
@@ -10458,7 +10776,7 @@
                     <pic:cNvPicPr/>
                   </pic:nvPicPr>
                   <pic:blipFill>
-                    <a:blip r:embed="rId58"/>
+                    <a:blip r:embed="rId59"/>
                     <a:stretch>
                       <a:fillRect/>
                     </a:stretch>
@@ -10501,7 +10819,7 @@
                     <pic:cNvPicPr/>
                   </pic:nvPicPr>
                   <pic:blipFill>
-                    <a:blip r:embed="rId59"/>
+                    <a:blip r:embed="rId60"/>
                     <a:stretch>
                       <a:fillRect/>
                     </a:stretch>
@@ -13140,41 +13458,76 @@
         </w:tc>
       </w:tr>
     </w:tbl>
+    <w:p/>
     <w:p>
+      <w:pPr>
+        <w:tabs>
+          <w:tab w:val="num" w:pos="360"/>
+          <w:tab w:val="num" w:pos="720"/>
+        </w:tabs>
+      </w:pPr>
       <w:r>
         <w:t>This table demonstrates how the Zero Trust policy evaluates access decisions based on multiple weighted factors while maintaining clear security boundaries and privilege separation.</w:t>
+      </w:r>
+      <w:r>
+        <w:t xml:space="preserve"> </w:t>
+      </w:r>
+      <w:r>
+        <w:t xml:space="preserve">This testcase illustrates the possibility of </w:t>
+      </w:r>
+      <w:r>
+        <w:t>real-time threat intelligence integration</w:t>
+      </w:r>
+      <w:r>
+        <w:t xml:space="preserve"> and logging as well as the use of multiple OPA instances and policies for better scalability and granularity of rules. In a production heterogeanous enterprise network, </w:t>
+      </w:r>
+      <w:r>
+        <w:t>Use TLS for all inter-service communication</w:t>
+      </w:r>
+      <w:r>
+        <w:t>, a secrets management vault, healthchecks for the containers and VMs as well as automated orchestration of components and hosts should be considered. Further, deployment of autmated reporting dahsboards and alerting for policy violations would allow for more proactive infrastructure monitoring and faster turnaround times for troubleshooting of user and device issues</w:t>
       </w:r>
     </w:p>
     <w:p/>
     <w:p>
-      <w:pPr>
-        <w:pStyle w:val="Heading4"/>
-      </w:pPr>
-      <w:r>
-        <w:t>Key Policy Insights</w:t>
+      <w:r>
+        <w:t xml:space="preserve">The transition to a Multi-Domain architecture represents a necessary evolution in ZTA, yet implementations that depend on static trust scores and fixed domain weights often recreate the very vulnerabilities they sought to eliminate. In these theoretically advanced models, an entity is evaluated across multiple axes (identity, device health, location), but a static score is calculated and maintained for the duration of a session, </w:t>
+      </w:r>
+      <w:r>
+        <w:t>and</w:t>
+      </w:r>
+      <w:r>
+        <w:t xml:space="preserve"> the relative importance (weight) of each domain remains rigid regardless of environmental context. This inflexibility is fundamentally misaligned with the dynamic nature of both </w:t>
+      </w:r>
+      <w:r>
+        <w:t>heterogenous</w:t>
+      </w:r>
+      <w:r>
+        <w:t xml:space="preserve"> networks and modern cyber threats. For instance, if a user is granted a high static trust score based on a secure initial handshake from a corporate device, that score acts as a durational passport. If that same device is subsequently infected with a zero-day payload or its network connection is subtly hijacked, the static policy engine lacks the temporal awareness to trigger a re-evaluation. The malware can then inherit the user's high trust score, propagating laterally across domains under the guise of legitimate, pre-approved traffic (Ahmed et al., 2024; National Institutes of Health [NIH], 2023).</w:t>
       </w:r>
     </w:p>
     <w:p>
-      <w:pPr>
-        <w:tabs>
-          <w:tab w:val="num" w:pos="360"/>
-          <w:tab w:val="num" w:pos="720"/>
-        </w:tabs>
-      </w:pPr>
-      <w:r>
-        <w:t xml:space="preserve">This testcase illustrates the possibility of </w:t>
-      </w:r>
-      <w:r>
-        <w:t>real-time threat intelligence integration</w:t>
-      </w:r>
-      <w:r>
-        <w:t xml:space="preserve"> and logging as well as the use of multiple OPA instances and policies for better scalability and granularity of rules. In a production heteerogeanous enterprise network, </w:t>
-      </w:r>
-      <w:r>
-        <w:t>Use TLS for all inter-service communication</w:t>
-      </w:r>
-      <w:r>
-        <w:t>, a secrets management vault, healthchecks for the containers and VMs as well as automated orchestration of components and hosts should be considered. Further, deployment of autmated reporting dahsboards and alerting for policy violations would allow for more proactive infrastructure monitoring and faster turnaround times for troubleshooting of user and device issues</w:t>
+      <w:r>
+        <w:lastRenderedPageBreak/>
+        <w:t>Moreover, the reliance on static domain weights severely hampers an enterprise's ability to mitigate sophisticated data misuse and insider threats. In an adaptive model, the weight of a geographic location signal might dramatically increase if the user attempts to access highly classified data outside of standard business hours. Conversely, a static weighting system forces the policy engine to treat context identically regardless of the specific resource being requested or the underlying behavioral volatility. This rigidity empowers compromised identities or malicious insiders; knowing that their assigned trust score will not degrade based on anomalous data access patterns, adversaries can execute slow, methodical "low and slow" exfiltration campaigns. Because the system is not continuously recalibrating trust based on dynamic behavioral deviations (such as an unprecedented volume of database queries), the enterprise remains highly susceptible to data loss disguised as authorized operational activity. To counter this, empirical research overwhelmingly advocates for the abolition of static scoring in favor of continuous, AI-driven contextual re-evaluations and dynamic weight adjustments (Alsubhi et al., 2024; NIH, 2023).</w:t>
+      </w:r>
+    </w:p>
+    <w:p/>
+    <w:p>
+      <w:pPr>
+        <w:pStyle w:val="Heading3"/>
+      </w:pPr>
+      <w:r>
+        <w:t>Testcase 4</w:t>
+      </w:r>
+      <w:r>
+        <w:t>:</w:t>
+      </w:r>
+      <w:r>
+        <w:t xml:space="preserve"> </w:t>
+      </w:r>
+      <w:r>
+        <w:t>Proposed Contextual Trust Weighting for Enterprise relevant Zero trust Facets</w:t>
       </w:r>
     </w:p>
     <w:p>
@@ -13182,95 +13535,68 @@
         <w:tabs>
           <w:tab w:val="num" w:pos="720"/>
         </w:tabs>
-      </w:pPr>
+        <w:rPr>
+          <w:color w:val="C00000"/>
+        </w:rPr>
+      </w:pPr>
+      <w:r>
+        <w:t xml:space="preserve">This testcase sets an experiment to validate the proposed model. It models and estimates trust in heterogenous enterprise networks by contextually weighting multidomain trust data signals and fuses the data based on belief, disbelief and uncertainty using weighted belief fusion. The outcome is trust score belief that is used to determine access decisions based on the matrix defined in </w:t>
+      </w:r>
+      <w:r>
+        <w:rPr>
+          <w:color w:val="C00000"/>
+        </w:rPr>
+        <w:t>Table 8.3</w:t>
+      </w:r>
+      <w:r>
+        <w:rPr>
+          <w:color w:val="C00000"/>
+        </w:rPr>
+        <w:t>. the robustness of the</w:t>
+      </w:r>
+      <w:r>
+        <w:rPr>
+          <w:color w:val="C00000"/>
+        </w:rPr>
+        <w:t xml:space="preserve"> </w:t>
+      </w:r>
+      <w:r>
+        <w:t>trust determination process is based on the aggregation of dynamic weighting and weighted belief fusion</w:t>
+      </w:r>
+      <w:r>
+        <w:t xml:space="preserve"> across four cardinal domains: Network, Data, Device, and Application. By leveraging Dempster-Shafer theory, </w:t>
+      </w:r>
+      <w:r>
+        <w:t>it</w:t>
+      </w:r>
+      <w:r>
+        <w:t xml:space="preserve"> demonstrate</w:t>
+      </w:r>
+      <w:r>
+        <w:t>s</w:t>
+      </w:r>
+      <w:r>
+        <w:t xml:space="preserve"> how contextual instability (variance) can dynamically discount evidence sources, thereby enhancing the robustness of access control decisions in Zero Trust environments.</w:t>
+      </w:r>
+      <w:r>
+        <w:t xml:space="preserve"> Due tovariety of permutations for the four domain areas, 6 case scenarios were used to model trust denoting varying resource access requests within enterprise networks. The case scenarios are denonoted </w:t>
+      </w:r>
+      <w:r>
+        <w:rPr>
+          <w:color w:val="C00000"/>
+        </w:rPr>
+        <w:t>in figure 8.20 and table 8.7</w:t>
+      </w:r>
     </w:p>
     <w:p>
       <w:pPr>
-        <w:pStyle w:val="Heading3"/>
-      </w:pPr>
-      <w:r>
-        <w:t>Testcase 4</w:t>
-      </w:r>
-      <w:r>
-        <w:t>:</w:t>
-      </w:r>
-      <w:r>
-        <w:t xml:space="preserve"> </w:t>
-      </w:r>
-      <w:r>
-        <w:t>Proposed Contextual Trust Weighting for Enterprise relevant Zero trust Facets</w:t>
-      </w:r>
-    </w:p>
-    <w:p>
-      <w:pPr>
-        <w:tabs>
-          <w:tab w:val="num" w:pos="720"/>
-        </w:tabs>
-        <w:rPr>
-          <w:color w:val="C00000"/>
-        </w:rPr>
-      </w:pPr>
-      <w:r>
-        <w:t xml:space="preserve">This testcase sets an experiment to validate the proposed model. It models and estimates trust in heterogenous enterprise networks by contextually weighting multidomain trust data signals and fuses the data based on belief, disbelief and uncertainty using weighted belief fusion. The outcome is trust score belief that is used to determine access decisions based on the matrix defined in </w:t>
-      </w:r>
-      <w:r>
-        <w:rPr>
-          <w:color w:val="C00000"/>
-        </w:rPr>
-        <w:t>Table 8.3</w:t>
-      </w:r>
-      <w:r>
-        <w:rPr>
-          <w:color w:val="C00000"/>
-        </w:rPr>
-        <w:t>. the robustness of the</w:t>
-      </w:r>
-      <w:r>
-        <w:rPr>
-          <w:color w:val="C00000"/>
-        </w:rPr>
-        <w:t xml:space="preserve"> </w:t>
-      </w:r>
-      <w:r>
-        <w:t>trust determination process is based on the aggregation of dynamic weighting and weighted belief fusion</w:t>
-      </w:r>
-      <w:r>
-        <w:t xml:space="preserve"> across four cardinal domains: Network, Data, Device, and Application. By leveraging Dempster-Shafer theory, </w:t>
-      </w:r>
-      <w:r>
-        <w:t>it</w:t>
-      </w:r>
-      <w:r>
-        <w:t xml:space="preserve"> demonstrate</w:t>
-      </w:r>
-      <w:r>
-        <w:t>s</w:t>
-      </w:r>
-      <w:r>
-        <w:t xml:space="preserve"> how contextual instability (variance) can dynamically discount evidence sources, thereby enhancing the robustness of access control decisions in Zero Trust environments.</w:t>
-      </w:r>
-      <w:r>
-        <w:t xml:space="preserve"> Due tovariety of permutations for the four domain areas, 6 case scenarios were used to model trust </w:t>
-      </w:r>
+        <w:pStyle w:val="Heading4"/>
+        <w:rPr>
+          <w:color w:val="auto"/>
+        </w:rPr>
+      </w:pPr>
       <w:r>
         <w:lastRenderedPageBreak/>
-        <w:t xml:space="preserve">denoting varying resource access requests within enterprise networks. The case scenarios are denonoted </w:t>
-      </w:r>
-      <w:r>
-        <w:rPr>
-          <w:color w:val="C00000"/>
-        </w:rPr>
-        <w:t>in figure 8.20 and table 8.7</w:t>
-      </w:r>
-    </w:p>
-    <w:p>
-      <w:pPr>
-        <w:pStyle w:val="Heading4"/>
-        <w:rPr>
-          <w:color w:val="auto"/>
-        </w:rPr>
-      </w:pPr>
-      <w:r>
         <w:t>Testcase4: Case Scenarios</w:t>
       </w:r>
     </w:p>
@@ -13300,7 +13626,7 @@
                     <pic:cNvPicPr/>
                   </pic:nvPicPr>
                   <pic:blipFill>
-                    <a:blip r:embed="rId60"/>
+                    <a:blip r:embed="rId61"/>
                     <a:stretch>
                       <a:fillRect/>
                     </a:stretch>
@@ -15015,7 +15341,19 @@
         </w:tabs>
       </w:pPr>
       <w:r>
-        <w:t>Testcase 4: Anaylis</w:t>
+        <w:t>Testcase 4: Ana</w:t>
+      </w:r>
+      <w:r>
+        <w:t>l</w:t>
+      </w:r>
+      <w:r>
+        <w:t>y</w:t>
+      </w:r>
+      <w:r>
+        <w:t>s</w:t>
+      </w:r>
+      <w:r>
+        <w:t>is</w:t>
       </w:r>
     </w:p>
     <w:p>
@@ -15445,7 +15783,7 @@
                     <pic:cNvPicPr/>
                   </pic:nvPicPr>
                   <pic:blipFill>
-                    <a:blip r:embed="rId61"/>
+                    <a:blip r:embed="rId62"/>
                     <a:stretch>
                       <a:fillRect/>
                     </a:stretch>
@@ -17087,7 +17425,7 @@
                 <w:b/>
                 <w:bCs/>
               </w:rPr>
-              <w:t>Full →→ Limited →→ No Access</w:t>
+              <w:t>Full → Limited → No Access</w:t>
             </w:r>
           </w:p>
         </w:tc>
@@ -17189,7 +17527,7 @@
                 <w:b/>
                 <w:bCs/>
               </w:rPr>
-              <w:t>Full →→ Limited →→ No Access</w:t>
+              <w:t>Full → Limited → No Access</w:t>
             </w:r>
           </w:p>
         </w:tc>
@@ -17291,7 +17629,7 @@
                 <w:b/>
                 <w:bCs/>
               </w:rPr>
-              <w:t>Limited →→ No Access</w:t>
+              <w:t>Limited → No Access</w:t>
             </w:r>
           </w:p>
         </w:tc>
@@ -17393,7 +17731,7 @@
                 <w:b/>
                 <w:bCs/>
               </w:rPr>
-              <w:t>Limited →→ No Access</w:t>
+              <w:t>Limited → No Access</w:t>
             </w:r>
           </w:p>
         </w:tc>
@@ -18189,7 +18527,7 @@
                 <w:b/>
                 <w:bCs/>
               </w:rPr>
-              <w:t>Limited →→ No Access</w:t>
+              <w:t>Limited → No Access</w:t>
             </w:r>
           </w:p>
         </w:tc>
@@ -18271,7 +18609,7 @@
                 <w:b/>
                 <w:bCs/>
               </w:rPr>
-              <w:t>Limited →→ No Access</w:t>
+              <w:t>Limited → No Access</w:t>
             </w:r>
           </w:p>
         </w:tc>
@@ -20432,7 +20770,6 @@
         <w:t xml:space="preserve"> Ensemble Model fixes this by looking at the broader continuity of the session.</w:t>
       </w:r>
     </w:p>
-    <w:p/>
     <w:p/>
     <w:p>
       <w:r>
@@ -30934,4 +31271,16 @@
     </a:ext>
   </a:extLst>
 </a:theme>
+</file>
+
+<file path=customXml/item1.xml><?xml version="1.0" encoding="utf-8"?>
+<b:Sources xmlns:b="http://schemas.openxmlformats.org/officeDocument/2006/bibliography" xmlns="http://schemas.openxmlformats.org/officeDocument/2006/bibliography" SelectedStyle="/APASixthEditionOfficeOnline.xsl" StyleName="APA" Version="6"/>
+</file>
+
+<file path=customXml/itemProps1.xml><?xml version="1.0" encoding="utf-8"?>
+<ds:datastoreItem xmlns:ds="http://schemas.openxmlformats.org/officeDocument/2006/customXml" ds:itemID="{9D2A51AC-C1A7-9C49-80CB-06DA3C415232}">
+  <ds:schemaRefs>
+    <ds:schemaRef ds:uri="http://schemas.openxmlformats.org/officeDocument/2006/bibliography"/>
+  </ds:schemaRefs>
+</ds:datastoreItem>
 </file>
</xml_diff>